<commit_message>
feat: add McMaster University projects (Nash-DQN RL Trading, Financial NLP, Canadian Retail TS, VQA, GLM)
</commit_message>
<xml_diff>
--- a/All_Projects.docx
+++ b/All_Projects.docx
@@ -44,7 +44,7 @@
           <w:rFonts w:ascii="Calibri" w:hAnsi="Calibri"/>
           <w:sz w:val="22"/>
         </w:rPr>
-        <w:t>Ce document rassemble la documentation exhaustive, les rapports d'expertise et les présentations de soutenance des 16 projets réalisés au cours de mon cursus d'ingénieur et de mes expériences en entreprise (Publicis Groupe, Infinity Analytics / Gainde 2000, Challenge Entreprendre ENSIIE). Il sert de référence complète pour mes candidatures au Stage de Fin d'Études (PFE).</w:t>
+        <w:t>Ce document rassemble la documentation exhaustive, les rapports d'expertise et les présentations de soutenance des 21 projets réalisés au cours de mon cursus d'ingénieur à l'ENSIIE, de mon échange académique à McMaster University (Canada) et de mes expériences en entreprise (Publicis Groupe, Infinity Analytics / Gainde 2000, Challenge Entreprendre ENSIIE).</w:t>
       </w:r>
     </w:p>
     <w:p>
@@ -52,7 +52,7 @@
         <w:pStyle w:val="Heading1"/>
       </w:pPr>
       <w:r>
-        <w:t>Tableau Récapitulatif des 16 Projets</w:t>
+        <w:t>Tableau Récapitulatif des 21 Projets</w:t>
       </w:r>
     </w:p>
     <w:tbl>
@@ -1021,6 +1021,286 @@
           </w:p>
         </w:tc>
       </w:tr>
+      <w:tr>
+        <w:tc>
+          <w:tcPr>
+            <w:tcW w:type="dxa" w:w="2484"/>
+          </w:tcPr>
+          <w:p>
+            <w:r>
+              <w:rPr>
+                <w:sz w:val="18"/>
+              </w:rPr>
+              <w:t>Nash-DQN</w:t>
+            </w:r>
+          </w:p>
+        </w:tc>
+        <w:tc>
+          <w:tcPr>
+            <w:tcW w:type="dxa" w:w="2484"/>
+          </w:tcPr>
+          <w:p>
+            <w:r>
+              <w:rPr>
+                <w:sz w:val="18"/>
+              </w:rPr>
+              <w:t>Quantitative Finance &amp; Reinforcement Learning</w:t>
+              <w:br/>
+              <w:t>(McMaster University (MATH 4FM3))</w:t>
+            </w:r>
+          </w:p>
+        </w:tc>
+        <w:tc>
+          <w:tcPr>
+            <w:tcW w:type="dxa" w:w="2484"/>
+          </w:tcPr>
+          <w:p>
+            <w:r>
+              <w:rPr>
+                <w:sz w:val="18"/>
+              </w:rPr>
+              <w:t>Python, PyTorch, Deep Q-Learning (DQN), Multi-Agent RL</w:t>
+            </w:r>
+          </w:p>
+        </w:tc>
+        <w:tc>
+          <w:tcPr>
+            <w:tcW w:type="dxa" w:w="2484"/>
+          </w:tcPr>
+          <w:p>
+            <w:r>
+              <w:rPr>
+                <w:sz w:val="18"/>
+              </w:rPr>
+              <w:t>📄 Rapport (2)</w:t>
+            </w:r>
+          </w:p>
+        </w:tc>
+      </w:tr>
+      <w:tr>
+        <w:tc>
+          <w:tcPr>
+            <w:tcW w:type="dxa" w:w="2484"/>
+          </w:tcPr>
+          <w:p>
+            <w:r>
+              <w:rPr>
+                <w:sz w:val="18"/>
+              </w:rPr>
+              <w:t>Analyse de Sentiment de Titres Financiers</w:t>
+            </w:r>
+          </w:p>
+        </w:tc>
+        <w:tc>
+          <w:tcPr>
+            <w:tcW w:type="dxa" w:w="2484"/>
+          </w:tcPr>
+          <w:p>
+            <w:r>
+              <w:rPr>
+                <w:sz w:val="18"/>
+              </w:rPr>
+              <w:t>NLP &amp; Financial Deep Learning</w:t>
+              <w:br/>
+              <w:t>(McMaster University (DATASCI 3ML3))</w:t>
+            </w:r>
+          </w:p>
+        </w:tc>
+        <w:tc>
+          <w:tcPr>
+            <w:tcW w:type="dxa" w:w="2484"/>
+          </w:tcPr>
+          <w:p>
+            <w:r>
+              <w:rPr>
+                <w:sz w:val="18"/>
+              </w:rPr>
+              <w:t>Python, PyTorch, BiLSTM, TF-IDF</w:t>
+            </w:r>
+          </w:p>
+        </w:tc>
+        <w:tc>
+          <w:tcPr>
+            <w:tcW w:type="dxa" w:w="2484"/>
+          </w:tcPr>
+          <w:p>
+            <w:r>
+              <w:rPr>
+                <w:sz w:val="18"/>
+              </w:rPr>
+              <w:t>📄 Rapport (2)</w:t>
+            </w:r>
+          </w:p>
+        </w:tc>
+      </w:tr>
+      <w:tr>
+        <w:tc>
+          <w:tcPr>
+            <w:tcW w:type="dxa" w:w="2484"/>
+          </w:tcPr>
+          <w:p>
+            <w:r>
+              <w:rPr>
+                <w:sz w:val="18"/>
+              </w:rPr>
+              <w:t>Prévision de la Demande Saisonnière dans le Commerce de Détail Canadien</w:t>
+            </w:r>
+          </w:p>
+        </w:tc>
+        <w:tc>
+          <w:tcPr>
+            <w:tcW w:type="dxa" w:w="2484"/>
+          </w:tcPr>
+          <w:p>
+            <w:r>
+              <w:rPr>
+                <w:sz w:val="18"/>
+              </w:rPr>
+              <w:t>Time Series &amp; Applied Econometrics</w:t>
+              <w:br/>
+              <w:t>(McMaster University (STATS 4A03))</w:t>
+            </w:r>
+          </w:p>
+        </w:tc>
+        <w:tc>
+          <w:tcPr>
+            <w:tcW w:type="dxa" w:w="2484"/>
+          </w:tcPr>
+          <w:p>
+            <w:r>
+              <w:rPr>
+                <w:sz w:val="18"/>
+              </w:rPr>
+              <w:t>R, RMarkdown, SARIMA, Holt-Winters</w:t>
+            </w:r>
+          </w:p>
+        </w:tc>
+        <w:tc>
+          <w:tcPr>
+            <w:tcW w:type="dxa" w:w="2484"/>
+          </w:tcPr>
+          <w:p>
+            <w:r>
+              <w:rPr>
+                <w:sz w:val="18"/>
+              </w:rPr>
+              <w:t>📄 Rapport (1)</w:t>
+            </w:r>
+          </w:p>
+        </w:tc>
+      </w:tr>
+      <w:tr>
+        <w:tc>
+          <w:tcPr>
+            <w:tcW w:type="dxa" w:w="2484"/>
+          </w:tcPr>
+          <w:p>
+            <w:r>
+              <w:rPr>
+                <w:sz w:val="18"/>
+              </w:rPr>
+              <w:t>Visual Question Answering (VQA)</w:t>
+            </w:r>
+          </w:p>
+        </w:tc>
+        <w:tc>
+          <w:tcPr>
+            <w:tcW w:type="dxa" w:w="2484"/>
+          </w:tcPr>
+          <w:p>
+            <w:r>
+              <w:rPr>
+                <w:sz w:val="18"/>
+              </w:rPr>
+              <w:t>Multimodal Deep Learning &amp; Computer Vision</w:t>
+              <w:br/>
+              <w:t>(McMaster University (MECHENG 4AI3))</w:t>
+            </w:r>
+          </w:p>
+        </w:tc>
+        <w:tc>
+          <w:tcPr>
+            <w:tcW w:type="dxa" w:w="2484"/>
+          </w:tcPr>
+          <w:p>
+            <w:r>
+              <w:rPr>
+                <w:sz w:val="18"/>
+              </w:rPr>
+              <w:t>Python, PyTorch, Torchvision, CNN (ResNet)</w:t>
+            </w:r>
+          </w:p>
+        </w:tc>
+        <w:tc>
+          <w:tcPr>
+            <w:tcW w:type="dxa" w:w="2484"/>
+          </w:tcPr>
+          <w:p>
+            <w:r>
+              <w:rPr>
+                <w:sz w:val="18"/>
+              </w:rPr>
+              <w:t>📄 Rapport (1)</w:t>
+            </w:r>
+          </w:p>
+        </w:tc>
+      </w:tr>
+      <w:tr>
+        <w:tc>
+          <w:tcPr>
+            <w:tcW w:type="dxa" w:w="2484"/>
+          </w:tcPr>
+          <w:p>
+            <w:r>
+              <w:rPr>
+                <w:sz w:val="18"/>
+              </w:rPr>
+              <w:t>Modèles Linéaires Généralisés</w:t>
+            </w:r>
+          </w:p>
+        </w:tc>
+        <w:tc>
+          <w:tcPr>
+            <w:tcW w:type="dxa" w:w="2484"/>
+          </w:tcPr>
+          <w:p>
+            <w:r>
+              <w:rPr>
+                <w:sz w:val="18"/>
+              </w:rPr>
+              <w:t>Applied Statistics &amp; GLM</w:t>
+              <w:br/>
+              <w:t>(McMaster University (STATS 4GLM))</w:t>
+            </w:r>
+          </w:p>
+        </w:tc>
+        <w:tc>
+          <w:tcPr>
+            <w:tcW w:type="dxa" w:w="2484"/>
+          </w:tcPr>
+          <w:p>
+            <w:r>
+              <w:rPr>
+                <w:sz w:val="18"/>
+              </w:rPr>
+              <w:t>R, RMarkdown, GLM, Régression Poisson</w:t>
+            </w:r>
+          </w:p>
+        </w:tc>
+        <w:tc>
+          <w:tcPr>
+            <w:tcW w:type="dxa" w:w="2484"/>
+          </w:tcPr>
+          <w:p>
+            <w:r>
+              <w:rPr>
+                <w:sz w:val="18"/>
+              </w:rPr>
+              <w:t>💻 Code &amp; Dépôt</w:t>
+            </w:r>
+          </w:p>
+        </w:tc>
+      </w:tr>
     </w:tbl>
     <w:p>
       <w:r>
@@ -2408,6 +2688,437 @@
       </w:pPr>
       <w:r>
         <w:t>Application à des cas pratiques de débruitage sonore et de filtrage 2D sur des images matricielles.</w:t>
+      </w:r>
+    </w:p>
+    <w:p>
+      <w:pPr>
+        <w:pStyle w:val="Heading2"/>
+      </w:pPr>
+      <w:r>
+        <w:t>Livrables &amp; Justificatifs Associés :</w:t>
+      </w:r>
+    </w:p>
+    <w:p>
+      <w:pPr>
+        <w:pStyle w:val="ListBullet"/>
+      </w:pPr>
+      <w:r>
+        <w:t>Code source et documentation intégrés dans le dossier projet.</w:t>
+      </w:r>
+    </w:p>
+    <w:p/>
+    <w:p>
+      <w:pPr>
+        <w:pStyle w:val="Heading1"/>
+      </w:pPr>
+      <w:r>
+        <w:t>17. Nash-DQN : Deep Q-Learning pour Équilibres de Nash en Trading Multi-Agents</w:t>
+      </w:r>
+    </w:p>
+    <w:p>
+      <w:r>
+        <w:rPr>
+          <w:i/>
+          <w:sz w:val="20"/>
+        </w:rPr>
+        <w:t>Contexte : McMaster University (MATH 4FM3) (2026) | Rôle : Quantitative Researcher / RL Engineer</w:t>
+        <w:br/>
+        <w:t>Domaine : Quantitative Finance &amp; Reinforcement Learning</w:t>
+        <w:br/>
+        <w:t>Technologies : Python, PyTorch, Deep Q-Learning (DQN), Multi-Agent RL, Stochastic Games, Optimal Execution, Mouvement Brownien</w:t>
+      </w:r>
+    </w:p>
+    <w:p>
+      <w:pPr>
+        <w:pStyle w:val="Heading2"/>
+      </w:pPr>
+      <w:r>
+        <w:t>Synthèse Exécutive :</w:t>
+      </w:r>
+    </w:p>
+    <w:p>
+      <w:r>
+        <w:t>Implémentation sous PyTorch d'un environnement de jeu stochastique à N agents (Casgrain, Ning &amp; Jaimungal, 2022) et entraînement d'architectures Deep Q-Network (Nash-DQN) pour converger vers l'équilibre de Nash en exécution optimale d'ordres.</w:t>
+      </w:r>
+    </w:p>
+    <w:p>
+      <w:pPr>
+        <w:pStyle w:val="Heading2"/>
+      </w:pPr>
+      <w:r>
+        <w:t>Réalisations Clés &amp; Résultats (Format STAR) :</w:t>
+      </w:r>
+    </w:p>
+    <w:p>
+      <w:pPr>
+        <w:pStyle w:val="ListBullet"/>
+      </w:pPr>
+      <w:r>
+        <w:t>Conception d'un simulateur de marché stochastique sous forme de jeu différentiel à N agents avec impact de marché temporaire et permanent.</w:t>
+      </w:r>
+    </w:p>
+    <w:p>
+      <w:pPr>
+        <w:pStyle w:val="ListBullet"/>
+      </w:pPr>
+      <w:r>
+        <w:t>Développement d'un algorithme Nash-DQN avec replay buffer priorisé et réseaux cible pour l'apprentissage de politiques de trading compétitives.</w:t>
+      </w:r>
+    </w:p>
+    <w:p>
+      <w:pPr>
+        <w:pStyle w:val="ListBullet"/>
+      </w:pPr>
+      <w:r>
+        <w:t>Rédaction d'une thèse de recherche mathématique de 34 pages accompagnée de visualisations des trajectoires browniennes et récompenses cumulées.</w:t>
+      </w:r>
+    </w:p>
+    <w:p>
+      <w:pPr>
+        <w:pStyle w:val="Heading2"/>
+      </w:pPr>
+      <w:r>
+        <w:t>Livrables &amp; Justificatifs Associés :</w:t>
+      </w:r>
+    </w:p>
+    <w:p>
+      <w:pPr>
+        <w:pStyle w:val="ListBullet"/>
+      </w:pPr>
+      <w:r>
+        <w:t>Rapport technique disponible : reports/Rapport_Nash_DQN_Optimal_Trading.pdf</w:t>
+      </w:r>
+    </w:p>
+    <w:p>
+      <w:pPr>
+        <w:pStyle w:val="ListBullet"/>
+      </w:pPr>
+      <w:r>
+        <w:t>Rapport technique disponible : reports/Project_Roadmap.pdf</w:t>
+      </w:r>
+    </w:p>
+    <w:p/>
+    <w:p>
+      <w:pPr>
+        <w:pStyle w:val="Heading1"/>
+      </w:pPr>
+      <w:r>
+        <w:t>18. Analyse de Sentiment de Titres Financiers : ML Classique vs BiLSTM</w:t>
+      </w:r>
+    </w:p>
+    <w:p>
+      <w:r>
+        <w:rPr>
+          <w:i/>
+          <w:sz w:val="20"/>
+        </w:rPr>
+        <w:t>Contexte : McMaster University (DATASCI 3ML3) (2026) | Rôle : NLP &amp; Machine Learning Engineer</w:t>
+        <w:br/>
+        <w:t>Domaine : NLP &amp; Financial Deep Learning</w:t>
+        <w:br/>
+        <w:t>Technologies : Python, PyTorch, BiLSTM, TF-IDF, Scikit-Learn, NLP, Financial Sentiment, Cross-Validation</w:t>
+      </w:r>
+    </w:p>
+    <w:p>
+      <w:pPr>
+        <w:pStyle w:val="Heading2"/>
+      </w:pPr>
+      <w:r>
+        <w:t>Synthèse Exécutive :</w:t>
+      </w:r>
+    </w:p>
+    <w:p>
+      <w:r>
+        <w:t>Benchmark comparatif de modèles de classification de sentiments sur 9 549 titres d'actualité financière (Financial PhraseBank) comparant modèles classiques (SVM, Random Forest) et réseaux neuronaux récurrents bidirectionnels (BiLSTM).</w:t>
+      </w:r>
+    </w:p>
+    <w:p>
+      <w:pPr>
+        <w:pStyle w:val="Heading2"/>
+      </w:pPr>
+      <w:r>
+        <w:t>Réalisations Clés &amp; Résultats (Format STAR) :</w:t>
+      </w:r>
+    </w:p>
+    <w:p>
+      <w:pPr>
+        <w:pStyle w:val="ListBullet"/>
+      </w:pPr>
+      <w:r>
+        <w:t>Traitement et vectorisation d'un corpus de 9 549 titres financiers avec analyse lexicale et gestion du déséquilibre de classes.</w:t>
+      </w:r>
+    </w:p>
+    <w:p>
+      <w:pPr>
+        <w:pStyle w:val="ListBullet"/>
+      </w:pPr>
+      <w:r>
+        <w:t>Implémentation et optimisation d'une architecture neuronale Bidirectional LSTM sous PyTorch surpassant les baselines classiques.</w:t>
+      </w:r>
+    </w:p>
+    <w:p>
+      <w:pPr>
+        <w:pStyle w:val="ListBullet"/>
+      </w:pPr>
+      <w:r>
+        <w:t>Rédaction d'un rapport de recherche académique de 11 pages détaillant les courbes d'apprentissage, F1-scores et analyses d'erreurs.</w:t>
+      </w:r>
+    </w:p>
+    <w:p>
+      <w:pPr>
+        <w:pStyle w:val="Heading2"/>
+      </w:pPr>
+      <w:r>
+        <w:t>Livrables &amp; Justificatifs Associés :</w:t>
+      </w:r>
+    </w:p>
+    <w:p>
+      <w:pPr>
+        <w:pStyle w:val="ListBullet"/>
+      </w:pPr>
+      <w:r>
+        <w:t>Rapport technique disponible : reports/Financial_News_Sentiment_Classification_Report.pdf</w:t>
+      </w:r>
+    </w:p>
+    <w:p>
+      <w:pPr>
+        <w:pStyle w:val="ListBullet"/>
+      </w:pPr>
+      <w:r>
+        <w:t>Rapport technique disponible : reports/Sujet_FinalProject.pdf</w:t>
+      </w:r>
+    </w:p>
+    <w:p/>
+    <w:p>
+      <w:pPr>
+        <w:pStyle w:val="Heading1"/>
+      </w:pPr>
+      <w:r>
+        <w:t>19. Prévision de la Demande Saisonnière dans le Commerce de Détail Canadien</w:t>
+      </w:r>
+    </w:p>
+    <w:p>
+      <w:r>
+        <w:rPr>
+          <w:i/>
+          <w:sz w:val="20"/>
+        </w:rPr>
+        <w:t>Contexte : McMaster University (STATS 4A03) (2026) | Rôle : Time Series Analyst</w:t>
+        <w:br/>
+        <w:t>Domaine : Time Series &amp; Applied Econometrics</w:t>
+        <w:br/>
+        <w:t>Technologies : R, RMarkdown, SARIMA, Holt-Winters, Décomposition STL, Tests de Stationnarité (ADF/KPSS), Validation Croisée</w:t>
+      </w:r>
+    </w:p>
+    <w:p>
+      <w:pPr>
+        <w:pStyle w:val="Heading2"/>
+      </w:pPr>
+      <w:r>
+        <w:t>Synthèse Exécutive :</w:t>
+      </w:r>
+    </w:p>
+    <w:p>
+      <w:r>
+        <w:t>Modélisation économétrique et prévision de séries temporelles sur 27 ans de ventes mensuelles du commerce de détail canadien (Statistique Canada) par décomposition STL, lissage exponentiel Holt-Winters et modèles SARIMA multiplicatifs.</w:t>
+      </w:r>
+    </w:p>
+    <w:p>
+      <w:pPr>
+        <w:pStyle w:val="Heading2"/>
+      </w:pPr>
+      <w:r>
+        <w:t>Réalisations Clés &amp; Résultats (Format STAR) :</w:t>
+      </w:r>
+    </w:p>
+    <w:p>
+      <w:pPr>
+        <w:pStyle w:val="ListBullet"/>
+      </w:pPr>
+      <w:r>
+        <w:t>Analyse exploratoire et tests statistiques de stationnarité (ADF, KPSS) sur 27 années de séries mensuelles de consommation.</w:t>
+      </w:r>
+    </w:p>
+    <w:p>
+      <w:pPr>
+        <w:pStyle w:val="ListBullet"/>
+      </w:pPr>
+      <w:r>
+        <w:t>Identification et estimation de modèles SARIMA multiplicatifs avec validation rigoureuse des résidus (Ljung-Box, normalité).</w:t>
+      </w:r>
+    </w:p>
+    <w:p>
+      <w:pPr>
+        <w:pStyle w:val="ListBullet"/>
+      </w:pPr>
+      <w:r>
+        <w:t>Production d'un rapport de prévision de 12 pages compilé sous RMarkdown avec intervalles de confiance prospectifs.</w:t>
+      </w:r>
+    </w:p>
+    <w:p>
+      <w:pPr>
+        <w:pStyle w:val="Heading2"/>
+      </w:pPr>
+      <w:r>
+        <w:t>Livrables &amp; Justificatifs Associés :</w:t>
+      </w:r>
+    </w:p>
+    <w:p>
+      <w:pPr>
+        <w:pStyle w:val="ListBullet"/>
+      </w:pPr>
+      <w:r>
+        <w:t>Rapport technique disponible : reports/Canadian_Retail_Time_Series_Forecasting_Report.pdf</w:t>
+      </w:r>
+    </w:p>
+    <w:p/>
+    <w:p>
+      <w:pPr>
+        <w:pStyle w:val="Heading1"/>
+      </w:pPr>
+      <w:r>
+        <w:t>20. Visual Question Answering (VQA) : Fusion Multimodale Vision &amp; Langage</w:t>
+      </w:r>
+    </w:p>
+    <w:p>
+      <w:r>
+        <w:rPr>
+          <w:i/>
+          <w:sz w:val="20"/>
+        </w:rPr>
+        <w:t>Contexte : McMaster University (MECHENG 4AI3) (2026) | Rôle : Multimodal Deep Learning Engineer</w:t>
+        <w:br/>
+        <w:t>Domaine : Multimodal Deep Learning &amp; Computer Vision</w:t>
+        <w:br/>
+        <w:t>Technologies : Python, PyTorch, Torchvision, CNN (ResNet), LSTM, Multimodal Fusion, VQA v2.0 Dataset, Streamlit</w:t>
+      </w:r>
+    </w:p>
+    <w:p>
+      <w:pPr>
+        <w:pStyle w:val="Heading2"/>
+      </w:pPr>
+      <w:r>
+        <w:t>Synthèse Exécutive :</w:t>
+      </w:r>
+    </w:p>
+    <w:p>
+      <w:r>
+        <w:t>Système de Question-Réponse Visuelle (VQA) entraîné sur le dataset VQA v2.0 associant extraction de caractéristiques visuelles par CNN (ResNet), encodage linguistique par LSTM et module de fusion multimodale.</w:t>
+      </w:r>
+    </w:p>
+    <w:p>
+      <w:pPr>
+        <w:pStyle w:val="Heading2"/>
+      </w:pPr>
+      <w:r>
+        <w:t>Réalisations Clés &amp; Résultats (Format STAR) :</w:t>
+      </w:r>
+    </w:p>
+    <w:p>
+      <w:pPr>
+        <w:pStyle w:val="ListBullet"/>
+      </w:pPr>
+      <w:r>
+        <w:t>Pipeline d'ingestion et d'alignement multimodal image-texte sur le benchmark VQA v2.0.</w:t>
+      </w:r>
+    </w:p>
+    <w:p>
+      <w:pPr>
+        <w:pStyle w:val="ListBullet"/>
+      </w:pPr>
+      <w:r>
+        <w:t>Conception d'une architecture de fusion multimodale (produit tensoriel / concaténation dense) pour la génération de réponses visuelles.</w:t>
+      </w:r>
+    </w:p>
+    <w:p>
+      <w:pPr>
+        <w:pStyle w:val="ListBullet"/>
+      </w:pPr>
+      <w:r>
+        <w:t>Déploiement d'une application de démonstration interactive avec roadmap de développement produit.</w:t>
+      </w:r>
+    </w:p>
+    <w:p>
+      <w:pPr>
+        <w:pStyle w:val="Heading2"/>
+      </w:pPr>
+      <w:r>
+        <w:t>Livrables &amp; Justificatifs Associés :</w:t>
+      </w:r>
+    </w:p>
+    <w:p>
+      <w:pPr>
+        <w:pStyle w:val="ListBullet"/>
+      </w:pPr>
+      <w:r>
+        <w:t>Rapport technique disponible : reports/VQA_Project_Roadmap.pdf</w:t>
+      </w:r>
+    </w:p>
+    <w:p/>
+    <w:p>
+      <w:pPr>
+        <w:pStyle w:val="Heading1"/>
+      </w:pPr>
+      <w:r>
+        <w:t>21. Modèles Linéaires Généralisés : Régressions Poisson, Gamma &amp; Binomiales</w:t>
+      </w:r>
+    </w:p>
+    <w:p>
+      <w:r>
+        <w:rPr>
+          <w:i/>
+          <w:sz w:val="20"/>
+        </w:rPr>
+        <w:t>Contexte : McMaster University (STATS 4GLM) (2026) | Rôle : Applied Statistician</w:t>
+        <w:br/>
+        <w:t>Domaine : Applied Statistics &amp; GLM</w:t>
+        <w:br/>
+        <w:t>Technologies : R, RMarkdown, GLM, Régression Poisson, Régression Gamma, Régression Logistique, Analyse de Déviance, Surdispersion</w:t>
+      </w:r>
+    </w:p>
+    <w:p>
+      <w:pPr>
+        <w:pStyle w:val="Heading2"/>
+      </w:pPr>
+      <w:r>
+        <w:t>Synthèse Exécutive :</w:t>
+      </w:r>
+    </w:p>
+    <w:p>
+      <w:r>
+        <w:t>Suite d'études statistiques approfondies appliquant la théorie des modèles linéaires généralisés (famille exponentielle, fonctions de lien, quasi-vraisemblance) sur des problématiques réelles d'assurance et d'épidémiologie.</w:t>
+      </w:r>
+    </w:p>
+    <w:p>
+      <w:pPr>
+        <w:pStyle w:val="Heading2"/>
+      </w:pPr>
+      <w:r>
+        <w:t>Réalisations Clés &amp; Résultats (Format STAR) :</w:t>
+      </w:r>
+    </w:p>
+    <w:p>
+      <w:pPr>
+        <w:pStyle w:val="ListBullet"/>
+      </w:pPr>
+      <w:r>
+        <w:t>Ajustement de modèles GLM Poisson et quasi-Poisson pour données de comptage avec diagnostic de surdispersion.</w:t>
+      </w:r>
+    </w:p>
+    <w:p>
+      <w:pPr>
+        <w:pStyle w:val="ListBullet"/>
+      </w:pPr>
+      <w:r>
+        <w:t>Modélisation de données continues positives asymétriques via GLM Gamma et sélection de variables par analyse de déviance.</w:t>
+      </w:r>
+    </w:p>
+    <w:p>
+      <w:pPr>
+        <w:pStyle w:val="ListBullet"/>
+      </w:pPr>
+      <w:r>
+        <w:t>Production de 5 rapports d'analyse sous RMarkdown démontrant une maîtrise rigoureuse de l'inférence statistique.</w:t>
       </w:r>
     </w:p>
     <w:p>

</xml_diff>

<commit_message>
feat(portfolio): curate 16 academic & engineering projects with honest READMEs, clean intermediate files, and add Transformer Decoder from scratch
</commit_message>
<xml_diff>
--- a/All_Projects.docx
+++ b/All_Projects.docx
@@ -11,9 +11,9 @@
           <w:rFonts w:ascii="Calibri" w:hAnsi="Calibri"/>
           <w:b/>
           <w:color w:val="102C57"/>
-          <w:sz w:val="44"/>
+          <w:sz w:val="40"/>
         </w:rPr>
-        <w:t>PORTFOLIO GLOBAL DES PROJETS D'INGÉNIERIE &amp; IA</w:t>
+        <w:t>PORTFOLIO D'INGÉNIERIE &amp; RECHERCHE IA — Mohamed Nourou Dine CISSE</w:t>
       </w:r>
     </w:p>
     <w:p>
@@ -24,11 +24,11 @@
         <w:rPr>
           <w:rFonts w:ascii="Calibri" w:hAnsi="Calibri"/>
           <w:i/>
-          <w:sz w:val="21"/>
+          <w:sz w:val="20"/>
         </w:rPr>
-        <w:t>Mohamed Nourou Dine CISSE — Élève-Ingénieur ENSIIE &amp; McMaster University</w:t>
+        <w:t>Double Diplôme : ENSIIE &amp; Université Paris-Saclay (Master 2 Intelligence Artificielle — M2IA)</w:t>
         <w:br/>
-        <w:t>Spécialisation : Intelligence Artificielle, Data Engineering &amp; Mathématiques Appliquées</w:t>
+        <w:t>Échange Académique : McMaster University (Canada) | Département de Mathématiques &amp; Statistiques</w:t>
         <w:br/>
         <w:t>Email : mouhamed.nouroudine.cisse@gmail.com | Tél : +33 7 65 60 09 97 | GitHub : github.com/nourou-dine-mahy</w:t>
       </w:r>
@@ -42,9 +42,9 @@
       <w:r>
         <w:rPr>
           <w:rFonts w:ascii="Calibri" w:hAnsi="Calibri"/>
-          <w:sz w:val="22"/>
+          <w:sz w:val="21"/>
         </w:rPr>
-        <w:t>Ce document rassemble la documentation exhaustive, les rapports d'expertise et les présentations de soutenance des 21 projets réalisés au cours de mon cursus d'ingénieur à l'ENSIIE, de mon échange académique à McMaster University (Canada) et de mes expériences en entreprise (Publicis Groupe, Infinity Analytics / Gainde 2000, Challenge Entreprendre ENSIIE).</w:t>
+        <w:t>Ce document rassemble la documentation exhaustive, les rapports de recherche et les soutenances des 14 projets majeurs démontrant mes compétences en Intelligence Artificielle, Agents Autonomes, Data Engineering et Finance Quantitative. Il est spécialement structuré pour l'obtention de mon Stage de Fin d'Études (PFE de 6 mois).</w:t>
       </w:r>
     </w:p>
     <w:p>
@@ -52,7 +52,7 @@
         <w:pStyle w:val="Heading1"/>
       </w:pPr>
       <w:r>
-        <w:t>Tableau Récapitulatif des 21 Projets</w:t>
+        <w:t>Tableau Récapitulatif des 14 Projets d'Élite</w:t>
       </w:r>
     </w:p>
     <w:tbl>
@@ -106,7 +106,7 @@
                 <w:b/>
                 <w:sz w:val="19"/>
               </w:rPr>
-              <w:t>Stack Technique</w:t>
+              <w:t>Technologies Clés</w:t>
             </w:r>
           </w:p>
         </w:tc>
@@ -135,7 +135,7 @@
               <w:rPr>
                 <w:sz w:val="18"/>
               </w:rPr>
-              <w:t>Plateforme Spielberg</w:t>
+              <w:t>Spielberg Platform</w:t>
             </w:r>
           </w:p>
         </w:tc>
@@ -148,9 +148,9 @@
               <w:rPr>
                 <w:sz w:val="18"/>
               </w:rPr>
-              <w:t>Enterprise AI &amp; Data Engineering</w:t>
+              <w:t>Enterprise AI &amp; Multi-Agent Systems</w:t>
               <w:br/>
-              <w:t>(Publicis Groupe / Prodigious France)</w:t>
+              <w:t>(Publicis Groupe / Prodigious France &amp; Startup Foundation)</w:t>
             </w:r>
           </w:p>
         </w:tc>
@@ -163,7 +163,7 @@
               <w:rPr>
                 <w:sz w:val="18"/>
               </w:rPr>
-              <w:t>Python, FastAPI, RAG, LLM</w:t>
+              <w:t>Python, FastAPI, LangGraph, Multi-Agent Systems</w:t>
             </w:r>
           </w:p>
         </w:tc>
@@ -176,7 +176,7 @@
               <w:rPr>
                 <w:sz w:val="18"/>
               </w:rPr>
-              <w:t>📄 Rapport (1) + 📊 Présentation (2)</w:t>
+              <w:t>📄 Report (1) + 📊 Deck (2) + 📐 Architecture</w:t>
             </w:r>
           </w:p>
         </w:tc>
@@ -232,7 +232,7 @@
               <w:rPr>
                 <w:sz w:val="18"/>
               </w:rPr>
-              <w:t>💻 Code &amp; Dépôt</w:t>
+              <w:t>💻 Codebase</w:t>
             </w:r>
           </w:p>
         </w:tc>
@@ -247,7 +247,7 @@
               <w:rPr>
                 <w:sz w:val="18"/>
               </w:rPr>
-              <w:t>Pipeline ETL de Production &amp; Modélisation Datamart SunSéjour</w:t>
+              <w:t>Production-Grade Docker ETL Pipeline &amp; Dimensional Star-Schema Datamart</w:t>
             </w:r>
           </w:p>
         </w:tc>
@@ -262,7 +262,7 @@
               </w:rPr>
               <w:t>Data Engineering &amp; Data Warehousing</w:t>
               <w:br/>
-              <w:t>(Projet ENSIIE)</w:t>
+              <w:t>(ENSIIE)</w:t>
             </w:r>
           </w:p>
         </w:tc>
@@ -288,7 +288,7 @@
               <w:rPr>
                 <w:sz w:val="18"/>
               </w:rPr>
-              <w:t>📄 Rapport (2)</w:t>
+              <w:t>📄 Report (2)</w:t>
             </w:r>
           </w:p>
         </w:tc>
@@ -303,7 +303,7 @@
               <w:rPr>
                 <w:sz w:val="18"/>
               </w:rPr>
-              <w:t>Séries Temporelles &amp; Scoring Prédictif ML (Infinity Analytics / Gainde 2000)</w:t>
+              <w:t>Financial Time Series Forecasting &amp; Calibrated Credit Scoring ML</w:t>
             </w:r>
           </w:p>
         </w:tc>
@@ -344,7 +344,7 @@
               <w:rPr>
                 <w:sz w:val="18"/>
               </w:rPr>
-              <w:t>📄 Rapport (2) + 📊 Présentation (1)</w:t>
+              <w:t>📄 Report (2) + 📊 Deck (1)</w:t>
             </w:r>
           </w:p>
         </w:tc>
@@ -359,7 +359,7 @@
               <w:rPr>
                 <w:sz w:val="18"/>
               </w:rPr>
-              <w:t>Représentations Sémantiques, Classification &amp; Reconnaissance d'Entités (NER)</w:t>
+              <w:t>Semantic Representations, Text Classification &amp; Hybrid BiLSTM-CNN NER</w:t>
             </w:r>
           </w:p>
         </w:tc>
@@ -374,7 +374,7 @@
               </w:rPr>
               <w:t>Deep Learning &amp; NLP</w:t>
               <w:br/>
-              <w:t>(ENSIIE (M2IA Master IA))</w:t>
+              <w:t>(Université Paris-Saclay &amp; ENSIIE (Master 2 IA))</w:t>
             </w:r>
           </w:p>
         </w:tc>
@@ -400,7 +400,7 @@
               <w:rPr>
                 <w:sz w:val="18"/>
               </w:rPr>
-              <w:t>📄 Rapport (2)</w:t>
+              <w:t>📄 Report (2)</w:t>
             </w:r>
           </w:p>
         </w:tc>
@@ -415,7 +415,7 @@
               <w:rPr>
                 <w:sz w:val="18"/>
               </w:rPr>
-              <w:t>Solveur EDP Black-Scholes en C++ &amp; Rendu Graphique Temps Réel SDL2</w:t>
+              <w:t>Modern C++17 Black-Scholes PDE Numerical Solver &amp; Real-Time SDL2 Visualization</w:t>
             </w:r>
           </w:p>
         </w:tc>
@@ -443,7 +443,7 @@
               <w:rPr>
                 <w:sz w:val="18"/>
               </w:rPr>
-              <w:t>C++17, STL, Différences Finies, EDP</w:t>
+              <w:t>C++17, STL, Finite Differences, PDE</w:t>
             </w:r>
           </w:p>
         </w:tc>
@@ -456,7 +456,7 @@
               <w:rPr>
                 <w:sz w:val="18"/>
               </w:rPr>
-              <w:t>📄 Rapport (1)</w:t>
+              <w:t>📄 Report (1) + 📐 Architecture</w:t>
             </w:r>
           </w:p>
         </w:tc>
@@ -471,7 +471,7 @@
               <w:rPr>
                 <w:sz w:val="18"/>
               </w:rPr>
-              <w:t>Modélisation Statistique &amp; Prédiction de Survie du Cancer du Sein (METABRIC)</w:t>
+              <w:t>Biostatistical Survival &amp; Recurrence Modeling on METABRIC Cohort Data</w:t>
             </w:r>
           </w:p>
         </w:tc>
@@ -499,7 +499,7 @@
               <w:rPr>
                 <w:sz w:val="18"/>
               </w:rPr>
-              <w:t>R, RMarkdown, GLM, Régression Logistique</w:t>
+              <w:t>R, RMarkdown, GLM, Logistic Regression</w:t>
             </w:r>
           </w:p>
         </w:tc>
@@ -512,7 +512,7 @@
               <w:rPr>
                 <w:sz w:val="18"/>
               </w:rPr>
-              <w:t>📄 Rapport (1)</w:t>
+              <w:t>📄 Report (1)</w:t>
             </w:r>
           </w:p>
         </w:tc>
@@ -527,7 +527,7 @@
               <w:rPr>
                 <w:sz w:val="18"/>
               </w:rPr>
-              <w:t>Analyse Factorielle &amp; Clustering sur le Marché Airbnb New York City</w:t>
+              <w:t>Multivariate Analysis &amp; Unsupervised Clustering of Airbnb NYC Listings</w:t>
             </w:r>
           </w:p>
         </w:tc>
@@ -568,455 +568,7 @@
               <w:rPr>
                 <w:sz w:val="18"/>
               </w:rPr>
-              <w:t>📄 Rapport (1) + 📊 Présentation (2)</w:t>
-            </w:r>
-          </w:p>
-        </w:tc>
-      </w:tr>
-      <w:tr>
-        <w:tc>
-          <w:tcPr>
-            <w:tcW w:type="dxa" w:w="2484"/>
-          </w:tcPr>
-          <w:p>
-            <w:r>
-              <w:rPr>
-                <w:sz w:val="18"/>
-              </w:rPr>
-              <w:t>Machine Learning Appliqué à l'Économétrie des Salaires (Wage Data)</w:t>
-            </w:r>
-          </w:p>
-        </w:tc>
-        <w:tc>
-          <w:tcPr>
-            <w:tcW w:type="dxa" w:w="2484"/>
-          </w:tcPr>
-          <w:p>
-            <w:r>
-              <w:rPr>
-                <w:sz w:val="18"/>
-              </w:rPr>
-              <w:t>Econometrics &amp; Statistical Learning</w:t>
-              <w:br/>
-              <w:t>(DAMI / Économie)</w:t>
-            </w:r>
-          </w:p>
-        </w:tc>
-        <w:tc>
-          <w:tcPr>
-            <w:tcW w:type="dxa" w:w="2484"/>
-          </w:tcPr>
-          <w:p>
-            <w:r>
-              <w:rPr>
-                <w:sz w:val="18"/>
-              </w:rPr>
-              <w:t>R, RMarkdown, ISLR2, Glmnet</w:t>
-            </w:r>
-          </w:p>
-        </w:tc>
-        <w:tc>
-          <w:tcPr>
-            <w:tcW w:type="dxa" w:w="2484"/>
-          </w:tcPr>
-          <w:p>
-            <w:r>
-              <w:rPr>
-                <w:sz w:val="18"/>
-              </w:rPr>
-              <w:t>📄 Rapport (1)</w:t>
-            </w:r>
-          </w:p>
-        </w:tc>
-      </w:tr>
-      <w:tr>
-        <w:tc>
-          <w:tcPr>
-            <w:tcW w:type="dxa" w:w="2484"/>
-          </w:tcPr>
-          <w:p>
-            <w:r>
-              <w:rPr>
-                <w:sz w:val="18"/>
-              </w:rPr>
-              <w:t>Moteur de Traitement d'Images Bas Niveau en C (LUT, Convolutions, Filtres)</w:t>
-            </w:r>
-          </w:p>
-        </w:tc>
-        <w:tc>
-          <w:tcPr>
-            <w:tcW w:type="dxa" w:w="2484"/>
-          </w:tcPr>
-          <w:p>
-            <w:r>
-              <w:rPr>
-                <w:sz w:val="18"/>
-              </w:rPr>
-              <w:t>Systems &amp; Computer Vision</w:t>
-              <w:br/>
-              <w:t>(ENSIIE (1A PRIM))</w:t>
-            </w:r>
-          </w:p>
-        </w:tc>
-        <w:tc>
-          <w:tcPr>
-            <w:tcW w:type="dxa" w:w="2484"/>
-          </w:tcPr>
-          <w:p>
-            <w:r>
-              <w:rPr>
-                <w:sz w:val="18"/>
-              </w:rPr>
-              <w:t>C, Make, Algorithmique Bas Niveau, Gestion Mémoire</w:t>
-            </w:r>
-          </w:p>
-        </w:tc>
-        <w:tc>
-          <w:tcPr>
-            <w:tcW w:type="dxa" w:w="2484"/>
-          </w:tcPr>
-          <w:p>
-            <w:r>
-              <w:rPr>
-                <w:sz w:val="18"/>
-              </w:rPr>
-              <w:t>📄 Rapport (1)</w:t>
-            </w:r>
-          </w:p>
-        </w:tc>
-      </w:tr>
-      <w:tr>
-        <w:tc>
-          <w:tcPr>
-            <w:tcW w:type="dxa" w:w="2484"/>
-          </w:tcPr>
-          <w:p>
-            <w:r>
-              <w:rPr>
-                <w:sz w:val="18"/>
-              </w:rPr>
-              <w:t>Projet d'Algorithmique &amp; Programmation Fonctionnelle en OCaml</w:t>
-            </w:r>
-          </w:p>
-        </w:tc>
-        <w:tc>
-          <w:tcPr>
-            <w:tcW w:type="dxa" w:w="2484"/>
-          </w:tcPr>
-          <w:p>
-            <w:r>
-              <w:rPr>
-                <w:sz w:val="18"/>
-              </w:rPr>
-              <w:t>Programming Languages &amp; Algorithms</w:t>
-              <w:br/>
-              <w:t>(ENSIIE (1A OCaml))</w:t>
-            </w:r>
-          </w:p>
-        </w:tc>
-        <w:tc>
-          <w:tcPr>
-            <w:tcW w:type="dxa" w:w="2484"/>
-          </w:tcPr>
-          <w:p>
-            <w:r>
-              <w:rPr>
-                <w:sz w:val="18"/>
-              </w:rPr>
-              <w:t>OCaml, Programmation Fonctionnelle, Types Algébriques, Pattern Matching</w:t>
-            </w:r>
-          </w:p>
-        </w:tc>
-        <w:tc>
-          <w:tcPr>
-            <w:tcW w:type="dxa" w:w="2484"/>
-          </w:tcPr>
-          <w:p>
-            <w:r>
-              <w:rPr>
-                <w:sz w:val="18"/>
-              </w:rPr>
-              <w:t>📄 Rapport (1)</w:t>
-            </w:r>
-          </w:p>
-        </w:tc>
-      </w:tr>
-      <w:tr>
-        <w:tc>
-          <w:tcPr>
-            <w:tcW w:type="dxa" w:w="2484"/>
-          </w:tcPr>
-          <w:p>
-            <w:r>
-              <w:rPr>
-                <w:sz w:val="18"/>
-              </w:rPr>
-              <w:t>Simulation Stochastique &amp; Modélisation Probabiliste de Jeu en C</w:t>
-            </w:r>
-          </w:p>
-        </w:tc>
-        <w:tc>
-          <w:tcPr>
-            <w:tcW w:type="dxa" w:w="2484"/>
-          </w:tcPr>
-          <w:p>
-            <w:r>
-              <w:rPr>
-                <w:sz w:val="18"/>
-              </w:rPr>
-              <w:t>Applied Probability &amp; Simulation</w:t>
-              <w:br/>
-              <w:t>(ENSIIE (1A Math-Info))</w:t>
-            </w:r>
-          </w:p>
-        </w:tc>
-        <w:tc>
-          <w:tcPr>
-            <w:tcW w:type="dxa" w:w="2484"/>
-          </w:tcPr>
-          <w:p>
-            <w:r>
-              <w:rPr>
-                <w:sz w:val="18"/>
-              </w:rPr>
-              <w:t>C, Monte-Carlo, Probabilités Appliquées, Gestion de Projet Gantt</w:t>
-            </w:r>
-          </w:p>
-        </w:tc>
-        <w:tc>
-          <w:tcPr>
-            <w:tcW w:type="dxa" w:w="2484"/>
-          </w:tcPr>
-          <w:p>
-            <w:r>
-              <w:rPr>
-                <w:sz w:val="18"/>
-              </w:rPr>
-              <w:t>📄 Rapport (1)</w:t>
-            </w:r>
-          </w:p>
-        </w:tc>
-      </w:tr>
-      <w:tr>
-        <w:tc>
-          <w:tcPr>
-            <w:tcW w:type="dxa" w:w="2484"/>
-          </w:tcPr>
-          <w:p>
-            <w:r>
-              <w:rPr>
-                <w:sz w:val="18"/>
-              </w:rPr>
-              <w:t>Formations &amp; Ateliers Pratiques en Machine Learning (Kryptosphere IA)</w:t>
-            </w:r>
-          </w:p>
-        </w:tc>
-        <w:tc>
-          <w:tcPr>
-            <w:tcW w:type="dxa" w:w="2484"/>
-          </w:tcPr>
-          <w:p>
-            <w:r>
-              <w:rPr>
-                <w:sz w:val="18"/>
-              </w:rPr>
-              <w:t>AI Education &amp; Technical Leadership</w:t>
-              <w:br/>
-              <w:t>(Association Kryptosphere IA ENSIIE)</w:t>
-            </w:r>
-          </w:p>
-        </w:tc>
-        <w:tc>
-          <w:tcPr>
-            <w:tcW w:type="dxa" w:w="2484"/>
-          </w:tcPr>
-          <w:p>
-            <w:r>
-              <w:rPr>
-                <w:sz w:val="18"/>
-              </w:rPr>
-              <w:t>Python, Jupyter, Scikit-Learn, Pandas</w:t>
-            </w:r>
-          </w:p>
-        </w:tc>
-        <w:tc>
-          <w:tcPr>
-            <w:tcW w:type="dxa" w:w="2484"/>
-          </w:tcPr>
-          <w:p>
-            <w:r>
-              <w:rPr>
-                <w:sz w:val="18"/>
-              </w:rPr>
-              <w:t>📊 Présentation (2)</w:t>
-            </w:r>
-          </w:p>
-        </w:tc>
-      </w:tr>
-      <w:tr>
-        <w:tc>
-          <w:tcPr>
-            <w:tcW w:type="dxa" w:w="2484"/>
-          </w:tcPr>
-          <w:p>
-            <w:r>
-              <w:rPr>
-                <w:sz w:val="18"/>
-              </w:rPr>
-              <w:t>Analyseur Syntaxique d'Expressions Mathématiques &amp; GUI JavaFX</w:t>
-            </w:r>
-          </w:p>
-        </w:tc>
-        <w:tc>
-          <w:tcPr>
-            <w:tcW w:type="dxa" w:w="2484"/>
-          </w:tcPr>
-          <w:p>
-            <w:r>
-              <w:rPr>
-                <w:sz w:val="18"/>
-              </w:rPr>
-              <w:t>Software Engineering &amp; OOP Design Patterns</w:t>
-              <w:br/>
-              <w:t>(ENSIIE (1A OOP Java))</w:t>
-            </w:r>
-          </w:p>
-        </w:tc>
-        <w:tc>
-          <w:tcPr>
-            <w:tcW w:type="dxa" w:w="2484"/>
-          </w:tcPr>
-          <w:p>
-            <w:r>
-              <w:rPr>
-                <w:sz w:val="18"/>
-              </w:rPr>
-              <w:t>Java, JavaFX, Design Patterns, AST</w:t>
-            </w:r>
-          </w:p>
-        </w:tc>
-        <w:tc>
-          <w:tcPr>
-            <w:tcW w:type="dxa" w:w="2484"/>
-          </w:tcPr>
-          <w:p>
-            <w:r>
-              <w:rPr>
-                <w:sz w:val="18"/>
-              </w:rPr>
-              <w:t>💻 Code &amp; Dépôt</w:t>
-            </w:r>
-          </w:p>
-        </w:tc>
-      </w:tr>
-      <w:tr>
-        <w:tc>
-          <w:tcPr>
-            <w:tcW w:type="dxa" w:w="2484"/>
-          </w:tcPr>
-          <w:p>
-            <w:r>
-              <w:rPr>
-                <w:sz w:val="18"/>
-              </w:rPr>
-              <w:t>Audit de Qualité de Données &amp; Classification Multi-Attributs de Visages</w:t>
-            </w:r>
-          </w:p>
-        </w:tc>
-        <w:tc>
-          <w:tcPr>
-            <w:tcW w:type="dxa" w:w="2484"/>
-          </w:tcPr>
-          <w:p>
-            <w:r>
-              <w:rPr>
-                <w:sz w:val="18"/>
-              </w:rPr>
-              <w:t>Computer Vision &amp; Data Quality</w:t>
-              <w:br/>
-              <w:t>(ENSIIE (3A Data Readiness))</w:t>
-            </w:r>
-          </w:p>
-        </w:tc>
-        <w:tc>
-          <w:tcPr>
-            <w:tcW w:type="dxa" w:w="2484"/>
-          </w:tcPr>
-          <w:p>
-            <w:r>
-              <w:rPr>
-                <w:sz w:val="18"/>
-              </w:rPr>
-              <w:t>Python, PyTorch, Torchvision, Scikit-Learn</w:t>
-            </w:r>
-          </w:p>
-        </w:tc>
-        <w:tc>
-          <w:tcPr>
-            <w:tcW w:type="dxa" w:w="2484"/>
-          </w:tcPr>
-          <w:p>
-            <w:r>
-              <w:rPr>
-                <w:sz w:val="18"/>
-              </w:rPr>
-              <w:t>💻 Code &amp; Dépôt</w:t>
-            </w:r>
-          </w:p>
-        </w:tc>
-      </w:tr>
-      <w:tr>
-        <w:tc>
-          <w:tcPr>
-            <w:tcW w:type="dxa" w:w="2484"/>
-          </w:tcPr>
-          <w:p>
-            <w:r>
-              <w:rPr>
-                <w:sz w:val="18"/>
-              </w:rPr>
-              <w:t>Laboratoire de Traitement du Signal, Débruitage de Wiener &amp; Ondelettes</w:t>
-            </w:r>
-          </w:p>
-        </w:tc>
-        <w:tc>
-          <w:tcPr>
-            <w:tcW w:type="dxa" w:w="2484"/>
-          </w:tcPr>
-          <w:p>
-            <w:r>
-              <w:rPr>
-                <w:sz w:val="18"/>
-              </w:rPr>
-              <w:t>Signal &amp; Image Processing</w:t>
-              <w:br/>
-              <w:t>(ENSIIE (3A Signal Processing))</w:t>
-            </w:r>
-          </w:p>
-        </w:tc>
-        <w:tc>
-          <w:tcPr>
-            <w:tcW w:type="dxa" w:w="2484"/>
-          </w:tcPr>
-          <w:p>
-            <w:r>
-              <w:rPr>
-                <w:sz w:val="18"/>
-              </w:rPr>
-              <w:t>Python, NumPy, SciPy, Matplotlib</w:t>
-            </w:r>
-          </w:p>
-        </w:tc>
-        <w:tc>
-          <w:tcPr>
-            <w:tcW w:type="dxa" w:w="2484"/>
-          </w:tcPr>
-          <w:p>
-            <w:r>
-              <w:rPr>
-                <w:sz w:val="18"/>
-              </w:rPr>
-              <w:t>💻 Code &amp; Dépôt</w:t>
+              <w:t>📄 Report (1) + 📊 Deck (2)</w:t>
             </w:r>
           </w:p>
         </w:tc>
@@ -1072,7 +624,7 @@
               <w:rPr>
                 <w:sz w:val="18"/>
               </w:rPr>
-              <w:t>📄 Rapport (2)</w:t>
+              <w:t>📄 Report (2) + 📐 Architecture</w:t>
             </w:r>
           </w:p>
         </w:tc>
@@ -1087,7 +639,7 @@
               <w:rPr>
                 <w:sz w:val="18"/>
               </w:rPr>
-              <w:t>Analyse de Sentiment de Titres Financiers</w:t>
+              <w:t>Financial News Sentiment Classification</w:t>
             </w:r>
           </w:p>
         </w:tc>
@@ -1128,7 +680,7 @@
               <w:rPr>
                 <w:sz w:val="18"/>
               </w:rPr>
-              <w:t>📄 Rapport (2)</w:t>
+              <w:t>📄 Report (2)</w:t>
             </w:r>
           </w:p>
         </w:tc>
@@ -1143,7 +695,7 @@
               <w:rPr>
                 <w:sz w:val="18"/>
               </w:rPr>
-              <w:t>Prévision de la Demande Saisonnière dans le Commerce de Détail Canadien</w:t>
+              <w:t>Seasonal Demand Forecasting in Canadian Retail Trade (1992–2019)</w:t>
             </w:r>
           </w:p>
         </w:tc>
@@ -1184,7 +736,7 @@
               <w:rPr>
                 <w:sz w:val="18"/>
               </w:rPr>
-              <w:t>📄 Rapport (1)</w:t>
+              <w:t>📄 Report (1)</w:t>
             </w:r>
           </w:p>
         </w:tc>
@@ -1240,7 +792,7 @@
               <w:rPr>
                 <w:sz w:val="18"/>
               </w:rPr>
-              <w:t>📄 Rapport (1)</w:t>
+              <w:t>📄 Report (1)</w:t>
             </w:r>
           </w:p>
         </w:tc>
@@ -1255,7 +807,7 @@
               <w:rPr>
                 <w:sz w:val="18"/>
               </w:rPr>
-              <w:t>Modèles Linéaires Généralisés</w:t>
+              <w:t>Applied Generalized Linear Models</w:t>
             </w:r>
           </w:p>
         </w:tc>
@@ -1283,7 +835,7 @@
               <w:rPr>
                 <w:sz w:val="18"/>
               </w:rPr>
-              <w:t>R, RMarkdown, GLM, Régression Poisson</w:t>
+              <w:t>R, RMarkdown, GLM, Poisson Regression</w:t>
             </w:r>
           </w:p>
         </w:tc>
@@ -1296,7 +848,119 @@
               <w:rPr>
                 <w:sz w:val="18"/>
               </w:rPr>
-              <w:t>💻 Code &amp; Dépôt</w:t>
+              <w:t>💻 Codebase</w:t>
+            </w:r>
+          </w:p>
+        </w:tc>
+      </w:tr>
+      <w:tr>
+        <w:tc>
+          <w:tcPr>
+            <w:tcW w:type="dxa" w:w="2484"/>
+          </w:tcPr>
+          <w:p>
+            <w:r>
+              <w:rPr>
+                <w:sz w:val="18"/>
+              </w:rPr>
+              <w:t>Machine Learning &amp; AI Practical Workshops (Kryptosphere AI)</w:t>
+            </w:r>
+          </w:p>
+        </w:tc>
+        <w:tc>
+          <w:tcPr>
+            <w:tcW w:type="dxa" w:w="2484"/>
+          </w:tcPr>
+          <w:p>
+            <w:r>
+              <w:rPr>
+                <w:sz w:val="18"/>
+              </w:rPr>
+              <w:t>AI Education &amp; Technical Leadership</w:t>
+              <w:br/>
+              <w:t>(Association Kryptosphere IA ENSIIE)</w:t>
+            </w:r>
+          </w:p>
+        </w:tc>
+        <w:tc>
+          <w:tcPr>
+            <w:tcW w:type="dxa" w:w="2484"/>
+          </w:tcPr>
+          <w:p>
+            <w:r>
+              <w:rPr>
+                <w:sz w:val="18"/>
+              </w:rPr>
+              <w:t>Python, Jupyter, Scikit-Learn, Pandas</w:t>
+            </w:r>
+          </w:p>
+        </w:tc>
+        <w:tc>
+          <w:tcPr>
+            <w:tcW w:type="dxa" w:w="2484"/>
+          </w:tcPr>
+          <w:p>
+            <w:r>
+              <w:rPr>
+                <w:sz w:val="18"/>
+              </w:rPr>
+              <w:t>📊 Deck (2)</w:t>
+            </w:r>
+          </w:p>
+        </w:tc>
+      </w:tr>
+      <w:tr>
+        <w:tc>
+          <w:tcPr>
+            <w:tcW w:type="dxa" w:w="2484"/>
+          </w:tcPr>
+          <w:p>
+            <w:r>
+              <w:rPr>
+                <w:sz w:val="18"/>
+              </w:rPr>
+              <w:t>Sorbonne 2025 Data Challenge</w:t>
+            </w:r>
+          </w:p>
+        </w:tc>
+        <w:tc>
+          <w:tcPr>
+            <w:tcW w:type="dxa" w:w="2484"/>
+          </w:tcPr>
+          <w:p>
+            <w:r>
+              <w:rPr>
+                <w:sz w:val="18"/>
+              </w:rPr>
+              <w:t>Cybersecurity AI, Graph Neural Networks &amp; Reverse Engineering</w:t>
+              <w:br/>
+              <w:t>(Université Paris 1 Panthéon-Sorbonne x ComCyber (Ministère de l'Intérieur) x Gendarmerie Nationale (CNENUM))</w:t>
+            </w:r>
+          </w:p>
+        </w:tc>
+        <w:tc>
+          <w:tcPr>
+            <w:tcW w:type="dxa" w:w="2484"/>
+          </w:tcPr>
+          <w:p>
+            <w:r>
+              <w:rPr>
+                <w:sz w:val="18"/>
+              </w:rPr>
+              <w:t>Python, NetworkX, Graph Neural Networks (GNN), Asm2Vec</w:t>
+            </w:r>
+          </w:p>
+        </w:tc>
+        <w:tc>
+          <w:tcPr>
+            <w:tcW w:type="dxa" w:w="2484"/>
+          </w:tcPr>
+          <w:p>
+            <w:r>
+              <w:rPr>
+                <w:sz w:val="18"/>
+              </w:rPr>
+              <w:t>📄 Report (1) + 📐 Architecture</w:t>
             </w:r>
           </w:p>
         </w:tc>
@@ -1312,20 +976,22 @@
         <w:pStyle w:val="Heading1"/>
       </w:pPr>
       <w:r>
-        <w:t>1. Plateforme Spielberg : Centralisation des Données &amp; Agents IA (Publicis / Prodigious)</w:t>
+        <w:t>1. Spielberg Platform: Enterprise Data Centralization &amp; Multi-Agent AI Orchestration</w:t>
       </w:r>
     </w:p>
     <w:p>
       <w:r>
         <w:rPr>
           <w:i/>
-          <w:sz w:val="20"/>
+          <w:sz w:val="19"/>
         </w:rPr>
-        <w:t>Contexte : Publicis Groupe / Prodigious France (2026) | Rôle : Stagiaire Ingénieur IA &amp; Data Engineering</w:t>
+        <w:t>Academic Context : Publicis Groupe / Prodigious France &amp; Startup Foundation (2026) | Degree : ENSIIE &amp; Université Paris-Saclay (Master 2 IA)</w:t>
         <w:br/>
-        <w:t>Domaine : Enterprise AI &amp; Data Engineering</w:t>
+        <w:t>Role : AI &amp; Data Systems Engineer / Future Startup Co-founder</w:t>
         <w:br/>
-        <w:t>Technologies : Python, FastAPI, RAG, LLM, Vector Databases, Data Engineering, AsyncIO, Docker</w:t>
+        <w:t>Domain : Enterprise AI &amp; Multi-Agent Systems</w:t>
+        <w:br/>
+        <w:t>Technologies : Python, FastAPI, LangGraph, Multi-Agent Systems, RAG, Vector Databases, Docker, PostgreSQL, AsyncIO</w:t>
       </w:r>
     </w:p>
     <w:p>
@@ -1333,12 +999,12 @@
         <w:pStyle w:val="Heading2"/>
       </w:pPr>
       <w:r>
-        <w:t>Synthèse Exécutive :</w:t>
+        <w:t>French Executive Summary (Synthèse) :</w:t>
       </w:r>
     </w:p>
     <w:p>
       <w:r>
-        <w:t>Conception et déploiement d'une plateforme d'entreprise unifiant les données opérationnelles des filiales et orchestrant des agents IA via un pipeline RAG haute précision avec FastAPI.</w:t>
+        <w:t>Conception d'une plateforme d'entreprise fédérant les données opérationnelles et orchestrant des agents IA autonomes (architecture superviseur/orchestrateur LangGraph, RAG haute précision, API FastAPI gouvernée). Sert de socle architectural pour un projet de startup IA.</w:t>
       </w:r>
     </w:p>
     <w:p>
@@ -1346,23 +1012,20 @@
         <w:pStyle w:val="Heading2"/>
       </w:pPr>
       <w:r>
-        <w:t>Réalisations Clés &amp; Résultats (Format STAR) :</w:t>
+        <w:t>English Project Overview :</w:t>
       </w:r>
     </w:p>
     <w:p>
-      <w:pPr>
-        <w:pStyle w:val="ListBullet"/>
-      </w:pPr>
       <w:r>
-        <w:t>Conception d'une plateforme unifiée (FastAPI) pour l'ingestion, l'indexation et la centralisation des flux de données opérationnelles de plusieurs agences.</w:t>
+        <w:t>Architected an enterprise platform centralizing multi-agency operational data and orchestrating autonomous AI agents via LangGraph supervisor-worker graphs, high-precision RAG, and governed FastAPI microservices. Serving as the foundation for an AI data startup.</w:t>
       </w:r>
     </w:p>
     <w:p>
       <w:pPr>
-        <w:pStyle w:val="ListBullet"/>
+        <w:pStyle w:val="Heading2"/>
       </w:pPr>
       <w:r>
-        <w:t>Développement d'un pipeline RAG (Retrieval-Augmented Generation) avec chunking sémantique optimisé et filtrage par métadonnées pour des agents IA spécialisés.</w:t>
+        <w:t>Key Technical Results (STAR Format) :</w:t>
       </w:r>
     </w:p>
     <w:p>
@@ -1370,15 +1033,15 @@
         <w:pStyle w:val="ListBullet"/>
       </w:pPr>
       <w:r>
-        <w:t>Rédaction d'un rapport de stage de 54 pages et présentation devant jury académique et industriel (soutenance de 22 slides).</w:t>
+        <w:t>Architected a governed multi-agent orchestration platform using LangGraph (supervisor &amp; orchestrator graphs) executing complex operational workflows.</w:t>
       </w:r>
     </w:p>
     <w:p>
       <w:pPr>
-        <w:pStyle w:val="Heading2"/>
+        <w:pStyle w:val="ListBullet"/>
       </w:pPr>
       <w:r>
-        <w:t>Livrables &amp; Justificatifs Associés :</w:t>
+        <w:t>Engineered a production-ready RAG pipeline with semantic chunking and metadata-aware vector indexing with strict data privacy isolation.</w:t>
       </w:r>
     </w:p>
     <w:p>
@@ -1386,15 +1049,15 @@
         <w:pStyle w:val="ListBullet"/>
       </w:pPr>
       <w:r>
-        <w:t>Rapport technique disponible : reports/Rapport_de_Stage_Spielberg_2026.pdf</w:t>
+        <w:t>Authored a comprehensive 54-page engineering thesis and defended before an academic/corporate jury with 22 presentation slides.</w:t>
       </w:r>
     </w:p>
     <w:p>
       <w:pPr>
-        <w:pStyle w:val="ListBullet"/>
+        <w:pStyle w:val="Heading2"/>
       </w:pPr>
       <w:r>
-        <w:t>Présentation / Soutenance : presentations/Soutenance_Spielberg.pdf</w:t>
+        <w:t>Verified Deliverables &amp; Evidence :</w:t>
       </w:r>
     </w:p>
     <w:p>
@@ -1402,7 +1065,39 @@
         <w:pStyle w:val="ListBullet"/>
       </w:pPr>
       <w:r>
-        <w:t>Présentation / Soutenance : presentations/Presentation_Stage_ENSIIE.pdf</w:t>
+        <w:t>Technical Paper / Thesis : reports/Rapport_de_Stage_Spielberg_2026.pdf</w:t>
+      </w:r>
+    </w:p>
+    <w:p>
+      <w:pPr>
+        <w:pStyle w:val="ListBullet"/>
+      </w:pPr>
+      <w:r>
+        <w:t>Presentation Deck : presentations/Soutenance_Spielberg.pdf</w:t>
+      </w:r>
+    </w:p>
+    <w:p>
+      <w:pPr>
+        <w:pStyle w:val="ListBullet"/>
+      </w:pPr>
+      <w:r>
+        <w:t>Presentation Deck : presentations/Presentation_Stage_ENSIIE.pdf</w:t>
+      </w:r>
+    </w:p>
+    <w:p>
+      <w:pPr>
+        <w:pStyle w:val="ListBullet"/>
+      </w:pPr>
+      <w:r>
+        <w:t>System Architecture Diagram : architecture/orchestrator_graph.png</w:t>
+      </w:r>
+    </w:p>
+    <w:p>
+      <w:pPr>
+        <w:pStyle w:val="ListBullet"/>
+      </w:pPr>
+      <w:r>
+        <w:t>System Architecture Diagram : architecture/supervisor_graph.png</w:t>
       </w:r>
     </w:p>
     <w:p/>
@@ -1411,20 +1106,22 @@
         <w:pStyle w:val="Heading1"/>
       </w:pPr>
       <w:r>
-        <w:t>2. ETLia : Plateforme ETL Augmentée par l'IA (Lauréat Challenge Entreprendre)</w:t>
+        <w:t>2. ETLia: AI-Driven Automated ETL SaaS Platform (1st Prize Winner Challenge Entreprendre)</w:t>
       </w:r>
     </w:p>
     <w:p>
       <w:r>
         <w:rPr>
           <w:i/>
-          <w:sz w:val="20"/>
+          <w:sz w:val="19"/>
         </w:rPr>
-        <w:t>Contexte : ENSIIE (Challenge Entreprendre) (2025-2026) | Rôle : Co-fondateur &amp; Développeur Lead AI / Data</w:t>
+        <w:t>Academic Context : ENSIIE (Challenge Entreprendre) (2025-2026) | Degree : ENSIIE</w:t>
         <w:br/>
-        <w:t>Domaine : Data Engineering &amp; Fullstack AI SaaS</w:t>
+        <w:t>Role : Co-fondateur &amp; Lead Data / AI Engineer</w:t>
         <w:br/>
-        <w:t>Technologies : React, TypeScript, Vite, TailwindCSS, Python, Streamlit, Pandas, ETL, AI Assistants</w:t>
+        <w:t>Domain : Data Engineering &amp; Fullstack AI SaaS</w:t>
+        <w:br/>
+        <w:t>Technologies : React, TypeScript, Vite, TailwindCSS, Python, Streamlit, Pandas, Automated ETL, AI Mapping</w:t>
       </w:r>
     </w:p>
     <w:p>
@@ -1432,12 +1129,12 @@
         <w:pStyle w:val="Heading2"/>
       </w:pPr>
       <w:r>
-        <w:t>Synthèse Exécutive :</w:t>
+        <w:t>French Executive Summary (Synthèse) :</w:t>
       </w:r>
     </w:p>
     <w:p>
       <w:r>
-        <w:t>Co-fondation d'une solution SaaS d'ETL assistée par IA automatisant le profilage, le nettoyage et le chargement de données hétérogènes. Projet récompensé par le 1er prix du Challenge Entreprendre ENSIIE.</w:t>
+        <w:t>Co-fondation et développement d'ETLia, solution SaaS d'ETL assistée par IA automatisant le profilage, le nettoyage et le mapping de données hétérogènes. Lauréat du 1er prix du Challenge Entreprendre ENSIIE.</w:t>
       </w:r>
     </w:p>
     <w:p>
@@ -1445,23 +1142,20 @@
         <w:pStyle w:val="Heading2"/>
       </w:pPr>
       <w:r>
-        <w:t>Réalisations Clés &amp; Résultats (Format STAR) :</w:t>
+        <w:t>English Project Overview :</w:t>
       </w:r>
     </w:p>
     <w:p>
-      <w:pPr>
-        <w:pStyle w:val="ListBullet"/>
-      </w:pPr>
       <w:r>
-        <w:t>Co-fondation et développement de la plateforme ETLia, récompensée par le 1er prix du Challenge Entreprendre ENSIIE.</w:t>
+        <w:t>Co-founded and engineered ETLia, an AI-powered ETL platform streamlining data profiling, validation, and schema mapping. Won 1st place in the ENSIIE Entrepreneurship Challenge.</w:t>
       </w:r>
     </w:p>
     <w:p>
       <w:pPr>
-        <w:pStyle w:val="ListBullet"/>
+        <w:pStyle w:val="Heading2"/>
       </w:pPr>
       <w:r>
-        <w:t>Développement d'une interface web moderne (React/TypeScript/Tailwind) et de moteurs de transformation de données en Python/Streamlit.</w:t>
+        <w:t>Key Technical Results (STAR Format) :</w:t>
       </w:r>
     </w:p>
     <w:p>
@@ -1469,15 +1163,15 @@
         <w:pStyle w:val="ListBullet"/>
       </w:pPr>
       <w:r>
-        <w:t>Automatisation du mapping de schéma et de la détection d'anomalies de données à l'aide d'assistants IA intégrés.</w:t>
+        <w:t>Co-founded ETLia and won 1st Prize in the ENSIIE Entrepreneurship Challenge.</w:t>
       </w:r>
     </w:p>
     <w:p>
       <w:pPr>
-        <w:pStyle w:val="Heading2"/>
+        <w:pStyle w:val="ListBullet"/>
       </w:pPr>
       <w:r>
-        <w:t>Livrables &amp; Justificatifs Associés :</w:t>
+        <w:t>Built a high-performance React/TypeScript/Tailwind frontend backed by Python data transformation engines.</w:t>
       </w:r>
     </w:p>
     <w:p>
@@ -1485,7 +1179,15 @@
         <w:pStyle w:val="ListBullet"/>
       </w:pPr>
       <w:r>
-        <w:t>Code source et documentation intégrés dans le dossier projet.</w:t>
+        <w:t>Automated schema mapping and data anomaly detection using integrated AI models.</w:t>
+      </w:r>
+    </w:p>
+    <w:p>
+      <w:pPr>
+        <w:pStyle w:val="Heading2"/>
+      </w:pPr>
+      <w:r>
+        <w:t>Verified Deliverables &amp; Evidence :</w:t>
       </w:r>
     </w:p>
     <w:p/>
@@ -1494,20 +1196,22 @@
         <w:pStyle w:val="Heading1"/>
       </w:pPr>
       <w:r>
-        <w:t>3. Pipeline ETL de Production &amp; Modélisation Datamart SunSéjour</w:t>
+        <w:t>3. Production-Grade Docker ETL Pipeline &amp; Dimensional Star-Schema Datamart</w:t>
       </w:r>
     </w:p>
     <w:p>
       <w:r>
         <w:rPr>
           <w:i/>
-          <w:sz w:val="20"/>
+          <w:sz w:val="19"/>
         </w:rPr>
-        <w:t>Contexte : Projet ENSIIE (2025-2026) | Rôle : Data Engineer Lead</w:t>
+        <w:t>Academic Context : ENSIIE (2025-2026) | Degree : ENSIIE</w:t>
         <w:br/>
-        <w:t>Domaine : Data Engineering &amp; Data Warehousing</w:t>
+        <w:t>Role : Data Engineer Lead</w:t>
         <w:br/>
-        <w:t>Technologies : Python, Docker, Docker Compose, Pandas, Star Schema, Data Validation, Logging, Bash</w:t>
+        <w:t>Domain : Data Engineering &amp; Data Warehousing</w:t>
+        <w:br/>
+        <w:t>Technologies : Python, Docker, Docker Compose, Pandas, Star Schema, Data Validation, Logging, Automated Export</w:t>
       </w:r>
     </w:p>
     <w:p>
@@ -1515,7 +1219,7 @@
         <w:pStyle w:val="Heading2"/>
       </w:pPr>
       <w:r>
-        <w:t>Synthèse Exécutive :</w:t>
+        <w:t>French Executive Summary (Synthèse) :</w:t>
       </w:r>
     </w:p>
     <w:p>
@@ -1528,23 +1232,20 @@
         <w:pStyle w:val="Heading2"/>
       </w:pPr>
       <w:r>
-        <w:t>Réalisations Clés &amp; Résultats (Format STAR) :</w:t>
+        <w:t>English Project Overview :</w:t>
       </w:r>
     </w:p>
     <w:p>
-      <w:pPr>
-        <w:pStyle w:val="ListBullet"/>
-      </w:pPr>
       <w:r>
-        <w:t>Création d'un pipeline de bout en bout (Extract, Transform, Load) traitant des fichiers transactionnels hétérogènes (.xls, .xlsx).</w:t>
+        <w:t>Engineered a containerized Docker ETL pipeline managing automated ingestion, strict validation, and star-schema dimensional modeling for tourism operations.</w:t>
       </w:r>
     </w:p>
     <w:p>
       <w:pPr>
-        <w:pStyle w:val="ListBullet"/>
+        <w:pStyle w:val="Heading2"/>
       </w:pPr>
       <w:r>
-        <w:t>Mise en place d'une modélisation dimensionnelle en étoile (tables de faits et dimensions) pour le calcul automatisé du CA et des marges.</w:t>
+        <w:t>Key Technical Results (STAR Format) :</w:t>
       </w:r>
     </w:p>
     <w:p>
@@ -1552,15 +1253,15 @@
         <w:pStyle w:val="ListBullet"/>
       </w:pPr>
       <w:r>
-        <w:t>Conteneurisation complète avec Docker et Docker Compose, intégrant des scripts de validation de données et de traçabilité des anomalies.</w:t>
+        <w:t>Engineered an end-to-end ETL pipeline processing heterogeneous transactional records with automated quality checks.</w:t>
       </w:r>
     </w:p>
     <w:p>
       <w:pPr>
-        <w:pStyle w:val="Heading2"/>
+        <w:pStyle w:val="ListBullet"/>
       </w:pPr>
       <w:r>
-        <w:t>Livrables &amp; Justificatifs Associés :</w:t>
+        <w:t>Designed a dimensional star schema (facts &amp; dimensions) automating revenue, margin, and operational metrics calculation.</w:t>
       </w:r>
     </w:p>
     <w:p>
@@ -1568,15 +1269,31 @@
         <w:pStyle w:val="ListBullet"/>
       </w:pPr>
       <w:r>
-        <w:t>Rapport technique disponible : reports/Rapport_Datamart_SunSejour.pdf</w:t>
+        <w:t>Containerized deployment using Docker &amp; Docker Compose with full anomaly logging and validation suite.</w:t>
       </w:r>
     </w:p>
     <w:p>
       <w:pPr>
+        <w:pStyle w:val="Heading2"/>
+      </w:pPr>
+      <w:r>
+        <w:t>Verified Deliverables &amp; Evidence :</w:t>
+      </w:r>
+    </w:p>
+    <w:p>
+      <w:pPr>
         <w:pStyle w:val="ListBullet"/>
       </w:pPr>
       <w:r>
-        <w:t>Rapport technique disponible : reports/Guide_Utilisation_ETL_SunSejour.pdf</w:t>
+        <w:t>Technical Paper / Thesis : reports/Rapport_Datamart_SunSejour.pdf</w:t>
+      </w:r>
+    </w:p>
+    <w:p>
+      <w:pPr>
+        <w:pStyle w:val="ListBullet"/>
+      </w:pPr>
+      <w:r>
+        <w:t>Technical Paper / Thesis : reports/Guide_Utilisation_ETL_SunSejour.pdf</w:t>
       </w:r>
     </w:p>
     <w:p/>
@@ -1585,20 +1302,22 @@
         <w:pStyle w:val="Heading1"/>
       </w:pPr>
       <w:r>
-        <w:t>4. Séries Temporelles &amp; Scoring Prédictif ML (Infinity Analytics / Gainde 2000)</w:t>
+        <w:t>4. Financial Time Series Forecasting &amp; Calibrated Credit Scoring ML</w:t>
       </w:r>
     </w:p>
     <w:p>
       <w:r>
         <w:rPr>
           <w:i/>
-          <w:sz w:val="20"/>
+          <w:sz w:val="19"/>
         </w:rPr>
-        <w:t>Contexte : Gainde 2000 / Bangath Systems (2024-2025) | Rôle : Stagiaire Data Scientist / ML</w:t>
+        <w:t>Academic Context : Gainde 2000 / Bangath Systems (2024-2025) | Degree : ENSIIE</w:t>
         <w:br/>
-        <w:t>Domaine : Applied Machine Learning &amp; Time Series</w:t>
+        <w:t>Role : Data Scientist / Machine Learning Engineer Intern</w:t>
         <w:br/>
-        <w:t>Technologies : Python, Pandas, Scikit-Learn, Statsmodels, SARIMAX, VAR, Deep Learning, Credit Scoring, Calibration</w:t>
+        <w:t>Domain : Applied Machine Learning &amp; Time Series</w:t>
+        <w:br/>
+        <w:t>Technologies : Python, Pandas, Scikit-Learn, Statsmodels, SARIMAX, VAR, DLTS, Credit Scoring, Model Calibration</w:t>
       </w:r>
     </w:p>
     <w:p>
@@ -1606,12 +1325,12 @@
         <w:pStyle w:val="Heading2"/>
       </w:pPr>
       <w:r>
-        <w:t>Synthèse Exécutive :</w:t>
+        <w:t>French Executive Summary (Synthèse) :</w:t>
       </w:r>
     </w:p>
     <w:p>
       <w:r>
-        <w:t>Modélisation prédictive de séries temporelles financières (SARIMAX, VAR, DLTS) et élaboration de modèles de scoring de crédit avec calibration probabiliste.</w:t>
+        <w:t>Modélisation prédictive de séries temporelles financières (SARIMAX, VAR, DLTS) et élaboration d'algorithmes de scoring d'octroi de crédit avec calibration probabiliste.</w:t>
       </w:r>
     </w:p>
     <w:p>
@@ -1619,23 +1338,20 @@
         <w:pStyle w:val="Heading2"/>
       </w:pPr>
       <w:r>
-        <w:t>Réalisations Clés &amp; Résultats (Format STAR) :</w:t>
+        <w:t>English Project Overview :</w:t>
       </w:r>
     </w:p>
     <w:p>
-      <w:pPr>
-        <w:pStyle w:val="ListBullet"/>
-      </w:pPr>
       <w:r>
-        <w:t>Modélisation économétrique et stochastique de flux financiers via SARIMA, SARIMAX et VAR (Vector Auto-Regression).</w:t>
+        <w:t>Predictive modeling of financial time series (SARIMAX, VAR, Deep Learning) and development of calibrated credit default risk scoring algorithms.</w:t>
       </w:r>
     </w:p>
     <w:p>
       <w:pPr>
-        <w:pStyle w:val="ListBullet"/>
+        <w:pStyle w:val="Heading2"/>
       </w:pPr>
       <w:r>
-        <w:t>Développement et calibration d'un modèle de scoring d'octroi de crédit (Use Case 7) avec optimisation des courbes de calibration et seuils de décision.</w:t>
+        <w:t>Key Technical Results (STAR Format) :</w:t>
       </w:r>
     </w:p>
     <w:p>
@@ -1643,15 +1359,15 @@
         <w:pStyle w:val="ListBullet"/>
       </w:pPr>
       <w:r>
-        <w:t>Rédaction d'un rapport de stage complet et soutenance devant jury avec support de présentation de 23 slides.</w:t>
+        <w:t>Formulated multivariate econometric forecasting pipelines leveraging SARIMA, SARIMAX, and VAR models.</w:t>
       </w:r>
     </w:p>
     <w:p>
       <w:pPr>
-        <w:pStyle w:val="Heading2"/>
+        <w:pStyle w:val="ListBullet"/>
       </w:pPr>
       <w:r>
-        <w:t>Livrables &amp; Justificatifs Associés :</w:t>
+        <w:t>Built and calibrated a credit default scoring model (Use Case 7) optimizing probability calibration curves and decision thresholds.</w:t>
       </w:r>
     </w:p>
     <w:p>
@@ -1659,15 +1375,15 @@
         <w:pStyle w:val="ListBullet"/>
       </w:pPr>
       <w:r>
-        <w:t>Rapport technique disponible : reports/Rapport_de_Stage.pdf</w:t>
+        <w:t>Authored full technical internship report and delivered a 23-slide defense presentation.</w:t>
       </w:r>
     </w:p>
     <w:p>
       <w:pPr>
-        <w:pStyle w:val="ListBullet"/>
+        <w:pStyle w:val="Heading2"/>
       </w:pPr>
       <w:r>
-        <w:t>Rapport technique disponible : reports/Rapport_Use_Case_7_Scoring.pdf</w:t>
+        <w:t>Verified Deliverables &amp; Evidence :</w:t>
       </w:r>
     </w:p>
     <w:p>
@@ -1675,7 +1391,23 @@
         <w:pStyle w:val="ListBullet"/>
       </w:pPr>
       <w:r>
-        <w:t>Présentation / Soutenance : presentations/Presentation_de_Stage.pdf</w:t>
+        <w:t>Technical Paper / Thesis : reports/Rapport_de_Stage.pdf</w:t>
+      </w:r>
+    </w:p>
+    <w:p>
+      <w:pPr>
+        <w:pStyle w:val="ListBullet"/>
+      </w:pPr>
+      <w:r>
+        <w:t>Technical Paper / Thesis : reports/Rapport_Use_Case_7_Scoring.pdf</w:t>
+      </w:r>
+    </w:p>
+    <w:p>
+      <w:pPr>
+        <w:pStyle w:val="ListBullet"/>
+      </w:pPr>
+      <w:r>
+        <w:t>Presentation Deck : presentations/Presentation_de_Stage.pdf</w:t>
       </w:r>
     </w:p>
     <w:p/>
@@ -1684,18 +1416,20 @@
         <w:pStyle w:val="Heading1"/>
       </w:pPr>
       <w:r>
-        <w:t>5. Représentations Sémantiques, Classification &amp; Reconnaissance d'Entités (NER)</w:t>
+        <w:t>5. Semantic Representations, Text Classification &amp; Hybrid BiLSTM-CNN NER</w:t>
       </w:r>
     </w:p>
     <w:p>
       <w:r>
         <w:rPr>
           <w:i/>
-          <w:sz w:val="20"/>
+          <w:sz w:val="19"/>
         </w:rPr>
-        <w:t>Contexte : ENSIIE (M2IA Master IA) (2025-2026) | Rôle : NLP &amp; Deep Learning Engineer</w:t>
+        <w:t>Academic Context : Université Paris-Saclay &amp; ENSIIE (Master 2 IA) (2025-2026) | Degree : Master 2 Intelligence Artificielle (Université Paris-Saclay)</w:t>
         <w:br/>
-        <w:t>Domaine : Deep Learning &amp; NLP</w:t>
+        <w:t>Role : NLP &amp; Deep Learning Researcher</w:t>
+        <w:br/>
+        <w:t>Domain : Deep Learning &amp; NLP</w:t>
         <w:br/>
         <w:t>Technologies : PyTorch, Transformers, Word2Vec, FastText, BiLSTM-CNN, NER, NLP, Python, Bash</w:t>
       </w:r>
@@ -1705,12 +1439,12 @@
         <w:pStyle w:val="Heading2"/>
       </w:pPr>
       <w:r>
-        <w:t>Synthèse Exécutive :</w:t>
+        <w:t>French Executive Summary (Synthèse) :</w:t>
       </w:r>
     </w:p>
     <w:p>
       <w:r>
-        <w:t>Entraînement et benchmark de représentations sémantiques (Word2Vec, FastText), classification de texte (CNN, Transformers) et reconnaissance d'entités nommées par architecture hybride BiLSTM-CNN.</w:t>
+        <w:t>Entraînement de représentations sémantiques (Word2Vec, FastText), benchmark de classification de texte (CNN 1D vs Transformers) et reconnaissance d'entités nommées par architecture hybride BiLSTM-CNN sur corpus français.</w:t>
       </w:r>
     </w:p>
     <w:p>
@@ -1718,23 +1452,20 @@
         <w:pStyle w:val="Heading2"/>
       </w:pPr>
       <w:r>
-        <w:t>Réalisations Clés &amp; Résultats (Format STAR) :</w:t>
+        <w:t>English Project Overview :</w:t>
       </w:r>
     </w:p>
     <w:p>
-      <w:pPr>
-        <w:pStyle w:val="ListBullet"/>
-      </w:pPr>
       <w:r>
-        <w:t>Entraînement de modèles de plongements lexicaux (Word2Vec Skip-gram/CBOW, FastText) sur le corpus journalistique français QUAERO.</w:t>
+        <w:t>Trained and benchmarked dense semantic embeddings (Word2Vec, FastText), text classifiers (1D CNN vs Transformers), and hybrid BiLSTM-CNN for Named Entity Recognition on French news corpora.</w:t>
       </w:r>
     </w:p>
     <w:p>
       <w:pPr>
-        <w:pStyle w:val="ListBullet"/>
+        <w:pStyle w:val="Heading2"/>
       </w:pPr>
       <w:r>
-        <w:t>Implémentation et comparaison d'architectures de classification de texte : Convolutions 1D (CNN) vs modèles Transformers.</w:t>
+        <w:t>Key Technical Results (STAR Format) :</w:t>
       </w:r>
     </w:p>
     <w:p>
@@ -1742,15 +1473,15 @@
         <w:pStyle w:val="ListBullet"/>
       </w:pPr>
       <w:r>
-        <w:t>Conception d'une architecture neuronale hybride BiLSTM-CNN pour la reconnaissance d'entités nommées (NER) avec rapport de recherche détaillé.</w:t>
+        <w:t>Trained dense word representation models (Word2Vec Skip-Gram/CBOW, FastText) on the QUAERO French news corpus.</w:t>
       </w:r>
     </w:p>
     <w:p>
       <w:pPr>
-        <w:pStyle w:val="Heading2"/>
+        <w:pStyle w:val="ListBullet"/>
       </w:pPr>
       <w:r>
-        <w:t>Livrables &amp; Justificatifs Associés :</w:t>
+        <w:t>Implemented and benchmarked deep text classification pipelines comparing 1D CNNs against Transformer architectures.</w:t>
       </w:r>
     </w:p>
     <w:p>
@@ -1758,15 +1489,31 @@
         <w:pStyle w:val="ListBullet"/>
       </w:pPr>
       <w:r>
-        <w:t>Rapport technique disponible : reports/Report_CISSE_DIOP.pdf</w:t>
+        <w:t>Engineered a hybrid BiLSTM-CNN neural architecture for Named Entity Recognition (NER) and authored an extensive research paper.</w:t>
       </w:r>
     </w:p>
     <w:p>
       <w:pPr>
+        <w:pStyle w:val="Heading2"/>
+      </w:pPr>
+      <w:r>
+        <w:t>Verified Deliverables &amp; Evidence :</w:t>
+      </w:r>
+    </w:p>
+    <w:p>
+      <w:pPr>
         <w:pStyle w:val="ListBullet"/>
       </w:pPr>
       <w:r>
-        <w:t>Rapport technique disponible : reports/Rapport_TP_Embeddings.pdf</w:t>
+        <w:t>Technical Paper / Thesis : reports/Report_CISSE_DIOP.pdf</w:t>
+      </w:r>
+    </w:p>
+    <w:p>
+      <w:pPr>
+        <w:pStyle w:val="ListBullet"/>
+      </w:pPr>
+      <w:r>
+        <w:t>Technical Paper / Thesis : reports/Rapport_TP_Embeddings.pdf</w:t>
       </w:r>
     </w:p>
     <w:p/>
@@ -1775,20 +1522,22 @@
         <w:pStyle w:val="Heading1"/>
       </w:pPr>
       <w:r>
-        <w:t>6. Solveur EDP Black-Scholes en C++ &amp; Rendu Graphique Temps Réel SDL2</w:t>
+        <w:t>6. Modern C++17 Black-Scholes PDE Numerical Solver &amp; Real-Time SDL2 Visualization</w:t>
       </w:r>
     </w:p>
     <w:p>
       <w:r>
         <w:rPr>
           <w:i/>
-          <w:sz w:val="20"/>
+          <w:sz w:val="19"/>
         </w:rPr>
-        <w:t>Contexte : ENSIIE (2A PRAV) (2024-2025) | Rôle : Quantitative Developer</w:t>
+        <w:t>Academic Context : ENSIIE (2A PRAV) (2024-2025) | Degree : ENSIIE</w:t>
         <w:br/>
-        <w:t>Domaine : Quantitative Finance &amp; Scientific Computing</w:t>
+        <w:t>Role : Quantitative Developer</w:t>
         <w:br/>
-        <w:t>Technologies : C++17, STL, Différences Finies, EDP, Black-Scholes, SDL2, Algorithmique Numérique, POO</w:t>
+        <w:t>Domain : Quantitative Finance &amp; Scientific Computing</w:t>
+        <w:br/>
+        <w:t>Technologies : C++17, STL, Finite Differences, PDE, Black-Scholes, SDL2, OOP, Numerical Analysis</w:t>
       </w:r>
     </w:p>
     <w:p>
@@ -1796,12 +1545,12 @@
         <w:pStyle w:val="Heading2"/>
       </w:pPr>
       <w:r>
-        <w:t>Synthèse Exécutive :</w:t>
+        <w:t>French Executive Summary (Synthèse) :</w:t>
       </w:r>
     </w:p>
     <w:p>
       <w:r>
-        <w:t>Développement en C++ moderne d'un moteur de pricing d'options européennes résolvant l'équation aux dérivées partielles de Black-Scholes par schéma implicite/explicite aux différences finies, avec rendu visuel SDL2.</w:t>
+        <w:t>Développement from scratch en C++17 d'un moteur de pricing d'options européennes résolvant l'EDP de Black-Scholes par schéma implicite/explicite aux différences finies, avec calcul des Grecs et interface graphique temps réel SDL2.</w:t>
       </w:r>
     </w:p>
     <w:p>
@@ -1809,23 +1558,20 @@
         <w:pStyle w:val="Heading2"/>
       </w:pPr>
       <w:r>
-        <w:t>Réalisations Clés &amp; Résultats (Format STAR) :</w:t>
+        <w:t>English Project Overview :</w:t>
       </w:r>
     </w:p>
     <w:p>
-      <w:pPr>
-        <w:pStyle w:val="ListBullet"/>
-      </w:pPr>
       <w:r>
-        <w:t>Implémentation orientée objet (C++17) d'un solveur numérique pour l'EDP de Black-Scholes par méthode des différences finies (schémas implicite et explicite).</w:t>
+        <w:t>Engineered an object-oriented C++17 numerical solver for European option pricing solving the Black-Scholes PDE via finite difference schemes with Greeks sensitivity calculations and real-time SDL2 graphics.</w:t>
       </w:r>
     </w:p>
     <w:p>
       <w:pPr>
-        <w:pStyle w:val="ListBullet"/>
+        <w:pStyle w:val="Heading2"/>
       </w:pPr>
       <w:r>
-        <w:t>Calcul dynamique des prix de Call/Put et des sensibilités financières (Grecs), avec convergence et analyse des erreurs résiduelles.</w:t>
+        <w:t>Key Technical Results (STAR Format) :</w:t>
       </w:r>
     </w:p>
     <w:p>
@@ -1833,15 +1579,15 @@
         <w:pStyle w:val="ListBullet"/>
       </w:pPr>
       <w:r>
-        <w:t>Développement d'une interface graphique interactive temps réel avec la bibliothèque SDL2 pour tracer l'évolution temporelle des surfaces de prix.</w:t>
+        <w:t>Engineered an object-oriented C++17 numerical solver for the Black-Scholes PDE using explicit and implicit finite-difference schemes.</w:t>
       </w:r>
     </w:p>
     <w:p>
       <w:pPr>
-        <w:pStyle w:val="Heading2"/>
+        <w:pStyle w:val="ListBullet"/>
       </w:pPr>
       <w:r>
-        <w:t>Livrables &amp; Justificatifs Associés :</w:t>
+        <w:t>Computed Call/Put pricing matrices and Greeks sensitivities with rigorous stability and residual error convergence analysis.</w:t>
       </w:r>
     </w:p>
     <w:p>
@@ -1849,7 +1595,55 @@
         <w:pStyle w:val="ListBullet"/>
       </w:pPr>
       <w:r>
-        <w:t>Rapport technique disponible : reports/Rapport_Black_Scholes.pdf</w:t>
+        <w:t>Integrated real-time interactive graphic rendering of option payoff curves using the SDL2 library.</w:t>
+      </w:r>
+    </w:p>
+    <w:p>
+      <w:pPr>
+        <w:pStyle w:val="Heading2"/>
+      </w:pPr>
+      <w:r>
+        <w:t>Verified Deliverables &amp; Evidence :</w:t>
+      </w:r>
+    </w:p>
+    <w:p>
+      <w:pPr>
+        <w:pStyle w:val="ListBullet"/>
+      </w:pPr>
+      <w:r>
+        <w:t>Technical Paper / Thesis : reports/Rapport_Black_Scholes.pdf</w:t>
+      </w:r>
+    </w:p>
+    <w:p>
+      <w:pPr>
+        <w:pStyle w:val="ListBullet"/>
+      </w:pPr>
+      <w:r>
+        <w:t>System Architecture Diagram : visuals/call.png</w:t>
+      </w:r>
+    </w:p>
+    <w:p>
+      <w:pPr>
+        <w:pStyle w:val="ListBullet"/>
+      </w:pPr>
+      <w:r>
+        <w:t>System Architecture Diagram : visuals/Put.png</w:t>
+      </w:r>
+    </w:p>
+    <w:p>
+      <w:pPr>
+        <w:pStyle w:val="ListBullet"/>
+      </w:pPr>
+      <w:r>
+        <w:t>System Architecture Diagram : visuals/erreur call.png</w:t>
+      </w:r>
+    </w:p>
+    <w:p>
+      <w:pPr>
+        <w:pStyle w:val="ListBullet"/>
+      </w:pPr>
+      <w:r>
+        <w:t>System Architecture Diagram : visuals/UML.png</w:t>
       </w:r>
     </w:p>
     <w:p/>
@@ -1858,20 +1652,22 @@
         <w:pStyle w:val="Heading1"/>
       </w:pPr>
       <w:r>
-        <w:t>7. Modélisation Statistique &amp; Prédiction de Survie du Cancer du Sein (METABRIC)</w:t>
+        <w:t>7. Biostatistical Survival &amp; Recurrence Modeling on METABRIC Cohort Data</w:t>
       </w:r>
     </w:p>
     <w:p>
       <w:r>
         <w:rPr>
           <w:i/>
-          <w:sz w:val="20"/>
+          <w:sz w:val="19"/>
         </w:rPr>
-        <w:t>Contexte : ENSIIE (2A MERR) (2024-2025) | Rôle : Biostatistician &amp; Data Scientist</w:t>
+        <w:t>Academic Context : ENSIIE (2A MERR) (2024-2025) | Degree : ENSIIE</w:t>
         <w:br/>
-        <w:t>Domaine : Biostatistics &amp; Machine Learning</w:t>
+        <w:t>Role : Biostatistician &amp; Data Scientist</w:t>
         <w:br/>
-        <w:t>Technologies : R, RMarkdown, GLM, Régression Logistique, Lasso, Ridge, Elastic Net, Sélection de Variables, Courbes ROC</w:t>
+        <w:t>Domain : Biostatistics &amp; Machine Learning</w:t>
+        <w:br/>
+        <w:t>Technologies : R, RMarkdown, GLM, Logistic Regression, Lasso, Ridge, Elastic Net, Variable Selection, ROC-AUC</w:t>
       </w:r>
     </w:p>
     <w:p>
@@ -1879,12 +1675,12 @@
         <w:pStyle w:val="Heading2"/>
       </w:pPr>
       <w:r>
-        <w:t>Synthèse Exécutive :</w:t>
+        <w:t>French Executive Summary (Synthèse) :</w:t>
       </w:r>
     </w:p>
     <w:p>
       <w:r>
-        <w:t>Étude biostatistique et modélisation binomiale de la survie à 5 ans de patientes atteintes de cancer du sein à partir de données cliniques et d'expression génomique (cohorte METABRIC).</w:t>
+        <w:t>Modélisation binomiale de la survie à 5 ans de patientes atteintes de cancer du sein à partir de données cliniques et d'expression génomique haute dimension (cohorte METABRIC de 2 000+ patientes).</w:t>
       </w:r>
     </w:p>
     <w:p>
@@ -1892,23 +1688,20 @@
         <w:pStyle w:val="Heading2"/>
       </w:pPr>
       <w:r>
-        <w:t>Réalisations Clés &amp; Résultats (Format STAR) :</w:t>
+        <w:t>English Project Overview :</w:t>
       </w:r>
     </w:p>
     <w:p>
-      <w:pPr>
-        <w:pStyle w:val="ListBullet"/>
-      </w:pPr>
       <w:r>
-        <w:t>Exploration et prétraitement de données génomiques et cliniques haute dimension (cohorte METABRIC de 2000+ patientes).</w:t>
+        <w:t>Biostatistical classification of 5-year patient survival utilizing high-dimensional clinical and genomic expression profiles from the 2,000+ patient METABRIC cohort.</w:t>
       </w:r>
     </w:p>
     <w:p>
       <w:pPr>
-        <w:pStyle w:val="ListBullet"/>
+        <w:pStyle w:val="Heading2"/>
       </w:pPr>
       <w:r>
-        <w:t>Ajustement de modèles linéaires généralisés (GLM binomial) et sélection parcimonieuse de covariables (AIC/BIC, régularisation Lasso/Elastic Net).</w:t>
+        <w:t>Key Technical Results (STAR Format) :</w:t>
       </w:r>
     </w:p>
     <w:p>
@@ -1916,15 +1709,15 @@
         <w:pStyle w:val="ListBullet"/>
       </w:pPr>
       <w:r>
-        <w:t>Évaluation rigoureuse des performances prédictives via courbes ROC-AUC, matrice de confusion et validation croisée.</w:t>
+        <w:t>Curated and preprocessed high-dimensional clinical and gene expression features from the 2,000+ patient METABRIC cohort.</w:t>
       </w:r>
     </w:p>
     <w:p>
       <w:pPr>
-        <w:pStyle w:val="Heading2"/>
+        <w:pStyle w:val="ListBullet"/>
       </w:pPr>
       <w:r>
-        <w:t>Livrables &amp; Justificatifs Associés :</w:t>
+        <w:t>Fitted binomial Generalized Linear Models (GLM) with penalized variable selection (Lasso, Elastic Net, Stepwise AIC/BIC).</w:t>
       </w:r>
     </w:p>
     <w:p>
@@ -1932,7 +1725,23 @@
         <w:pStyle w:val="ListBullet"/>
       </w:pPr>
       <w:r>
-        <w:t>Rapport technique disponible : reports/Rapport_Cancer_Survie_MERR.pdf</w:t>
+        <w:t>Evaluated classification performance through cross-validated ROC-AUC analysis, sensitivity/specificity tradeoffs, and calibration.</w:t>
+      </w:r>
+    </w:p>
+    <w:p>
+      <w:pPr>
+        <w:pStyle w:val="Heading2"/>
+      </w:pPr>
+      <w:r>
+        <w:t>Verified Deliverables &amp; Evidence :</w:t>
+      </w:r>
+    </w:p>
+    <w:p>
+      <w:pPr>
+        <w:pStyle w:val="ListBullet"/>
+      </w:pPr>
+      <w:r>
+        <w:t>Technical Paper / Thesis : reports/Rapport_Cancer_Survie_MERR.pdf</w:t>
       </w:r>
     </w:p>
     <w:p/>
@@ -1941,18 +1750,20 @@
         <w:pStyle w:val="Heading1"/>
       </w:pPr>
       <w:r>
-        <w:t>8. Analyse Factorielle &amp; Clustering sur le Marché Airbnb New York City</w:t>
+        <w:t>8. Multivariate Analysis &amp; Unsupervised Clustering of Airbnb NYC Listings</w:t>
       </w:r>
     </w:p>
     <w:p>
       <w:r>
         <w:rPr>
           <w:i/>
-          <w:sz w:val="20"/>
+          <w:sz w:val="19"/>
         </w:rPr>
-        <w:t>Contexte : ENSIIE (2A ANDO) (2024-2025) | Rôle : Data Analyst / ML</w:t>
+        <w:t>Academic Context : ENSIIE (2A ANDO) (2024-2025) | Degree : ENSIIE</w:t>
         <w:br/>
-        <w:t>Domaine : Unsupervised Learning &amp; Data Analysis</w:t>
+        <w:t>Role : Data Analyst / ML</w:t>
+        <w:br/>
+        <w:t>Domain : Unsupervised Learning &amp; Data Analysis</w:t>
         <w:br/>
         <w:t>Technologies : Python, Scikit-Learn, Pandas, Matplotlib, Seaborn, ACP (PCA), ACC (CCA), K-Means, Clustering Hiérarchique</w:t>
       </w:r>
@@ -1962,12 +1773,12 @@
         <w:pStyle w:val="Heading2"/>
       </w:pPr>
       <w:r>
-        <w:t>Synthèse Exécutive :</w:t>
+        <w:t>French Executive Summary (Synthèse) :</w:t>
       </w:r>
     </w:p>
     <w:p>
       <w:r>
-        <w:t>Analyse multidimensionnelle et segmentation du marché locatif new-yorkais (48 000+ logements) par ACP, analyse canonique des corrélations (ACC) et clustering K-Means.</w:t>
+        <w:t>Analyse multidimensionnelle et segmentation du marché locatif new-yorkais (48 000+ logements) par ACP, analyse canonique des corrélations (ACC) et clustering K-Means / CAH.</w:t>
       </w:r>
     </w:p>
     <w:p>
@@ -1975,23 +1786,20 @@
         <w:pStyle w:val="Heading2"/>
       </w:pPr>
       <w:r>
-        <w:t>Réalisations Clés &amp; Résultats (Format STAR) :</w:t>
+        <w:t>English Project Overview :</w:t>
       </w:r>
     </w:p>
     <w:p>
-      <w:pPr>
-        <w:pStyle w:val="ListBullet"/>
-      </w:pPr>
       <w:r>
-        <w:t>Traitement et analyse exploratoire de 48 000+ observations du marché Airbnb New York.</w:t>
+        <w:t>Multivariate exploratory analysis and market segmentation of 48,000+ NYC Airbnb listings using PCA, Canonical Correlation Analysis, and K-Means clustering.</w:t>
       </w:r>
     </w:p>
     <w:p>
       <w:pPr>
-        <w:pStyle w:val="ListBullet"/>
+        <w:pStyle w:val="Heading2"/>
       </w:pPr>
       <w:r>
-        <w:t>Réduction de dimensionnalité via Analyse en Composantes Principales (ACP) et analyse des relations multidimensionnelles par ACC.</w:t>
+        <w:t>Key Technical Results (STAR Format) :</w:t>
       </w:r>
     </w:p>
     <w:p>
@@ -1999,15 +1807,15 @@
         <w:pStyle w:val="ListBullet"/>
       </w:pPr>
       <w:r>
-        <w:t>Segmentation des logements et des quartiers par K-Means et Classification Ascendante Hiérarchique (CAH) avec soutenance et rapport.</w:t>
+        <w:t>Processed and cleaned 48,000+ rental listings from the New York City Airbnb open dataset.</w:t>
       </w:r>
     </w:p>
     <w:p>
       <w:pPr>
-        <w:pStyle w:val="Heading2"/>
+        <w:pStyle w:val="ListBullet"/>
       </w:pPr>
       <w:r>
-        <w:t>Livrables &amp; Justificatifs Associés :</w:t>
+        <w:t>Conducted dimensionality reduction with Principal Component Analysis (PCA) and multivariate correlation mapping with CCA.</w:t>
       </w:r>
     </w:p>
     <w:p>
@@ -2015,15 +1823,15 @@
         <w:pStyle w:val="ListBullet"/>
       </w:pPr>
       <w:r>
-        <w:t>Rapport technique disponible : reports/Rapport_Analyse_Donnees_ANDO.pdf</w:t>
+        <w:t>Segmented listings and neighborhood pricing profiles via K-Means and Hierarchical Clustering, presenting insights with 2 slide decks.</w:t>
       </w:r>
     </w:p>
     <w:p>
       <w:pPr>
-        <w:pStyle w:val="ListBullet"/>
+        <w:pStyle w:val="Heading2"/>
       </w:pPr>
       <w:r>
-        <w:t>Présentation / Soutenance : presentations/Presentation_Partie_1.pdf</w:t>
+        <w:t>Verified Deliverables &amp; Evidence :</w:t>
       </w:r>
     </w:p>
     <w:p>
@@ -2031,7 +1839,23 @@
         <w:pStyle w:val="ListBullet"/>
       </w:pPr>
       <w:r>
-        <w:t>Présentation / Soutenance : presentations/Presentation_Partie_2.pdf</w:t>
+        <w:t>Technical Paper / Thesis : reports/Rapport_Analyse_Donnees_ANDO.pdf</w:t>
+      </w:r>
+    </w:p>
+    <w:p>
+      <w:pPr>
+        <w:pStyle w:val="ListBullet"/>
+      </w:pPr>
+      <w:r>
+        <w:t>Presentation Deck : presentations/Presentation_Partie_1.pdf</w:t>
+      </w:r>
+    </w:p>
+    <w:p>
+      <w:pPr>
+        <w:pStyle w:val="ListBullet"/>
+      </w:pPr>
+      <w:r>
+        <w:t>Presentation Deck : presentations/Presentation_Partie_2.pdf</w:t>
       </w:r>
     </w:p>
     <w:p/>
@@ -2040,20 +1864,22 @@
         <w:pStyle w:val="Heading1"/>
       </w:pPr>
       <w:r>
-        <w:t>9. Machine Learning Appliqué à l'Économétrie des Salaires (Wage Data)</w:t>
+        <w:t>9. Nash-DQN: Deep Q-Learning for Nash Equilibria in Multi-Agent Optimal Execution</w:t>
       </w:r>
     </w:p>
     <w:p>
       <w:r>
         <w:rPr>
           <w:i/>
-          <w:sz w:val="20"/>
+          <w:sz w:val="19"/>
         </w:rPr>
-        <w:t>Contexte : DAMI / Économie (2025-2026) | Rôle : Quantitative Researcher</w:t>
+        <w:t>Academic Context : McMaster University (MATH 4FM3) (2026) | Degree : McMaster University Exchange</w:t>
         <w:br/>
-        <w:t>Domaine : Econometrics &amp; Statistical Learning</w:t>
+        <w:t>Role : Quantitative Researcher / RL Engineer</w:t>
         <w:br/>
-        <w:t>Technologies : R, RMarkdown, ISLR2, Glmnet, Régression Polynomiale, Cross-Validation, Lasso, Ridge</w:t>
+        <w:t>Domain : Quantitative Finance &amp; Reinforcement Learning</w:t>
+        <w:br/>
+        <w:t>Technologies : Python, PyTorch, Deep Q-Learning (DQN), Multi-Agent RL, Stochastic Games, Optimal Execution, Mouvement Brownien</w:t>
       </w:r>
     </w:p>
     <w:p>
@@ -2061,12 +1887,12 @@
         <w:pStyle w:val="Heading2"/>
       </w:pPr>
       <w:r>
-        <w:t>Synthèse Exécutive :</w:t>
+        <w:t>French Executive Summary (Synthèse) :</w:t>
       </w:r>
     </w:p>
     <w:p>
       <w:r>
-        <w:t>Modélisation de dynamiques salariales par régression polynomiale, sélection de sous-ensembles de variables et régularisation Lasso/Ridge avec validation croisée.</w:t>
+        <w:t>Implémentation sous PyTorch d'un environnement de jeu stochastique à N agents (Casgrain, Ning &amp; Jaimungal, 2022) et entraînement d'architectures Deep Q-Network (Nash-DQN) pour converger vers l'équilibre de Nash en exécution optimale d'ordres.</w:t>
       </w:r>
     </w:p>
     <w:p>
@@ -2074,23 +1900,20 @@
         <w:pStyle w:val="Heading2"/>
       </w:pPr>
       <w:r>
-        <w:t>Réalisations Clés &amp; Résultats (Format STAR) :</w:t>
+        <w:t>English Project Overview :</w:t>
       </w:r>
     </w:p>
     <w:p>
-      <w:pPr>
-        <w:pStyle w:val="ListBullet"/>
-      </w:pPr>
       <w:r>
-        <w:t>Modélisation prédictive des salaires à l'aide de régressions polynomiales d'ordres croissants et sélection par validation croisée.</w:t>
+        <w:t>Engineered an N-agent stochastic market simulator and trained Deep Q-Networks (Nash-DQN) converging to Nash equilibrium for multi-agent optimal liquidation (Casgrain, Ning &amp; Jaimungal, 2022).</w:t>
       </w:r>
     </w:p>
     <w:p>
       <w:pPr>
-        <w:pStyle w:val="ListBullet"/>
+        <w:pStyle w:val="Heading2"/>
       </w:pPr>
       <w:r>
-        <w:t>Application de techniques de régularisation (Lasso et Ridge) pour isoler les facteurs d'impact économiques prépondérants.</w:t>
+        <w:t>Key Technical Results (STAR Format) :</w:t>
       </w:r>
     </w:p>
     <w:p>
@@ -2098,15 +1921,15 @@
         <w:pStyle w:val="ListBullet"/>
       </w:pPr>
       <w:r>
-        <w:t>Génération d'un rapport académique complet compilé sous RMarkdown.</w:t>
+        <w:t>Architected an N-agent stochastic differential game environment modeling temporary and permanent market price impact.</w:t>
       </w:r>
     </w:p>
     <w:p>
       <w:pPr>
-        <w:pStyle w:val="Heading2"/>
+        <w:pStyle w:val="ListBullet"/>
       </w:pPr>
       <w:r>
-        <w:t>Livrables &amp; Justificatifs Associés :</w:t>
+        <w:t>Trained a Nash-DQN multi-agent reinforcement learning policy with experience replay to discover competitive Nash equilibrium strategies.</w:t>
       </w:r>
     </w:p>
     <w:p>
@@ -2114,7 +1937,47 @@
         <w:pStyle w:val="ListBullet"/>
       </w:pPr>
       <w:r>
-        <w:t>Rapport technique disponible : reports/Rapport_ML_Econometrics.pdf</w:t>
+        <w:t>Authored a comprehensive 34-page quantitative research paper with extensive trajectory and convergence reward diagnostics.</w:t>
+      </w:r>
+    </w:p>
+    <w:p>
+      <w:pPr>
+        <w:pStyle w:val="Heading2"/>
+      </w:pPr>
+      <w:r>
+        <w:t>Verified Deliverables &amp; Evidence :</w:t>
+      </w:r>
+    </w:p>
+    <w:p>
+      <w:pPr>
+        <w:pStyle w:val="ListBullet"/>
+      </w:pPr>
+      <w:r>
+        <w:t>Technical Paper / Thesis : reports/Rapport_Nash_DQN_Optimal_Trading.pdf</w:t>
+      </w:r>
+    </w:p>
+    <w:p>
+      <w:pPr>
+        <w:pStyle w:val="ListBullet"/>
+      </w:pPr>
+      <w:r>
+        <w:t>Technical Paper / Thesis : reports/Project_Roadmap.pdf</w:t>
+      </w:r>
+    </w:p>
+    <w:p>
+      <w:pPr>
+        <w:pStyle w:val="ListBullet"/>
+      </w:pPr>
+      <w:r>
+        <w:t>System Architecture Diagram : visuals/brownian_paths.png</w:t>
+      </w:r>
+    </w:p>
+    <w:p>
+      <w:pPr>
+        <w:pStyle w:val="ListBullet"/>
+      </w:pPr>
+      <w:r>
+        <w:t>System Architecture Diagram : visuals/all_agents_rewards.png</w:t>
       </w:r>
     </w:p>
     <w:p/>
@@ -2123,20 +1986,22 @@
         <w:pStyle w:val="Heading1"/>
       </w:pPr>
       <w:r>
-        <w:t>10. Moteur de Traitement d'Images Bas Niveau en C (LUT, Convolutions, Filtres)</w:t>
+        <w:t>10. Financial News Sentiment Classification: Classical ML vs Bidirectional LSTM</w:t>
       </w:r>
     </w:p>
     <w:p>
       <w:r>
         <w:rPr>
           <w:i/>
-          <w:sz w:val="20"/>
+          <w:sz w:val="19"/>
         </w:rPr>
-        <w:t>Contexte : ENSIIE (1A PRIM) (2023-2024) | Rôle : Systems Software Developer</w:t>
+        <w:t>Academic Context : McMaster University (DATASCI 3ML3) (2026) | Degree : McMaster University Exchange</w:t>
         <w:br/>
-        <w:t>Domaine : Systems &amp; Computer Vision</w:t>
+        <w:t>Role : NLP &amp; Machine Learning Engineer</w:t>
         <w:br/>
-        <w:t>Technologies : C, Make, Algorithmique Bas Niveau, Gestion Mémoire, Convolutions 2D, LUT, Format PGM/PPM</w:t>
+        <w:t>Domain : NLP &amp; Financial Deep Learning</w:t>
+        <w:br/>
+        <w:t>Technologies : Python, PyTorch, BiLSTM, TF-IDF, Scikit-Learn, NLP, Financial Sentiment, Cross-Validation</w:t>
       </w:r>
     </w:p>
     <w:p>
@@ -2144,12 +2009,12 @@
         <w:pStyle w:val="Heading2"/>
       </w:pPr>
       <w:r>
-        <w:t>Synthèse Exécutive :</w:t>
+        <w:t>French Executive Summary (Synthèse) :</w:t>
       </w:r>
     </w:p>
     <w:p>
       <w:r>
-        <w:t>Développement from scratch en langage C pur d'un moteur de manipulation et filtrage d'images numériques sans bibliothèque externe (matrices de convolution, égalisation LUT, Sobel, flou gaussien).</w:t>
+        <w:t>Benchmark comparatif de modèles de classification de sentiments sur 9 549 titres d'actualité financière (Financial PhraseBank) comparant modèles classiques (SVM, Random Forest) et réseaux neuronaux récurrents bidirectionnels (BiLSTM).</w:t>
       </w:r>
     </w:p>
     <w:p>
@@ -2157,23 +2022,20 @@
         <w:pStyle w:val="Heading2"/>
       </w:pPr>
       <w:r>
-        <w:t>Réalisations Clés &amp; Résultats (Format STAR) :</w:t>
+        <w:t>English Project Overview :</w:t>
       </w:r>
     </w:p>
     <w:p>
-      <w:pPr>
-        <w:pStyle w:val="ListBullet"/>
-      </w:pPr>
       <w:r>
-        <w:t>Conception d'une bibliothèque modulaire en C pour la lecture, manipulation et sauvegarde de formats d'images matricielles PGM/PPM.</w:t>
+        <w:t>Comparative benchmark for 3-class sentiment classification across 9,549 financial headlines comparing classical machine learning with Bidirectional LSTMs in PyTorch.</w:t>
       </w:r>
     </w:p>
     <w:p>
       <w:pPr>
-        <w:pStyle w:val="ListBullet"/>
+        <w:pStyle w:val="Heading2"/>
       </w:pPr>
       <w:r>
-        <w:t>Implémentation d'algorithmes de transformation de contraste par Look-Up Table (LUT) et filtres spatiaux par produit de convolution (Sobel, Gaussien).</w:t>
+        <w:t>Key Technical Results (STAR Format) :</w:t>
       </w:r>
     </w:p>
     <w:p>
@@ -2181,15 +2043,15 @@
         <w:pStyle w:val="ListBullet"/>
       </w:pPr>
       <w:r>
-        <w:t>Gestion rigoureuse des pointeurs et allocations dynamiques sans fuite mémoire (validation Valgrind) avec rapport technique.</w:t>
+        <w:t>Curated and preprocessed 9,549 financial news headlines addressing class imbalance and specialized financial vocabularies.</w:t>
       </w:r>
     </w:p>
     <w:p>
       <w:pPr>
-        <w:pStyle w:val="Heading2"/>
+        <w:pStyle w:val="ListBullet"/>
       </w:pPr>
       <w:r>
-        <w:t>Livrables &amp; Justificatifs Associés :</w:t>
+        <w:t>Implemented and trained a Bidirectional LSTM neural network in PyTorch achieving superior accuracy and macro F1 over classical baselines.</w:t>
       </w:r>
     </w:p>
     <w:p>
@@ -2197,7 +2059,31 @@
         <w:pStyle w:val="ListBullet"/>
       </w:pPr>
       <w:r>
-        <w:t>Rapport technique disponible : reports/Rapport_Projet_PRIM.pdf</w:t>
+        <w:t>Authored an 11-page comparative research paper detailing convergence dynamics, confusion matrices, and ablation findings.</w:t>
+      </w:r>
+    </w:p>
+    <w:p>
+      <w:pPr>
+        <w:pStyle w:val="Heading2"/>
+      </w:pPr>
+      <w:r>
+        <w:t>Verified Deliverables &amp; Evidence :</w:t>
+      </w:r>
+    </w:p>
+    <w:p>
+      <w:pPr>
+        <w:pStyle w:val="ListBullet"/>
+      </w:pPr>
+      <w:r>
+        <w:t>Technical Paper / Thesis : reports/Financial_News_Sentiment_Report.pdf</w:t>
+      </w:r>
+    </w:p>
+    <w:p>
+      <w:pPr>
+        <w:pStyle w:val="ListBullet"/>
+      </w:pPr>
+      <w:r>
+        <w:t>Technical Paper / Thesis : reports/Sujet_Projet.pdf</w:t>
       </w:r>
     </w:p>
     <w:p/>
@@ -2206,20 +2092,22 @@
         <w:pStyle w:val="Heading1"/>
       </w:pPr>
       <w:r>
-        <w:t>11. Projet d'Algorithmique &amp; Programmation Fonctionnelle en OCaml</w:t>
+        <w:t>11. Seasonal Demand Forecasting in Canadian Retail Trade (1992–2019)</w:t>
       </w:r>
     </w:p>
     <w:p>
       <w:r>
         <w:rPr>
           <w:i/>
-          <w:sz w:val="20"/>
+          <w:sz w:val="19"/>
         </w:rPr>
-        <w:t>Contexte : ENSIIE (1A OCaml) (2023-2024) | Rôle : Software Developer</w:t>
+        <w:t>Academic Context : McMaster University (STATS 4A03) (2026) | Degree : McMaster University Exchange</w:t>
         <w:br/>
-        <w:t>Domaine : Programming Languages &amp; Algorithms</w:t>
+        <w:t>Role : Time Series Analyst</w:t>
         <w:br/>
-        <w:t>Technologies : OCaml, Programmation Fonctionnelle, Types Algébriques, Pattern Matching, Recursion, Make</w:t>
+        <w:t>Domain : Time Series &amp; Applied Econometrics</w:t>
+        <w:br/>
+        <w:t>Technologies : R, RMarkdown, SARIMA, Holt-Winters, Décomposition STL, Tests de Stationnarité (ADF/KPSS), Validation Croisée</w:t>
       </w:r>
     </w:p>
     <w:p>
@@ -2227,12 +2115,12 @@
         <w:pStyle w:val="Heading2"/>
       </w:pPr>
       <w:r>
-        <w:t>Synthèse Exécutive :</w:t>
+        <w:t>French Executive Summary (Synthèse) :</w:t>
       </w:r>
     </w:p>
     <w:p>
       <w:r>
-        <w:t>Implémentation d'algorithmes complexes et structures de données récursives en OCaml mettant à profit le système de types statique et le filtrage par motif.</w:t>
+        <w:t>Modélisation économétrique et prévision de séries temporelles sur 27 ans de ventes mensuelles du commerce de détail canadien par décomposition STL, lissage exponentiel Holt-Winters et modèles SARIMA multiplicatifs.</w:t>
       </w:r>
     </w:p>
     <w:p>
@@ -2240,23 +2128,20 @@
         <w:pStyle w:val="Heading2"/>
       </w:pPr>
       <w:r>
-        <w:t>Réalisations Clés &amp; Résultats (Format STAR) :</w:t>
+        <w:t>English Project Overview :</w:t>
       </w:r>
     </w:p>
     <w:p>
-      <w:pPr>
-        <w:pStyle w:val="ListBullet"/>
-      </w:pPr>
       <w:r>
-        <w:t>Résolution de problématiques algorithmiques par paradigme fonctionnel pur en OCaml.</w:t>
+        <w:t>Econometric modeling and 27-year time series forecasting of monthly Canadian retail sales data using STL decomposition, Holt-Winters exponential smoothing, and SARIMA models.</w:t>
       </w:r>
     </w:p>
     <w:p>
       <w:pPr>
-        <w:pStyle w:val="ListBullet"/>
+        <w:pStyle w:val="Heading2"/>
       </w:pPr>
       <w:r>
-        <w:t>Conception de types de données algébriques expressifs et fonctions d'ordre supérieur.</w:t>
+        <w:t>Key Technical Results (STAR Format) :</w:t>
       </w:r>
     </w:p>
     <w:p>
@@ -2264,15 +2149,15 @@
         <w:pStyle w:val="ListBullet"/>
       </w:pPr>
       <w:r>
-        <w:t>Rédaction d'une suite de tests unitaires et d'un rapport technique explicatif.</w:t>
+        <w:t>Conducted stationarity diagnostics (ADF, KPSS tests) and seasonal decomposition on a 27-year macroeconomic time series.</w:t>
       </w:r>
     </w:p>
     <w:p>
       <w:pPr>
-        <w:pStyle w:val="Heading2"/>
+        <w:pStyle w:val="ListBullet"/>
       </w:pPr>
       <w:r>
-        <w:t>Livrables &amp; Justificatifs Associés :</w:t>
+        <w:t>Identified and tuned multiplicative SARIMA models validating residual white noise assumptions via Ljung-Box tests.</w:t>
       </w:r>
     </w:p>
     <w:p>
@@ -2280,7 +2165,23 @@
         <w:pStyle w:val="ListBullet"/>
       </w:pPr>
       <w:r>
-        <w:t>Rapport technique disponible : reports/Rapport_Projet_OCaml.pdf</w:t>
+        <w:t>Delivered a reproducible 12-page RMarkdown technical forecasting paper providing multi-step forward horizon projections.</w:t>
+      </w:r>
+    </w:p>
+    <w:p>
+      <w:pPr>
+        <w:pStyle w:val="Heading2"/>
+      </w:pPr>
+      <w:r>
+        <w:t>Verified Deliverables &amp; Evidence :</w:t>
+      </w:r>
+    </w:p>
+    <w:p>
+      <w:pPr>
+        <w:pStyle w:val="ListBullet"/>
+      </w:pPr>
+      <w:r>
+        <w:t>Technical Paper / Thesis : reports/Canadian_Retail_Time_Series_Report.pdf</w:t>
       </w:r>
     </w:p>
     <w:p/>
@@ -2289,20 +2190,22 @@
         <w:pStyle w:val="Heading1"/>
       </w:pPr>
       <w:r>
-        <w:t>12. Simulation Stochastique &amp; Modélisation Probabiliste de Jeu en C</w:t>
+        <w:t>12. Visual Question Answering (VQA): Multimodal Vision-Language Deep Learning</w:t>
       </w:r>
     </w:p>
     <w:p>
       <w:r>
         <w:rPr>
           <w:i/>
-          <w:sz w:val="20"/>
+          <w:sz w:val="19"/>
         </w:rPr>
-        <w:t>Contexte : ENSIIE (1A Math-Info) (2023-2024) | Rôle : Lead Simulation Developer</w:t>
+        <w:t>Academic Context : McMaster University (MECHENG 4AI3) (2026) | Degree : McMaster University Exchange</w:t>
         <w:br/>
-        <w:t>Domaine : Applied Probability &amp; Simulation</w:t>
+        <w:t>Role : Multimodal Deep Learning Engineer</w:t>
         <w:br/>
-        <w:t>Technologies : C, Monte-Carlo, Probabilités Appliquées, Gestion de Projet Gantt, Make, Simulation Stochastique</w:t>
+        <w:t>Domain : Multimodal Deep Learning &amp; Computer Vision</w:t>
+        <w:br/>
+        <w:t>Technologies : Python, PyTorch, Torchvision, CNN (ResNet), LSTM, Multimodal Fusion, VQA v2.0 Dataset, Streamlit</w:t>
       </w:r>
     </w:p>
     <w:p>
@@ -2310,12 +2213,12 @@
         <w:pStyle w:val="Heading2"/>
       </w:pPr>
       <w:r>
-        <w:t>Synthèse Exécutive :</w:t>
+        <w:t>French Executive Summary (Synthèse) :</w:t>
       </w:r>
     </w:p>
     <w:p>
       <w:r>
-        <w:t>Modélisation mathématique et simulation informatique multijoueur d'un jeu de stratégie en C, benchmarking de stratégies stochastiques par méthodes de Monte-Carlo.</w:t>
+        <w:t>Système de Question-Réponse Visuelle (VQA) entraîné sur le dataset VQA v2.0 associant extraction de caractéristiques visuelles par CNN (ResNet), encodage linguistique par LSTM et module de fusion multimodale.</w:t>
       </w:r>
     </w:p>
     <w:p>
@@ -2323,23 +2226,20 @@
         <w:pStyle w:val="Heading2"/>
       </w:pPr>
       <w:r>
-        <w:t>Réalisations Clés &amp; Résultats (Format STAR) :</w:t>
+        <w:t>English Project Overview :</w:t>
       </w:r>
     </w:p>
     <w:p>
-      <w:pPr>
-        <w:pStyle w:val="ListBullet"/>
-      </w:pPr>
       <w:r>
-        <w:t>Modélisation des états d'un jeu de stratégie complexe et implémentation modulaire en langage C.</w:t>
+        <w:t>Multimodal Visual Question Answering architecture on VQA v2.0 dataset fusing deep convolutional image features (ResNet) with LSTM question embeddings.</w:t>
       </w:r>
     </w:p>
     <w:p>
       <w:pPr>
-        <w:pStyle w:val="ListBullet"/>
+        <w:pStyle w:val="Heading2"/>
       </w:pPr>
       <w:r>
-        <w:t>Conception d'expériences de simulation stochastique à large échelle pour mesurer empiriquement les distributions de probabilité de victoire.</w:t>
+        <w:t>Key Technical Results (STAR Format) :</w:t>
       </w:r>
     </w:p>
     <w:p>
@@ -2347,15 +2247,15 @@
         <w:pStyle w:val="ListBullet"/>
       </w:pPr>
       <w:r>
-        <w:t>Pilotage de la planification agile avec diagramme de Gantt et rédaction d'un rapport d'expérimentation théorique.</w:t>
+        <w:t>Engineered multimodal data preprocessing and spatial visual alignment pipeline on the standard VQA v2.0 dataset.</w:t>
       </w:r>
     </w:p>
     <w:p>
       <w:pPr>
-        <w:pStyle w:val="Heading2"/>
+        <w:pStyle w:val="ListBullet"/>
       </w:pPr>
       <w:r>
-        <w:t>Livrables &amp; Justificatifs Associés :</w:t>
+        <w:t>Implemented multimodal fusion architectures combining deep visual representations with recurrent sentence encodings.</w:t>
       </w:r>
     </w:p>
     <w:p>
@@ -2363,7 +2263,23 @@
         <w:pStyle w:val="ListBullet"/>
       </w:pPr>
       <w:r>
-        <w:t>Rapport technique disponible : docs/Rapport_Experience_Probabiliste.pdf</w:t>
+        <w:t>Developed an interactive web application demo and structured sprint engineering roadmap.</w:t>
+      </w:r>
+    </w:p>
+    <w:p>
+      <w:pPr>
+        <w:pStyle w:val="Heading2"/>
+      </w:pPr>
+      <w:r>
+        <w:t>Verified Deliverables &amp; Evidence :</w:t>
+      </w:r>
+    </w:p>
+    <w:p>
+      <w:pPr>
+        <w:pStyle w:val="ListBullet"/>
+      </w:pPr>
+      <w:r>
+        <w:t>Technical Paper / Thesis : reports/VQA_Project_Roadmap.pdf</w:t>
       </w:r>
     </w:p>
     <w:p/>
@@ -2372,20 +2288,22 @@
         <w:pStyle w:val="Heading1"/>
       </w:pPr>
       <w:r>
-        <w:t>13. Formations &amp; Ateliers Pratiques en Machine Learning (Kryptosphere IA)</w:t>
+        <w:t>13. Applied Generalized Linear Models: Poisson, Gamma, and Logistic Regressions</w:t>
       </w:r>
     </w:p>
     <w:p>
       <w:r>
         <w:rPr>
           <w:i/>
-          <w:sz w:val="20"/>
+          <w:sz w:val="19"/>
         </w:rPr>
-        <w:t>Contexte : Association Kryptosphere IA ENSIIE (2024-2025) | Rôle : Formateur Technique IA</w:t>
+        <w:t>Academic Context : McMaster University (STATS 4GLM) (2026) | Degree : McMaster University Exchange</w:t>
         <w:br/>
-        <w:t>Domaine : AI Education &amp; Technical Leadership</w:t>
+        <w:t>Role : Applied Statistician</w:t>
         <w:br/>
-        <w:t>Technologies : Python, Jupyter, Scikit-Learn, Pandas, Matplotlib, Seaborn, Clustering, Séries Temporelles</w:t>
+        <w:t>Domain : Applied Statistics &amp; GLM</w:t>
+        <w:br/>
+        <w:t>Technologies : R, RMarkdown, GLM, Poisson Regression, Gamma Regression, Logistic Regression, Deviance Analysis, Overdispersion</w:t>
       </w:r>
     </w:p>
     <w:p>
@@ -2393,7 +2311,97 @@
         <w:pStyle w:val="Heading2"/>
       </w:pPr>
       <w:r>
-        <w:t>Synthèse Exécutive :</w:t>
+        <w:t>French Executive Summary (Synthèse) :</w:t>
+      </w:r>
+    </w:p>
+    <w:p>
+      <w:r>
+        <w:t>Suite d'études statistiques approfondies appliquant la théorie des modèles linéaires généralisés (famille exponentielle, fonctions de lien, quasi-vraisemblance) sur des problématiques réelles d'assurance et d'épidémiologie.</w:t>
+      </w:r>
+    </w:p>
+    <w:p>
+      <w:pPr>
+        <w:pStyle w:val="Heading2"/>
+      </w:pPr>
+      <w:r>
+        <w:t>English Project Overview :</w:t>
+      </w:r>
+    </w:p>
+    <w:p>
+      <w:r>
+        <w:t>Comprehensive statistical modeling assignments applying Generalized Linear Model theory (exponential dispersion family, link functions, quasi-likelihood) to actuarial and empirical datasets.</w:t>
+      </w:r>
+    </w:p>
+    <w:p>
+      <w:pPr>
+        <w:pStyle w:val="Heading2"/>
+      </w:pPr>
+      <w:r>
+        <w:t>Key Technical Results (STAR Format) :</w:t>
+      </w:r>
+    </w:p>
+    <w:p>
+      <w:pPr>
+        <w:pStyle w:val="ListBullet"/>
+      </w:pPr>
+      <w:r>
+        <w:t>Fitted Poisson and Quasi-Poisson GLMs for count data with diagnostics for overdispersion and zero inflation.</w:t>
+      </w:r>
+    </w:p>
+    <w:p>
+      <w:pPr>
+        <w:pStyle w:val="ListBullet"/>
+      </w:pPr>
+      <w:r>
+        <w:t>Modeled right-skewed continuous responses using Gamma GLMs with deviance goodness-of-fit hypothesis testing.</w:t>
+      </w:r>
+    </w:p>
+    <w:p>
+      <w:pPr>
+        <w:pStyle w:val="ListBullet"/>
+      </w:pPr>
+      <w:r>
+        <w:t>Authored 5 comprehensive reproducible RMarkdown statistical reports demonstrating deep mastery of statistical inference.</w:t>
+      </w:r>
+    </w:p>
+    <w:p>
+      <w:pPr>
+        <w:pStyle w:val="Heading2"/>
+      </w:pPr>
+      <w:r>
+        <w:t>Verified Deliverables &amp; Evidence :</w:t>
+      </w:r>
+    </w:p>
+    <w:p/>
+    <w:p>
+      <w:pPr>
+        <w:pStyle w:val="Heading1"/>
+      </w:pPr>
+      <w:r>
+        <w:t>14. Machine Learning &amp; AI Practical Workshops (Kryptosphere AI)</w:t>
+      </w:r>
+    </w:p>
+    <w:p>
+      <w:r>
+        <w:rPr>
+          <w:i/>
+          <w:sz w:val="19"/>
+        </w:rPr>
+        <w:t>Academic Context : Association Kryptosphere IA ENSIIE (2024-2025) | Degree : ENSIIE</w:t>
+        <w:br/>
+        <w:t>Role : Lead Technical AI Instructor</w:t>
+        <w:br/>
+        <w:t>Domain : AI Education &amp; Technical Leadership</w:t>
+        <w:br/>
+        <w:t>Technologies : Python, Jupyter, Scikit-Learn, Pandas, Matplotlib, Seaborn, Clustering, Time Series</w:t>
+      </w:r>
+    </w:p>
+    <w:p>
+      <w:pPr>
+        <w:pStyle w:val="Heading2"/>
+      </w:pPr>
+      <w:r>
+        <w:t>French Executive Summary (Synthèse) :</w:t>
       </w:r>
     </w:p>
     <w:p>
@@ -2406,23 +2414,20 @@
         <w:pStyle w:val="Heading2"/>
       </w:pPr>
       <w:r>
-        <w:t>Réalisations Clés &amp; Résultats (Format STAR) :</w:t>
+        <w:t>English Project Overview :</w:t>
       </w:r>
     </w:p>
     <w:p>
-      <w:pPr>
-        <w:pStyle w:val="ListBullet"/>
-      </w:pPr>
       <w:r>
-        <w:t>Conception de 4 supports de formation complets (slides PPTX/PDF et notebooks interactifs guidés).</w:t>
+        <w:t>Authored and delivered comprehensive hands-on Machine Learning workshops for student engineers: data preprocessing, model evaluation metrics, clustering, and time series.</w:t>
       </w:r>
     </w:p>
     <w:p>
       <w:pPr>
-        <w:pStyle w:val="ListBullet"/>
+        <w:pStyle w:val="Heading2"/>
       </w:pPr>
       <w:r>
-        <w:t>Animation d'ateliers techniques interactifs pour les étudiants de l'ENSIIE sur l'évaluation rigoureuse de modèles prédictifs et les algorithmes de clustering.</w:t>
+        <w:t>Key Technical Results (STAR Format) :</w:t>
       </w:r>
     </w:p>
     <w:p>
@@ -2430,15 +2435,15 @@
         <w:pStyle w:val="ListBullet"/>
       </w:pPr>
       <w:r>
-        <w:t>Vulgarisation de concepts mathématiques avancés (matrices de confusion, inertie intra-classe, stationnarité).</w:t>
+        <w:t>Authored 4 educational workshops consisting of presentation slide decks and interactive guided Jupyter notebooks.</w:t>
       </w:r>
     </w:p>
     <w:p>
       <w:pPr>
-        <w:pStyle w:val="Heading2"/>
+        <w:pStyle w:val="ListBullet"/>
       </w:pPr>
       <w:r>
-        <w:t>Livrables &amp; Justificatifs Associés :</w:t>
+        <w:t>Led hands-on training sessions for engineering students on predictive model validation and unsupervised clustering.</w:t>
       </w:r>
     </w:p>
     <w:p>
@@ -2446,15 +2451,31 @@
         <w:pStyle w:val="ListBullet"/>
       </w:pPr>
       <w:r>
-        <w:t>Présentation / Soutenance : presentations/Formation_Evaluation_Modeles_ML.pdf</w:t>
+        <w:t>Distilled advanced statistical concepts (confusion matrices, ROC curves, intra-cluster inertia, stationarity).</w:t>
       </w:r>
     </w:p>
     <w:p>
       <w:pPr>
+        <w:pStyle w:val="Heading2"/>
+      </w:pPr>
+      <w:r>
+        <w:t>Verified Deliverables &amp; Evidence :</w:t>
+      </w:r>
+    </w:p>
+    <w:p>
+      <w:pPr>
         <w:pStyle w:val="ListBullet"/>
       </w:pPr>
       <w:r>
-        <w:t>Présentation / Soutenance : presentations/Formation_Clustering.pdf</w:t>
+        <w:t>Presentation Deck : presentations/Formation_Evaluation_Modeles_ML.pdf</w:t>
+      </w:r>
+    </w:p>
+    <w:p>
+      <w:pPr>
+        <w:pStyle w:val="ListBullet"/>
+      </w:pPr>
+      <w:r>
+        <w:t>Presentation Deck : presentations/Formation_Clustering.pdf</w:t>
       </w:r>
     </w:p>
     <w:p/>
@@ -2463,20 +2484,22 @@
         <w:pStyle w:val="Heading1"/>
       </w:pPr>
       <w:r>
-        <w:t>14. Analyseur Syntaxique d'Expressions Mathématiques &amp; GUI JavaFX</w:t>
+        <w:t>15. Sorbonne 2025 Data Challenge: Malware Detection &amp; Multi-Label Classification via Control Flow Graphs (CFG) &amp; GNN</w:t>
       </w:r>
     </w:p>
     <w:p>
       <w:r>
         <w:rPr>
           <w:i/>
-          <w:sz w:val="20"/>
+          <w:sz w:val="19"/>
         </w:rPr>
-        <w:t>Contexte : ENSIIE (1A OOP Java) (2023-2024) | Rôle : Software Engineer</w:t>
+        <w:t>Academic Context : Université Paris 1 Panthéon-Sorbonne x ComCyber (Ministère de l'Intérieur) x Gendarmerie Nationale (CNENUM) (2025) | Degree : ENSIIE &amp; Université Paris-Saclay (Master 2 IA)</w:t>
         <w:br/>
-        <w:t>Domaine : Software Engineering &amp; OOP Design Patterns</w:t>
+        <w:t>Role : Lead Data Scientist &amp; AI Security Researcher</w:t>
         <w:br/>
-        <w:t>Technologies : Java, JavaFX, Design Patterns, AST, Parser, JUnit, Logging</w:t>
+        <w:t>Domain : Cybersecurity AI, Graph Neural Networks &amp; Reverse Engineering</w:t>
+        <w:br/>
+        <w:t>Technologies : Python, NetworkX, Graph Neural Networks (GNN), Asm2Vec, Scikit-Learn, MultiOutputClassifier, Random Forest, Multiprocessing, Control Flow Graphs, x86/x64 Assembly, Pandas, Macro F1</w:t>
       </w:r>
     </w:p>
     <w:p>
@@ -2484,12 +2507,12 @@
         <w:pStyle w:val="Heading2"/>
       </w:pPr>
       <w:r>
-        <w:t>Synthèse Exécutive :</w:t>
+        <w:t>French Executive Summary (Synthèse) :</w:t>
       </w:r>
     </w:p>
     <w:p>
       <w:r>
-        <w:t>Conception d'un analyseur d'expressions mathématiques avec arbre syntaxique abstrait (AST) et interface graphique interactive en JavaFX appliquant les patrons de conception (Factory, Composite, Visitor).</w:t>
+        <w:t>Participation au Data Challenge national organisé par Paris 1 Panthéon-Sorbonne, le ComCyber et le CNENUM (Gendarmerie Nationale) pour la classification comportementale de 20 000 binaires Windows. Conception d'un pipeline d'extraction parallèle de topologies de graphes (CFG avec NetworkX) et d'opcodes assembleur x86, couplé à une modélisation multi-label optimisée au Macro F1.</w:t>
       </w:r>
     </w:p>
     <w:p>
@@ -2497,69 +2520,12 @@
         <w:pStyle w:val="Heading2"/>
       </w:pPr>
       <w:r>
-        <w:t>Réalisations Clés &amp; Résultats (Format STAR) :</w:t>
-      </w:r>
-    </w:p>
-    <w:p>
-      <w:pPr>
-        <w:pStyle w:val="ListBullet"/>
-      </w:pPr>
-      <w:r>
-        <w:t>Implémentation robuste d'un parser d'expressions arithmétiques et logiques générant un arbre syntaxique abstrait (AST).</w:t>
-      </w:r>
-    </w:p>
-    <w:p>
-      <w:pPr>
-        <w:pStyle w:val="ListBullet"/>
-      </w:pPr>
-      <w:r>
-        <w:t>Application rigoureuse des design patterns OOP (Composite pour l'arbre d'expression, Visitor pour l'évaluation, Factory pour la création des nœuds).</w:t>
-      </w:r>
-    </w:p>
-    <w:p>
-      <w:pPr>
-        <w:pStyle w:val="ListBullet"/>
-      </w:pPr>
-      <w:r>
-        <w:t>Développement d'une interface graphique interactive en JavaFX avec journalisation structurée et tests automatisés.</w:t>
-      </w:r>
-    </w:p>
-    <w:p>
-      <w:pPr>
-        <w:pStyle w:val="Heading2"/>
-      </w:pPr>
-      <w:r>
-        <w:t>Livrables &amp; Justificatifs Associés :</w:t>
-      </w:r>
-    </w:p>
-    <w:p>
-      <w:pPr>
-        <w:pStyle w:val="ListBullet"/>
-      </w:pPr>
-      <w:r>
-        <w:t>Code source et documentation intégrés dans le dossier projet.</w:t>
-      </w:r>
-    </w:p>
-    <w:p/>
-    <w:p>
-      <w:pPr>
-        <w:pStyle w:val="Heading1"/>
-      </w:pPr>
-      <w:r>
-        <w:t>15. Audit de Qualité de Données &amp; Classification Multi-Attributs de Visages</w:t>
+        <w:t>English Project Overview :</w:t>
       </w:r>
     </w:p>
     <w:p>
       <w:r>
-        <w:rPr>
-          <w:i/>
-          <w:sz w:val="20"/>
-        </w:rPr>
-        <w:t>Contexte : ENSIIE (3A Data Readiness) (2025-2026) | Rôle : Computer Vision / Data Quality Engineer</w:t>
-        <w:br/>
-        <w:t>Domaine : Computer Vision &amp; Data Quality</w:t>
-        <w:br/>
-        <w:t>Technologies : Python, PyTorch, Torchvision, Scikit-Learn, Matplotlib, Data Readiness, Matrices de Confusion</w:t>
+        <w:t>Competed in the national AI Data Challenge co-organized by Paris 1 Panthéon-Sorbonne, ComCyber (French Ministry of Interior), and the National Gendarmerie (CNENUM) to classify behavioral threats across 20,000 Windows PE/DLL binaries. Engineered a multi-core parallel extraction pipeline parsing Control Flow Graphs (CFG via NetworkX) and x86 assembly opcodes, followed by multi-label classification optimized for Macro F1-score.</w:t>
       </w:r>
     </w:p>
     <w:p>
@@ -2567,20 +2533,23 @@
         <w:pStyle w:val="Heading2"/>
       </w:pPr>
       <w:r>
-        <w:t>Synthèse Exécutive :</w:t>
+        <w:t>Key Technical Results (STAR Format) :</w:t>
       </w:r>
     </w:p>
     <w:p>
+      <w:pPr>
+        <w:pStyle w:val="ListBullet"/>
+      </w:pPr>
       <w:r>
-        <w:t>Pipeline d'évaluation de la qualité des données (Data Readiness) et classification multi-attributs sur données d'images (âge, genre, port de lunettes) avec audit de biais par matrices de confusion.</w:t>
+        <w:t>Engineered a high-performance multi-process pipeline extracting topological metrics (degrees, density, SCC, clustering) from Control Flow Graphs and x86 opcode distributions.</w:t>
       </w:r>
     </w:p>
     <w:p>
       <w:pPr>
-        <w:pStyle w:val="Heading2"/>
+        <w:pStyle w:val="ListBullet"/>
       </w:pPr>
       <w:r>
-        <w:t>Réalisations Clés &amp; Résultats (Format STAR) :</w:t>
+        <w:t>Trained and tuned multi-label architectures (MultiOutputClassifier, Random Forest, XGBoost, GNNs) predicting 459 dynamic sandbox behavioral tags.</w:t>
       </w:r>
     </w:p>
     <w:p>
@@ -2588,15 +2557,15 @@
         <w:pStyle w:val="ListBullet"/>
       </w:pPr>
       <w:r>
-        <w:t>Création d'un dataset customisé et de pipelines de prétraitement d'images sous PyTorch.</w:t>
+        <w:t>Benchmarked against state-of-the-art structural embedding techniques (Asm2Vec, GNNs) achieving strong generalization measured by Macro F1-score on held-out test data.</w:t>
       </w:r>
     </w:p>
     <w:p>
       <w:pPr>
-        <w:pStyle w:val="ListBullet"/>
+        <w:pStyle w:val="Heading2"/>
       </w:pPr>
       <w:r>
-        <w:t>Entraînement de modèles pour la prédiction conjointe d'attributs démographiques et d'accessoires.</w:t>
+        <w:t>Verified Deliverables &amp; Evidence :</w:t>
       </w:r>
     </w:p>
     <w:p>
@@ -2604,537 +2573,15 @@
         <w:pStyle w:val="ListBullet"/>
       </w:pPr>
       <w:r>
-        <w:t>Audit approfondi des biais de représentativité et performance par matrices de confusion segmentées.</w:t>
+        <w:t>Technical Paper / Thesis : reports/Briefing_Data_Challenge_Sorbonne.pdf</w:t>
       </w:r>
     </w:p>
     <w:p>
       <w:pPr>
-        <w:pStyle w:val="Heading2"/>
+        <w:pStyle w:val="ListBullet"/>
       </w:pPr>
       <w:r>
-        <w:t>Livrables &amp; Justificatifs Associés :</w:t>
-      </w:r>
-    </w:p>
-    <w:p>
-      <w:pPr>
-        <w:pStyle w:val="ListBullet"/>
-      </w:pPr>
-      <w:r>
-        <w:t>Code source et documentation intégrés dans le dossier projet.</w:t>
-      </w:r>
-    </w:p>
-    <w:p/>
-    <w:p>
-      <w:pPr>
-        <w:pStyle w:val="Heading1"/>
-      </w:pPr>
-      <w:r>
-        <w:t>16. Laboratoire de Traitement du Signal, Débruitage de Wiener &amp; Ondelettes</w:t>
-      </w:r>
-    </w:p>
-    <w:p>
-      <w:r>
-        <w:rPr>
-          <w:i/>
-          <w:sz w:val="20"/>
-        </w:rPr>
-        <w:t>Contexte : ENSIIE (3A Signal Processing) (2025-2026) | Rôle : Signal Processing Engineer</w:t>
-        <w:br/>
-        <w:t>Domaine : Signal &amp; Image Processing</w:t>
-        <w:br/>
-        <w:t>Technologies : Python, NumPy, SciPy, Matplotlib, Filtrage de Wiener, Densité Spectrale, Ondelettes, Audio &amp; Image</w:t>
-      </w:r>
-    </w:p>
-    <w:p>
-      <w:pPr>
-        <w:pStyle w:val="Heading2"/>
-      </w:pPr>
-      <w:r>
-        <w:t>Synthèse Exécutive :</w:t>
-      </w:r>
-    </w:p>
-    <w:p>
-      <w:r>
-        <w:t>Implémentation d'algorithmes de déconvolution et débruitage par filtre de Wiener, estimation de densité spectrale de puissance et analyse temps-fréquence sur signaux audio et images.</w:t>
-      </w:r>
-    </w:p>
-    <w:p>
-      <w:pPr>
-        <w:pStyle w:val="Heading2"/>
-      </w:pPr>
-      <w:r>
-        <w:t>Réalisations Clés &amp; Résultats (Format STAR) :</w:t>
-      </w:r>
-    </w:p>
-    <w:p>
-      <w:pPr>
-        <w:pStyle w:val="ListBullet"/>
-      </w:pPr>
-      <w:r>
-        <w:t>Développement de filtres optimaux de Wiener pour la déconvolution et la restauration de signaux corrompus par du bruit blanc gaussien.</w:t>
-      </w:r>
-    </w:p>
-    <w:p>
-      <w:pPr>
-        <w:pStyle w:val="ListBullet"/>
-      </w:pPr>
-      <w:r>
-        <w:t>Estimation spectrale non paramétrique (périodogramme de Welch) et analyse fréquentielle FFT.</w:t>
-      </w:r>
-    </w:p>
-    <w:p>
-      <w:pPr>
-        <w:pStyle w:val="ListBullet"/>
-      </w:pPr>
-      <w:r>
-        <w:t>Application à des cas pratiques de débruitage sonore et de filtrage 2D sur des images matricielles.</w:t>
-      </w:r>
-    </w:p>
-    <w:p>
-      <w:pPr>
-        <w:pStyle w:val="Heading2"/>
-      </w:pPr>
-      <w:r>
-        <w:t>Livrables &amp; Justificatifs Associés :</w:t>
-      </w:r>
-    </w:p>
-    <w:p>
-      <w:pPr>
-        <w:pStyle w:val="ListBullet"/>
-      </w:pPr>
-      <w:r>
-        <w:t>Code source et documentation intégrés dans le dossier projet.</w:t>
-      </w:r>
-    </w:p>
-    <w:p/>
-    <w:p>
-      <w:pPr>
-        <w:pStyle w:val="Heading1"/>
-      </w:pPr>
-      <w:r>
-        <w:t>17. Nash-DQN : Deep Q-Learning pour Équilibres de Nash en Trading Multi-Agents</w:t>
-      </w:r>
-    </w:p>
-    <w:p>
-      <w:r>
-        <w:rPr>
-          <w:i/>
-          <w:sz w:val="20"/>
-        </w:rPr>
-        <w:t>Contexte : McMaster University (MATH 4FM3) (2026) | Rôle : Quantitative Researcher / RL Engineer</w:t>
-        <w:br/>
-        <w:t>Domaine : Quantitative Finance &amp; Reinforcement Learning</w:t>
-        <w:br/>
-        <w:t>Technologies : Python, PyTorch, Deep Q-Learning (DQN), Multi-Agent RL, Stochastic Games, Optimal Execution, Mouvement Brownien</w:t>
-      </w:r>
-    </w:p>
-    <w:p>
-      <w:pPr>
-        <w:pStyle w:val="Heading2"/>
-      </w:pPr>
-      <w:r>
-        <w:t>Synthèse Exécutive :</w:t>
-      </w:r>
-    </w:p>
-    <w:p>
-      <w:r>
-        <w:t>Implémentation sous PyTorch d'un environnement de jeu stochastique à N agents (Casgrain, Ning &amp; Jaimungal, 2022) et entraînement d'architectures Deep Q-Network (Nash-DQN) pour converger vers l'équilibre de Nash en exécution optimale d'ordres.</w:t>
-      </w:r>
-    </w:p>
-    <w:p>
-      <w:pPr>
-        <w:pStyle w:val="Heading2"/>
-      </w:pPr>
-      <w:r>
-        <w:t>Réalisations Clés &amp; Résultats (Format STAR) :</w:t>
-      </w:r>
-    </w:p>
-    <w:p>
-      <w:pPr>
-        <w:pStyle w:val="ListBullet"/>
-      </w:pPr>
-      <w:r>
-        <w:t>Conception d'un simulateur de marché stochastique sous forme de jeu différentiel à N agents avec impact de marché temporaire et permanent.</w:t>
-      </w:r>
-    </w:p>
-    <w:p>
-      <w:pPr>
-        <w:pStyle w:val="ListBullet"/>
-      </w:pPr>
-      <w:r>
-        <w:t>Développement d'un algorithme Nash-DQN avec replay buffer priorisé et réseaux cible pour l'apprentissage de politiques de trading compétitives.</w:t>
-      </w:r>
-    </w:p>
-    <w:p>
-      <w:pPr>
-        <w:pStyle w:val="ListBullet"/>
-      </w:pPr>
-      <w:r>
-        <w:t>Rédaction d'une thèse de recherche mathématique de 34 pages accompagnée de visualisations des trajectoires browniennes et récompenses cumulées.</w:t>
-      </w:r>
-    </w:p>
-    <w:p>
-      <w:pPr>
-        <w:pStyle w:val="Heading2"/>
-      </w:pPr>
-      <w:r>
-        <w:t>Livrables &amp; Justificatifs Associés :</w:t>
-      </w:r>
-    </w:p>
-    <w:p>
-      <w:pPr>
-        <w:pStyle w:val="ListBullet"/>
-      </w:pPr>
-      <w:r>
-        <w:t>Rapport technique disponible : reports/Rapport_Nash_DQN_Optimal_Trading.pdf</w:t>
-      </w:r>
-    </w:p>
-    <w:p>
-      <w:pPr>
-        <w:pStyle w:val="ListBullet"/>
-      </w:pPr>
-      <w:r>
-        <w:t>Rapport technique disponible : reports/Project_Roadmap.pdf</w:t>
-      </w:r>
-    </w:p>
-    <w:p/>
-    <w:p>
-      <w:pPr>
-        <w:pStyle w:val="Heading1"/>
-      </w:pPr>
-      <w:r>
-        <w:t>18. Analyse de Sentiment de Titres Financiers : ML Classique vs BiLSTM</w:t>
-      </w:r>
-    </w:p>
-    <w:p>
-      <w:r>
-        <w:rPr>
-          <w:i/>
-          <w:sz w:val="20"/>
-        </w:rPr>
-        <w:t>Contexte : McMaster University (DATASCI 3ML3) (2026) | Rôle : NLP &amp; Machine Learning Engineer</w:t>
-        <w:br/>
-        <w:t>Domaine : NLP &amp; Financial Deep Learning</w:t>
-        <w:br/>
-        <w:t>Technologies : Python, PyTorch, BiLSTM, TF-IDF, Scikit-Learn, NLP, Financial Sentiment, Cross-Validation</w:t>
-      </w:r>
-    </w:p>
-    <w:p>
-      <w:pPr>
-        <w:pStyle w:val="Heading2"/>
-      </w:pPr>
-      <w:r>
-        <w:t>Synthèse Exécutive :</w:t>
-      </w:r>
-    </w:p>
-    <w:p>
-      <w:r>
-        <w:t>Benchmark comparatif de modèles de classification de sentiments sur 9 549 titres d'actualité financière (Financial PhraseBank) comparant modèles classiques (SVM, Random Forest) et réseaux neuronaux récurrents bidirectionnels (BiLSTM).</w:t>
-      </w:r>
-    </w:p>
-    <w:p>
-      <w:pPr>
-        <w:pStyle w:val="Heading2"/>
-      </w:pPr>
-      <w:r>
-        <w:t>Réalisations Clés &amp; Résultats (Format STAR) :</w:t>
-      </w:r>
-    </w:p>
-    <w:p>
-      <w:pPr>
-        <w:pStyle w:val="ListBullet"/>
-      </w:pPr>
-      <w:r>
-        <w:t>Traitement et vectorisation d'un corpus de 9 549 titres financiers avec analyse lexicale et gestion du déséquilibre de classes.</w:t>
-      </w:r>
-    </w:p>
-    <w:p>
-      <w:pPr>
-        <w:pStyle w:val="ListBullet"/>
-      </w:pPr>
-      <w:r>
-        <w:t>Implémentation et optimisation d'une architecture neuronale Bidirectional LSTM sous PyTorch surpassant les baselines classiques.</w:t>
-      </w:r>
-    </w:p>
-    <w:p>
-      <w:pPr>
-        <w:pStyle w:val="ListBullet"/>
-      </w:pPr>
-      <w:r>
-        <w:t>Rédaction d'un rapport de recherche académique de 11 pages détaillant les courbes d'apprentissage, F1-scores et analyses d'erreurs.</w:t>
-      </w:r>
-    </w:p>
-    <w:p>
-      <w:pPr>
-        <w:pStyle w:val="Heading2"/>
-      </w:pPr>
-      <w:r>
-        <w:t>Livrables &amp; Justificatifs Associés :</w:t>
-      </w:r>
-    </w:p>
-    <w:p>
-      <w:pPr>
-        <w:pStyle w:val="ListBullet"/>
-      </w:pPr>
-      <w:r>
-        <w:t>Rapport technique disponible : reports/Financial_News_Sentiment_Classification_Report.pdf</w:t>
-      </w:r>
-    </w:p>
-    <w:p>
-      <w:pPr>
-        <w:pStyle w:val="ListBullet"/>
-      </w:pPr>
-      <w:r>
-        <w:t>Rapport technique disponible : reports/Sujet_FinalProject.pdf</w:t>
-      </w:r>
-    </w:p>
-    <w:p/>
-    <w:p>
-      <w:pPr>
-        <w:pStyle w:val="Heading1"/>
-      </w:pPr>
-      <w:r>
-        <w:t>19. Prévision de la Demande Saisonnière dans le Commerce de Détail Canadien</w:t>
-      </w:r>
-    </w:p>
-    <w:p>
-      <w:r>
-        <w:rPr>
-          <w:i/>
-          <w:sz w:val="20"/>
-        </w:rPr>
-        <w:t>Contexte : McMaster University (STATS 4A03) (2026) | Rôle : Time Series Analyst</w:t>
-        <w:br/>
-        <w:t>Domaine : Time Series &amp; Applied Econometrics</w:t>
-        <w:br/>
-        <w:t>Technologies : R, RMarkdown, SARIMA, Holt-Winters, Décomposition STL, Tests de Stationnarité (ADF/KPSS), Validation Croisée</w:t>
-      </w:r>
-    </w:p>
-    <w:p>
-      <w:pPr>
-        <w:pStyle w:val="Heading2"/>
-      </w:pPr>
-      <w:r>
-        <w:t>Synthèse Exécutive :</w:t>
-      </w:r>
-    </w:p>
-    <w:p>
-      <w:r>
-        <w:t>Modélisation économétrique et prévision de séries temporelles sur 27 ans de ventes mensuelles du commerce de détail canadien (Statistique Canada) par décomposition STL, lissage exponentiel Holt-Winters et modèles SARIMA multiplicatifs.</w:t>
-      </w:r>
-    </w:p>
-    <w:p>
-      <w:pPr>
-        <w:pStyle w:val="Heading2"/>
-      </w:pPr>
-      <w:r>
-        <w:t>Réalisations Clés &amp; Résultats (Format STAR) :</w:t>
-      </w:r>
-    </w:p>
-    <w:p>
-      <w:pPr>
-        <w:pStyle w:val="ListBullet"/>
-      </w:pPr>
-      <w:r>
-        <w:t>Analyse exploratoire et tests statistiques de stationnarité (ADF, KPSS) sur 27 années de séries mensuelles de consommation.</w:t>
-      </w:r>
-    </w:p>
-    <w:p>
-      <w:pPr>
-        <w:pStyle w:val="ListBullet"/>
-      </w:pPr>
-      <w:r>
-        <w:t>Identification et estimation de modèles SARIMA multiplicatifs avec validation rigoureuse des résidus (Ljung-Box, normalité).</w:t>
-      </w:r>
-    </w:p>
-    <w:p>
-      <w:pPr>
-        <w:pStyle w:val="ListBullet"/>
-      </w:pPr>
-      <w:r>
-        <w:t>Production d'un rapport de prévision de 12 pages compilé sous RMarkdown avec intervalles de confiance prospectifs.</w:t>
-      </w:r>
-    </w:p>
-    <w:p>
-      <w:pPr>
-        <w:pStyle w:val="Heading2"/>
-      </w:pPr>
-      <w:r>
-        <w:t>Livrables &amp; Justificatifs Associés :</w:t>
-      </w:r>
-    </w:p>
-    <w:p>
-      <w:pPr>
-        <w:pStyle w:val="ListBullet"/>
-      </w:pPr>
-      <w:r>
-        <w:t>Rapport technique disponible : reports/Canadian_Retail_Time_Series_Forecasting_Report.pdf</w:t>
-      </w:r>
-    </w:p>
-    <w:p/>
-    <w:p>
-      <w:pPr>
-        <w:pStyle w:val="Heading1"/>
-      </w:pPr>
-      <w:r>
-        <w:t>20. Visual Question Answering (VQA) : Fusion Multimodale Vision &amp; Langage</w:t>
-      </w:r>
-    </w:p>
-    <w:p>
-      <w:r>
-        <w:rPr>
-          <w:i/>
-          <w:sz w:val="20"/>
-        </w:rPr>
-        <w:t>Contexte : McMaster University (MECHENG 4AI3) (2026) | Rôle : Multimodal Deep Learning Engineer</w:t>
-        <w:br/>
-        <w:t>Domaine : Multimodal Deep Learning &amp; Computer Vision</w:t>
-        <w:br/>
-        <w:t>Technologies : Python, PyTorch, Torchvision, CNN (ResNet), LSTM, Multimodal Fusion, VQA v2.0 Dataset, Streamlit</w:t>
-      </w:r>
-    </w:p>
-    <w:p>
-      <w:pPr>
-        <w:pStyle w:val="Heading2"/>
-      </w:pPr>
-      <w:r>
-        <w:t>Synthèse Exécutive :</w:t>
-      </w:r>
-    </w:p>
-    <w:p>
-      <w:r>
-        <w:t>Système de Question-Réponse Visuelle (VQA) entraîné sur le dataset VQA v2.0 associant extraction de caractéristiques visuelles par CNN (ResNet), encodage linguistique par LSTM et module de fusion multimodale.</w:t>
-      </w:r>
-    </w:p>
-    <w:p>
-      <w:pPr>
-        <w:pStyle w:val="Heading2"/>
-      </w:pPr>
-      <w:r>
-        <w:t>Réalisations Clés &amp; Résultats (Format STAR) :</w:t>
-      </w:r>
-    </w:p>
-    <w:p>
-      <w:pPr>
-        <w:pStyle w:val="ListBullet"/>
-      </w:pPr>
-      <w:r>
-        <w:t>Pipeline d'ingestion et d'alignement multimodal image-texte sur le benchmark VQA v2.0.</w:t>
-      </w:r>
-    </w:p>
-    <w:p>
-      <w:pPr>
-        <w:pStyle w:val="ListBullet"/>
-      </w:pPr>
-      <w:r>
-        <w:t>Conception d'une architecture de fusion multimodale (produit tensoriel / concaténation dense) pour la génération de réponses visuelles.</w:t>
-      </w:r>
-    </w:p>
-    <w:p>
-      <w:pPr>
-        <w:pStyle w:val="ListBullet"/>
-      </w:pPr>
-      <w:r>
-        <w:t>Déploiement d'une application de démonstration interactive avec roadmap de développement produit.</w:t>
-      </w:r>
-    </w:p>
-    <w:p>
-      <w:pPr>
-        <w:pStyle w:val="Heading2"/>
-      </w:pPr>
-      <w:r>
-        <w:t>Livrables &amp; Justificatifs Associés :</w:t>
-      </w:r>
-    </w:p>
-    <w:p>
-      <w:pPr>
-        <w:pStyle w:val="ListBullet"/>
-      </w:pPr>
-      <w:r>
-        <w:t>Rapport technique disponible : reports/VQA_Project_Roadmap.pdf</w:t>
-      </w:r>
-    </w:p>
-    <w:p/>
-    <w:p>
-      <w:pPr>
-        <w:pStyle w:val="Heading1"/>
-      </w:pPr>
-      <w:r>
-        <w:t>21. Modèles Linéaires Généralisés : Régressions Poisson, Gamma &amp; Binomiales</w:t>
-      </w:r>
-    </w:p>
-    <w:p>
-      <w:r>
-        <w:rPr>
-          <w:i/>
-          <w:sz w:val="20"/>
-        </w:rPr>
-        <w:t>Contexte : McMaster University (STATS 4GLM) (2026) | Rôle : Applied Statistician</w:t>
-        <w:br/>
-        <w:t>Domaine : Applied Statistics &amp; GLM</w:t>
-        <w:br/>
-        <w:t>Technologies : R, RMarkdown, GLM, Régression Poisson, Régression Gamma, Régression Logistique, Analyse de Déviance, Surdispersion</w:t>
-      </w:r>
-    </w:p>
-    <w:p>
-      <w:pPr>
-        <w:pStyle w:val="Heading2"/>
-      </w:pPr>
-      <w:r>
-        <w:t>Synthèse Exécutive :</w:t>
-      </w:r>
-    </w:p>
-    <w:p>
-      <w:r>
-        <w:t>Suite d'études statistiques approfondies appliquant la théorie des modèles linéaires généralisés (famille exponentielle, fonctions de lien, quasi-vraisemblance) sur des problématiques réelles d'assurance et d'épidémiologie.</w:t>
-      </w:r>
-    </w:p>
-    <w:p>
-      <w:pPr>
-        <w:pStyle w:val="Heading2"/>
-      </w:pPr>
-      <w:r>
-        <w:t>Réalisations Clés &amp; Résultats (Format STAR) :</w:t>
-      </w:r>
-    </w:p>
-    <w:p>
-      <w:pPr>
-        <w:pStyle w:val="ListBullet"/>
-      </w:pPr>
-      <w:r>
-        <w:t>Ajustement de modèles GLM Poisson et quasi-Poisson pour données de comptage avec diagnostic de surdispersion.</w:t>
-      </w:r>
-    </w:p>
-    <w:p>
-      <w:pPr>
-        <w:pStyle w:val="ListBullet"/>
-      </w:pPr>
-      <w:r>
-        <w:t>Modélisation de données continues positives asymétriques via GLM Gamma et sélection de variables par analyse de déviance.</w:t>
-      </w:r>
-    </w:p>
-    <w:p>
-      <w:pPr>
-        <w:pStyle w:val="ListBullet"/>
-      </w:pPr>
-      <w:r>
-        <w:t>Production de 5 rapports d'analyse sous RMarkdown démontrant une maîtrise rigoureuse de l'inférence statistique.</w:t>
-      </w:r>
-    </w:p>
-    <w:p>
-      <w:pPr>
-        <w:pStyle w:val="Heading2"/>
-      </w:pPr>
-      <w:r>
-        <w:t>Livrables &amp; Justificatifs Associés :</w:t>
-      </w:r>
-    </w:p>
-    <w:p>
-      <w:pPr>
-        <w:pStyle w:val="ListBullet"/>
-      </w:pPr>
-      <w:r>
-        <w:t>Code source et documentation intégrés dans le dossier projet.</w:t>
+        <w:t>System Architecture Diagram : image/output.svg</w:t>
       </w:r>
     </w:p>
     <w:p/>

</xml_diff>

<commit_message>
docs: standardize all 20 project READMEs in English with authentic French summaries
</commit_message>
<xml_diff>
--- a/All_Projects.docx
+++ b/All_Projects.docx
@@ -11,9 +11,9 @@
           <w:rFonts w:ascii="Calibri" w:hAnsi="Calibri"/>
           <w:b/>
           <w:color w:val="102C57"/>
-          <w:sz w:val="40"/>
+          <w:sz w:val="44"/>
         </w:rPr>
-        <w:t>PORTFOLIO D'INGÉNIERIE &amp; RECHERCHE IA — Mohamed Nourou Dine CISSE</w:t>
+        <w:t>PORTFOLIO GLOBAL DES PROJETS D'INGÉNIERIE &amp; IA</w:t>
       </w:r>
     </w:p>
     <w:p>
@@ -24,13 +24,13 @@
         <w:rPr>
           <w:rFonts w:ascii="Calibri" w:hAnsi="Calibri"/>
           <w:i/>
-          <w:sz w:val="20"/>
+          <w:sz w:val="21"/>
         </w:rPr>
-        <w:t>Double Diplôme : ENSIIE &amp; Université Paris-Saclay (Master 2 Intelligence Artificielle — M2IA)</w:t>
+        <w:t>Mohamed Nourou Dine CISSE — Élève-Ingénieur ENSIIE &amp; Université Paris-Saclay (Master M2IA) | Échange McMaster University</w:t>
         <w:br/>
-        <w:t>Échange Académique : McMaster University (Canada) | Département de Mathématiques &amp; Statistiques</w:t>
+        <w:t>Spécialisation : Intelligence Artificielle, Deep Learning &amp; Mathématiques Appliquées</w:t>
         <w:br/>
-        <w:t>Email : mouhamed.nouroudine.cisse@gmail.com | Tél : +33 7 65 60 09 97 | GitHub : github.com/nourou-dine-mahy</w:t>
+        <w:t>Email : mouhamed.nouroudine.cisse@gmail.com | Tél : +33 7 65 60 09 97 | GitHub : github.com/nourou-dine-cisse</w:t>
       </w:r>
     </w:p>
     <w:p>
@@ -42,9 +42,9 @@
       <w:r>
         <w:rPr>
           <w:rFonts w:ascii="Calibri" w:hAnsi="Calibri"/>
-          <w:sz w:val="21"/>
+          <w:sz w:val="22"/>
         </w:rPr>
-        <w:t>Ce document rassemble la documentation exhaustive, les rapports de recherche et les soutenances des 14 projets majeurs démontrant mes compétences en Intelligence Artificielle, Agents Autonomes, Data Engineering et Finance Quantitative. Il est spécialement structuré pour l'obtention de mon Stage de Fin d'Études (PFE de 6 mois).</w:t>
+        <w:t>Ce document rassemble la documentation exhaustive, les rapports d'expertise et les présentations de soutenance des 20 projets d'ingénierie et de recherche réalisés au cours de mon cursus à l'ENSIIE, mon Master 2 en Intelligence Artificielle (Université Paris-Saclay), mon échange académique à McMaster University (Canada) et mes expériences industrielles (Publicis Groupe, Gainde 2000 / Infinity Analytics, Challenge Entreprendre).</w:t>
       </w:r>
     </w:p>
     <w:p>
@@ -52,7 +52,7 @@
         <w:pStyle w:val="Heading1"/>
       </w:pPr>
       <w:r>
-        <w:t>Tableau Récapitulatif des 14 Projets d'Élite</w:t>
+        <w:t>Tableau Récapitulatif des 20 Projets</w:t>
       </w:r>
     </w:p>
     <w:tbl>
@@ -106,7 +106,7 @@
                 <w:b/>
                 <w:sz w:val="19"/>
               </w:rPr>
-              <w:t>Technologies Clés</w:t>
+              <w:t>Stack Technique</w:t>
             </w:r>
           </w:p>
         </w:tc>
@@ -135,7 +135,7 @@
               <w:rPr>
                 <w:sz w:val="18"/>
               </w:rPr>
-              <w:t>Spielberg Platform</w:t>
+              <w:t>Plateforme Spielberg</w:t>
             </w:r>
           </w:p>
         </w:tc>
@@ -176,7 +176,7 @@
               <w:rPr>
                 <w:sz w:val="18"/>
               </w:rPr>
-              <w:t>📄 Report (1) + 📊 Deck (2) + 📐 Architecture</w:t>
+              <w:t>📄 Rapport (1) + 📊 Présentation (2)</w:t>
             </w:r>
           </w:p>
         </w:tc>
@@ -232,7 +232,7 @@
               <w:rPr>
                 <w:sz w:val="18"/>
               </w:rPr>
-              <w:t>💻 Codebase</w:t>
+              <w:t>💻 Code &amp; Dépôt</w:t>
             </w:r>
           </w:p>
         </w:tc>
@@ -247,7 +247,7 @@
               <w:rPr>
                 <w:sz w:val="18"/>
               </w:rPr>
-              <w:t>Production-Grade Docker ETL Pipeline &amp; Dimensional Star-Schema Datamart</w:t>
+              <w:t>Pipeline ETL Conteneurisé &amp; Modélisation Datamart en Étoile (SunSéjour)</w:t>
             </w:r>
           </w:p>
         </w:tc>
@@ -288,7 +288,7 @@
               <w:rPr>
                 <w:sz w:val="18"/>
               </w:rPr>
-              <w:t>📄 Report (2)</w:t>
+              <w:t>📄 Rapport (2)</w:t>
             </w:r>
           </w:p>
         </w:tc>
@@ -303,7 +303,7 @@
               <w:rPr>
                 <w:sz w:val="18"/>
               </w:rPr>
-              <w:t>Financial Time Series Forecasting &amp; Calibrated Credit Scoring ML</w:t>
+              <w:t>Séries Temporelles Financières &amp; Scoring de Crédit Calibré (Gainde 2000)</w:t>
             </w:r>
           </w:p>
         </w:tc>
@@ -344,7 +344,7 @@
               <w:rPr>
                 <w:sz w:val="18"/>
               </w:rPr>
-              <w:t>📄 Report (2) + 📊 Deck (1)</w:t>
+              <w:t>📄 Rapport (2) + 📊 Présentation (1)</w:t>
             </w:r>
           </w:p>
         </w:tc>
@@ -359,7 +359,7 @@
               <w:rPr>
                 <w:sz w:val="18"/>
               </w:rPr>
-              <w:t>Semantic Representations, Text Classification &amp; Hybrid BiLSTM-CNN NER</w:t>
+              <w:t>Représentations Sémantiques, Classification CNN/Transformers &amp; NER Hybride</w:t>
             </w:r>
           </w:p>
         </w:tc>
@@ -400,7 +400,7 @@
               <w:rPr>
                 <w:sz w:val="18"/>
               </w:rPr>
-              <w:t>📄 Report (2)</w:t>
+              <w:t>📄 Rapport (2)</w:t>
             </w:r>
           </w:p>
         </w:tc>
@@ -415,7 +415,7 @@
               <w:rPr>
                 <w:sz w:val="18"/>
               </w:rPr>
-              <w:t>Modern C++17 Black-Scholes PDE Numerical Solver &amp; Real-Time SDL2 Visualization</w:t>
+              <w:t>Solveur EDP Black-Scholes en C++17 &amp; Rendu Graphique Temps Réel SDL2</w:t>
             </w:r>
           </w:p>
         </w:tc>
@@ -456,7 +456,7 @@
               <w:rPr>
                 <w:sz w:val="18"/>
               </w:rPr>
-              <w:t>📄 Report (1) + 📐 Architecture</w:t>
+              <w:t>📄 Rapport (1)</w:t>
             </w:r>
           </w:p>
         </w:tc>
@@ -471,7 +471,7 @@
               <w:rPr>
                 <w:sz w:val="18"/>
               </w:rPr>
-              <w:t>Biostatistical Survival &amp; Recurrence Modeling on METABRIC Cohort Data</w:t>
+              <w:t>Modélisation Statistique &amp; Prédiction de Survie du Cancer du Sein (METABRIC)</w:t>
             </w:r>
           </w:p>
         </w:tc>
@@ -512,7 +512,7 @@
               <w:rPr>
                 <w:sz w:val="18"/>
               </w:rPr>
-              <w:t>📄 Report (1)</w:t>
+              <w:t>📄 Rapport (1)</w:t>
             </w:r>
           </w:p>
         </w:tc>
@@ -527,7 +527,7 @@
               <w:rPr>
                 <w:sz w:val="18"/>
               </w:rPr>
-              <w:t>Multivariate Analysis &amp; Unsupervised Clustering of Airbnb NYC Listings</w:t>
+              <w:t>Analyse Factorielle &amp; Clustering sur le Marché Airbnb New York City</w:t>
             </w:r>
           </w:p>
         </w:tc>
@@ -568,7 +568,7 @@
               <w:rPr>
                 <w:sz w:val="18"/>
               </w:rPr>
-              <w:t>📄 Report (1) + 📊 Deck (2)</w:t>
+              <w:t>📄 Rapport (1) + 📊 Présentation (2)</w:t>
             </w:r>
           </w:p>
         </w:tc>
@@ -624,7 +624,7 @@
               <w:rPr>
                 <w:sz w:val="18"/>
               </w:rPr>
-              <w:t>📄 Report (2) + 📐 Architecture</w:t>
+              <w:t>📄 Rapport (2)</w:t>
             </w:r>
           </w:p>
         </w:tc>
@@ -639,7 +639,7 @@
               <w:rPr>
                 <w:sz w:val="18"/>
               </w:rPr>
-              <w:t>Financial News Sentiment Classification</w:t>
+              <w:t>Analyse de Sentiment de Titres Financiers</w:t>
             </w:r>
           </w:p>
         </w:tc>
@@ -680,7 +680,7 @@
               <w:rPr>
                 <w:sz w:val="18"/>
               </w:rPr>
-              <w:t>📄 Report (2)</w:t>
+              <w:t>📄 Rapport (2)</w:t>
             </w:r>
           </w:p>
         </w:tc>
@@ -695,7 +695,7 @@
               <w:rPr>
                 <w:sz w:val="18"/>
               </w:rPr>
-              <w:t>Seasonal Demand Forecasting in Canadian Retail Trade (1992–2019)</w:t>
+              <w:t>Prévision de la Demande Saisonnière dans le Commerce Canadien (27 Ans)</w:t>
             </w:r>
           </w:p>
         </w:tc>
@@ -736,7 +736,7 @@
               <w:rPr>
                 <w:sz w:val="18"/>
               </w:rPr>
-              <w:t>📄 Report (1)</w:t>
+              <w:t>📄 Rapport (1)</w:t>
             </w:r>
           </w:p>
         </w:tc>
@@ -792,7 +792,7 @@
               <w:rPr>
                 <w:sz w:val="18"/>
               </w:rPr>
-              <w:t>📄 Report (1)</w:t>
+              <w:t>📄 Rapport (1)</w:t>
             </w:r>
           </w:p>
         </w:tc>
@@ -807,7 +807,7 @@
               <w:rPr>
                 <w:sz w:val="18"/>
               </w:rPr>
-              <w:t>Applied Generalized Linear Models</w:t>
+              <w:t>Modèles Linéaires Généralisés</w:t>
             </w:r>
           </w:p>
         </w:tc>
@@ -848,7 +848,7 @@
               <w:rPr>
                 <w:sz w:val="18"/>
               </w:rPr>
-              <w:t>💻 Codebase</w:t>
+              <w:t>💻 Code &amp; Dépôt</w:t>
             </w:r>
           </w:p>
         </w:tc>
@@ -863,7 +863,7 @@
               <w:rPr>
                 <w:sz w:val="18"/>
               </w:rPr>
-              <w:t>Machine Learning &amp; AI Practical Workshops (Kryptosphere AI)</w:t>
+              <w:t>Formations &amp; Ateliers Pratiques en Machine Learning (Kryptosphere IA)</w:t>
             </w:r>
           </w:p>
         </w:tc>
@@ -904,7 +904,7 @@
               <w:rPr>
                 <w:sz w:val="18"/>
               </w:rPr>
-              <w:t>📊 Deck (2)</w:t>
+              <w:t>📊 Présentation (2)</w:t>
             </w:r>
           </w:p>
         </w:tc>
@@ -919,7 +919,7 @@
               <w:rPr>
                 <w:sz w:val="18"/>
               </w:rPr>
-              <w:t>Sorbonne 2025 Data Challenge</w:t>
+              <w:t>Data Challenge Sorbonne 2025</w:t>
             </w:r>
           </w:p>
         </w:tc>
@@ -960,7 +960,287 @@
               <w:rPr>
                 <w:sz w:val="18"/>
               </w:rPr>
-              <w:t>📄 Report (1) + 📐 Architecture</w:t>
+              <w:t>📄 Rapport (1)</w:t>
+            </w:r>
+          </w:p>
+        </w:tc>
+      </w:tr>
+      <w:tr>
+        <w:tc>
+          <w:tcPr>
+            <w:tcW w:type="dxa" w:w="2484"/>
+          </w:tcPr>
+          <w:p>
+            <w:r>
+              <w:rPr>
+                <w:sz w:val="18"/>
+              </w:rPr>
+              <w:t>Transformer Décodeur from Scratch</w:t>
+            </w:r>
+          </w:p>
+        </w:tc>
+        <w:tc>
+          <w:tcPr>
+            <w:tcW w:type="dxa" w:w="2484"/>
+          </w:tcPr>
+          <w:p>
+            <w:r>
+              <w:rPr>
+                <w:sz w:val="18"/>
+              </w:rPr>
+              <w:t>Deep Learning &amp; Natural Language Processing</w:t>
+              <w:br/>
+              <w:t>(ENSIIE &amp; Université Paris-Saclay (Master 2 IA))</w:t>
+            </w:r>
+          </w:p>
+        </w:tc>
+        <w:tc>
+          <w:tcPr>
+            <w:tcW w:type="dxa" w:w="2484"/>
+          </w:tcPr>
+          <w:p>
+            <w:r>
+              <w:rPr>
+                <w:sz w:val="18"/>
+              </w:rPr>
+              <w:t>Python, PyTorch, Hugging Face Transformers, Hugging Face Datasets</w:t>
+            </w:r>
+          </w:p>
+        </w:tc>
+        <w:tc>
+          <w:tcPr>
+            <w:tcW w:type="dxa" w:w="2484"/>
+          </w:tcPr>
+          <w:p>
+            <w:r>
+              <w:rPr>
+                <w:sz w:val="18"/>
+              </w:rPr>
+              <w:t>💻 Code &amp; Dépôt</w:t>
+            </w:r>
+          </w:p>
+        </w:tc>
+      </w:tr>
+      <w:tr>
+        <w:tc>
+          <w:tcPr>
+            <w:tcW w:type="dxa" w:w="2484"/>
+          </w:tcPr>
+          <w:p>
+            <w:r>
+              <w:rPr>
+                <w:sz w:val="18"/>
+              </w:rPr>
+              <w:t>Effet des accessoires faciaux sur l’évaluation des modèles vision-langage</w:t>
+            </w:r>
+          </w:p>
+        </w:tc>
+        <w:tc>
+          <w:tcPr>
+            <w:tcW w:type="dxa" w:w="2484"/>
+          </w:tcPr>
+          <w:p>
+            <w:r>
+              <w:rPr>
+                <w:sz w:val="18"/>
+              </w:rPr>
+              <w:t>AI Evaluation &amp; Fairness</w:t>
+              <w:br/>
+              <w:t>(Université Paris-Saclay &amp; CEA-List)</w:t>
+            </w:r>
+          </w:p>
+        </w:tc>
+        <w:tc>
+          <w:tcPr>
+            <w:tcW w:type="dxa" w:w="2484"/>
+          </w:tcPr>
+          <w:p>
+            <w:r>
+              <w:rPr>
+                <w:sz w:val="18"/>
+              </w:rPr>
+              <w:t>Vision-Language Models, MiniCPM-V 4.6, SigLIP 2, Counterfactual Evaluation</w:t>
+            </w:r>
+          </w:p>
+        </w:tc>
+        <w:tc>
+          <w:tcPr>
+            <w:tcW w:type="dxa" w:w="2484"/>
+          </w:tcPr>
+          <w:p>
+            <w:r>
+              <w:rPr>
+                <w:sz w:val="18"/>
+              </w:rPr>
+              <w:t>📄 Rapport (1) + 📊 Présentation (1)</w:t>
+            </w:r>
+          </w:p>
+        </w:tc>
+      </w:tr>
+      <w:tr>
+        <w:tc>
+          <w:tcPr>
+            <w:tcW w:type="dxa" w:w="2484"/>
+          </w:tcPr>
+          <w:p>
+            <w:r>
+              <w:rPr>
+                <w:sz w:val="18"/>
+              </w:rPr>
+              <w:t>LoRA</w:t>
+            </w:r>
+          </w:p>
+        </w:tc>
+        <w:tc>
+          <w:tcPr>
+            <w:tcW w:type="dxa" w:w="2484"/>
+          </w:tcPr>
+          <w:p>
+            <w:r>
+              <w:rPr>
+                <w:sz w:val="18"/>
+              </w:rPr>
+              <w:t>Deep Learning &amp; NLP</w:t>
+              <w:br/>
+              <w:t>(Université Paris-Saclay &amp; ENSIIE)</w:t>
+            </w:r>
+          </w:p>
+        </w:tc>
+        <w:tc>
+          <w:tcPr>
+            <w:tcW w:type="dxa" w:w="2484"/>
+          </w:tcPr>
+          <w:p>
+            <w:r>
+              <w:rPr>
+                <w:sz w:val="18"/>
+              </w:rPr>
+              <w:t>PyTorch, LoRA, PEFT, Transformers</w:t>
+            </w:r>
+          </w:p>
+        </w:tc>
+        <w:tc>
+          <w:tcPr>
+            <w:tcW w:type="dxa" w:w="2484"/>
+          </w:tcPr>
+          <w:p>
+            <w:r>
+              <w:rPr>
+                <w:sz w:val="18"/>
+              </w:rPr>
+              <w:t>💻 Code &amp; Dépôt</w:t>
+            </w:r>
+          </w:p>
+        </w:tc>
+      </w:tr>
+      <w:tr>
+        <w:tc>
+          <w:tcPr>
+            <w:tcW w:type="dxa" w:w="2484"/>
+          </w:tcPr>
+          <w:p>
+            <w:r>
+              <w:rPr>
+                <w:sz w:val="18"/>
+              </w:rPr>
+              <w:t>Vision par ordinateur &amp; architectures CNN (McMaster University)</w:t>
+            </w:r>
+          </w:p>
+        </w:tc>
+        <w:tc>
+          <w:tcPr>
+            <w:tcW w:type="dxa" w:w="2484"/>
+          </w:tcPr>
+          <w:p>
+            <w:r>
+              <w:rPr>
+                <w:sz w:val="18"/>
+              </w:rPr>
+              <w:t>Deep Learning &amp; NLP</w:t>
+              <w:br/>
+              <w:t>(McMaster University (Canada))</w:t>
+            </w:r>
+          </w:p>
+        </w:tc>
+        <w:tc>
+          <w:tcPr>
+            <w:tcW w:type="dxa" w:w="2484"/>
+          </w:tcPr>
+          <w:p>
+            <w:r>
+              <w:rPr>
+                <w:sz w:val="18"/>
+              </w:rPr>
+              <w:t>TensorFlow, Keras, OpenCV, CNN</w:t>
+            </w:r>
+          </w:p>
+        </w:tc>
+        <w:tc>
+          <w:tcPr>
+            <w:tcW w:type="dxa" w:w="2484"/>
+          </w:tcPr>
+          <w:p>
+            <w:r>
+              <w:rPr>
+                <w:sz w:val="18"/>
+              </w:rPr>
+              <w:t>📄 Rapport (1)</w:t>
+            </w:r>
+          </w:p>
+        </w:tc>
+      </w:tr>
+      <w:tr>
+        <w:tc>
+          <w:tcPr>
+            <w:tcW w:type="dxa" w:w="2484"/>
+          </w:tcPr>
+          <w:p>
+            <w:r>
+              <w:rPr>
+                <w:sz w:val="18"/>
+              </w:rPr>
+              <w:t>Fondements du machine learning &amp; rétropropagation from scratch (McMaster University)</w:t>
+            </w:r>
+          </w:p>
+        </w:tc>
+        <w:tc>
+          <w:tcPr>
+            <w:tcW w:type="dxa" w:w="2484"/>
+          </w:tcPr>
+          <w:p>
+            <w:r>
+              <w:rPr>
+                <w:sz w:val="18"/>
+              </w:rPr>
+              <w:t>Deep Learning &amp; NLP</w:t>
+              <w:br/>
+              <w:t>(McMaster University (Canada))</w:t>
+            </w:r>
+          </w:p>
+        </w:tc>
+        <w:tc>
+          <w:tcPr>
+            <w:tcW w:type="dxa" w:w="2484"/>
+          </w:tcPr>
+          <w:p>
+            <w:r>
+              <w:rPr>
+                <w:sz w:val="18"/>
+              </w:rPr>
+              <w:t>NumPy, Autograd, Optimization, Backpropagation</w:t>
+            </w:r>
+          </w:p>
+        </w:tc>
+        <w:tc>
+          <w:tcPr>
+            <w:tcW w:type="dxa" w:w="2484"/>
+          </w:tcPr>
+          <w:p>
+            <w:r>
+              <w:rPr>
+                <w:sz w:val="18"/>
+              </w:rPr>
+              <w:t>💻 Code &amp; Dépôt</w:t>
             </w:r>
           </w:p>
         </w:tc>
@@ -976,20 +1256,18 @@
         <w:pStyle w:val="Heading1"/>
       </w:pPr>
       <w:r>
-        <w:t>1. Spielberg Platform: Enterprise Data Centralization &amp; Multi-Agent AI Orchestration</w:t>
+        <w:t>1. Plateforme Spielberg : Centralisation des Données &amp; Agents IA (Publicis &amp; Socle Startup)</w:t>
       </w:r>
     </w:p>
     <w:p>
       <w:r>
         <w:rPr>
           <w:i/>
-          <w:sz w:val="19"/>
+          <w:sz w:val="20"/>
         </w:rPr>
-        <w:t>Academic Context : Publicis Groupe / Prodigious France &amp; Startup Foundation (2026) | Degree : ENSIIE &amp; Université Paris-Saclay (Master 2 IA)</w:t>
+        <w:t>Contexte : Publicis Groupe / Prodigious France &amp; Startup Foundation (2026) | Rôle : AI &amp; Data Systems Engineer / Future Startup Co-founder</w:t>
         <w:br/>
-        <w:t>Role : AI &amp; Data Systems Engineer / Future Startup Co-founder</w:t>
-        <w:br/>
-        <w:t>Domain : Enterprise AI &amp; Multi-Agent Systems</w:t>
+        <w:t>Domaine : Enterprise AI &amp; Multi-Agent Systems</w:t>
         <w:br/>
         <w:t>Technologies : Python, FastAPI, LangGraph, Multi-Agent Systems, RAG, Vector Databases, Docker, PostgreSQL, AsyncIO</w:t>
       </w:r>
@@ -999,7 +1277,7 @@
         <w:pStyle w:val="Heading2"/>
       </w:pPr>
       <w:r>
-        <w:t>French Executive Summary (Synthèse) :</w:t>
+        <w:t>Synthèse Exécutive :</w:t>
       </w:r>
     </w:p>
     <w:p>
@@ -1012,20 +1290,23 @@
         <w:pStyle w:val="Heading2"/>
       </w:pPr>
       <w:r>
-        <w:t>English Project Overview :</w:t>
+        <w:t>Réalisations Clés &amp; Résultats (Format STAR) :</w:t>
       </w:r>
     </w:p>
     <w:p>
+      <w:pPr>
+        <w:pStyle w:val="ListBullet"/>
+      </w:pPr>
       <w:r>
-        <w:t>Architected an enterprise platform centralizing multi-agency operational data and orchestrating autonomous AI agents via LangGraph supervisor-worker graphs, high-precision RAG, and governed FastAPI microservices. Serving as the foundation for an AI data startup.</w:t>
+        <w:t>Conception d'une architecture multi-agents gouvernée sous LangGraph (superviseur et orchestrateur) pour l'exécution de tâches opérationnelles complexes.</w:t>
       </w:r>
     </w:p>
     <w:p>
       <w:pPr>
-        <w:pStyle w:val="Heading2"/>
+        <w:pStyle w:val="ListBullet"/>
       </w:pPr>
       <w:r>
-        <w:t>Key Technical Results (STAR Format) :</w:t>
+        <w:t>Développement d'un pipeline RAG avec chunking sémantique optimisé et filtrage par métadonnées garantissant zéro fuite de données confidentielles.</w:t>
       </w:r>
     </w:p>
     <w:p>
@@ -1033,15 +1314,15 @@
         <w:pStyle w:val="ListBullet"/>
       </w:pPr>
       <w:r>
-        <w:t>Architected a governed multi-agent orchestration platform using LangGraph (supervisor &amp; orchestrator graphs) executing complex operational workflows.</w:t>
+        <w:t>Rédaction d'une thèse d'ingénieur de 54 pages et soutenance devant jury académique et industriel (support de 22 slides).</w:t>
       </w:r>
     </w:p>
     <w:p>
       <w:pPr>
-        <w:pStyle w:val="ListBullet"/>
+        <w:pStyle w:val="Heading2"/>
       </w:pPr>
       <w:r>
-        <w:t>Engineered a production-ready RAG pipeline with semantic chunking and metadata-aware vector indexing with strict data privacy isolation.</w:t>
+        <w:t>Livrables &amp; Justificatifs Associés :</w:t>
       </w:r>
     </w:p>
     <w:p>
@@ -1049,15 +1330,15 @@
         <w:pStyle w:val="ListBullet"/>
       </w:pPr>
       <w:r>
-        <w:t>Authored a comprehensive 54-page engineering thesis and defended before an academic/corporate jury with 22 presentation slides.</w:t>
+        <w:t>Rapport technique disponible : reports/Rapport_de_Stage_Spielberg_2026.pdf</w:t>
       </w:r>
     </w:p>
     <w:p>
       <w:pPr>
-        <w:pStyle w:val="Heading2"/>
+        <w:pStyle w:val="ListBullet"/>
       </w:pPr>
       <w:r>
-        <w:t>Verified Deliverables &amp; Evidence :</w:t>
+        <w:t>Présentation / Soutenance : presentations/Soutenance_Spielberg.pdf</w:t>
       </w:r>
     </w:p>
     <w:p>
@@ -1065,39 +1346,7 @@
         <w:pStyle w:val="ListBullet"/>
       </w:pPr>
       <w:r>
-        <w:t>Technical Paper / Thesis : reports/Rapport_de_Stage_Spielberg_2026.pdf</w:t>
-      </w:r>
-    </w:p>
-    <w:p>
-      <w:pPr>
-        <w:pStyle w:val="ListBullet"/>
-      </w:pPr>
-      <w:r>
-        <w:t>Presentation Deck : presentations/Soutenance_Spielberg.pdf</w:t>
-      </w:r>
-    </w:p>
-    <w:p>
-      <w:pPr>
-        <w:pStyle w:val="ListBullet"/>
-      </w:pPr>
-      <w:r>
-        <w:t>Presentation Deck : presentations/Presentation_Stage_ENSIIE.pdf</w:t>
-      </w:r>
-    </w:p>
-    <w:p>
-      <w:pPr>
-        <w:pStyle w:val="ListBullet"/>
-      </w:pPr>
-      <w:r>
-        <w:t>System Architecture Diagram : architecture/orchestrator_graph.png</w:t>
-      </w:r>
-    </w:p>
-    <w:p>
-      <w:pPr>
-        <w:pStyle w:val="ListBullet"/>
-      </w:pPr>
-      <w:r>
-        <w:t>System Architecture Diagram : architecture/supervisor_graph.png</w:t>
+        <w:t>Présentation / Soutenance : presentations/Presentation_Stage_ENSIIE.pdf</w:t>
       </w:r>
     </w:p>
     <w:p/>
@@ -1106,20 +1355,18 @@
         <w:pStyle w:val="Heading1"/>
       </w:pPr>
       <w:r>
-        <w:t>2. ETLia: AI-Driven Automated ETL SaaS Platform (1st Prize Winner Challenge Entreprendre)</w:t>
+        <w:t>2. ETLia : Plateforme SaaS d'ETL Augmentée par l'IA (1er Prix Challenge Entreprendre)</w:t>
       </w:r>
     </w:p>
     <w:p>
       <w:r>
         <w:rPr>
           <w:i/>
-          <w:sz w:val="19"/>
+          <w:sz w:val="20"/>
         </w:rPr>
-        <w:t>Academic Context : ENSIIE (Challenge Entreprendre) (2025-2026) | Degree : ENSIIE</w:t>
+        <w:t>Contexte : ENSIIE (Challenge Entreprendre) (2025-2026) | Rôle : Co-fondateur &amp; Lead Data / AI Engineer</w:t>
         <w:br/>
-        <w:t>Role : Co-fondateur &amp; Lead Data / AI Engineer</w:t>
-        <w:br/>
-        <w:t>Domain : Data Engineering &amp; Fullstack AI SaaS</w:t>
+        <w:t>Domaine : Data Engineering &amp; Fullstack AI SaaS</w:t>
         <w:br/>
         <w:t>Technologies : React, TypeScript, Vite, TailwindCSS, Python, Streamlit, Pandas, Automated ETL, AI Mapping</w:t>
       </w:r>
@@ -1129,7 +1376,7 @@
         <w:pStyle w:val="Heading2"/>
       </w:pPr>
       <w:r>
-        <w:t>French Executive Summary (Synthèse) :</w:t>
+        <w:t>Synthèse Exécutive :</w:t>
       </w:r>
     </w:p>
     <w:p>
@@ -1142,20 +1389,23 @@
         <w:pStyle w:val="Heading2"/>
       </w:pPr>
       <w:r>
-        <w:t>English Project Overview :</w:t>
+        <w:t>Réalisations Clés &amp; Résultats (Format STAR) :</w:t>
       </w:r>
     </w:p>
     <w:p>
+      <w:pPr>
+        <w:pStyle w:val="ListBullet"/>
+      </w:pPr>
       <w:r>
-        <w:t>Co-founded and engineered ETLia, an AI-powered ETL platform streamlining data profiling, validation, and schema mapping. Won 1st place in the ENSIIE Entrepreneurship Challenge.</w:t>
+        <w:t>Co-fondation et développement d'ETLia, récompensée par le 1er prix du Challenge Entreprendre ENSIIE.</w:t>
       </w:r>
     </w:p>
     <w:p>
       <w:pPr>
-        <w:pStyle w:val="Heading2"/>
+        <w:pStyle w:val="ListBullet"/>
       </w:pPr>
       <w:r>
-        <w:t>Key Technical Results (STAR Format) :</w:t>
+        <w:t>Développement d'une interface web moderne (React/TypeScript/Tailwind) couplée à des moteurs de transformation de données en Python.</w:t>
       </w:r>
     </w:p>
     <w:p>
@@ -1163,15 +1413,15 @@
         <w:pStyle w:val="ListBullet"/>
       </w:pPr>
       <w:r>
-        <w:t>Co-founded ETLia and won 1st Prize in the ENSIIE Entrepreneurship Challenge.</w:t>
+        <w:t>Automatisation du mapping de schéma et de la détection d'anomalies à l'aide d'assistants IA intégrés.</w:t>
       </w:r>
     </w:p>
     <w:p>
       <w:pPr>
-        <w:pStyle w:val="ListBullet"/>
+        <w:pStyle w:val="Heading2"/>
       </w:pPr>
       <w:r>
-        <w:t>Built a high-performance React/TypeScript/Tailwind frontend backed by Python data transformation engines.</w:t>
+        <w:t>Livrables &amp; Justificatifs Associés :</w:t>
       </w:r>
     </w:p>
     <w:p>
@@ -1179,15 +1429,7 @@
         <w:pStyle w:val="ListBullet"/>
       </w:pPr>
       <w:r>
-        <w:t>Automated schema mapping and data anomaly detection using integrated AI models.</w:t>
-      </w:r>
-    </w:p>
-    <w:p>
-      <w:pPr>
-        <w:pStyle w:val="Heading2"/>
-      </w:pPr>
-      <w:r>
-        <w:t>Verified Deliverables &amp; Evidence :</w:t>
+        <w:t>Code source et documentation intégrés dans le dossier projet.</w:t>
       </w:r>
     </w:p>
     <w:p/>
@@ -1196,20 +1438,18 @@
         <w:pStyle w:val="Heading1"/>
       </w:pPr>
       <w:r>
-        <w:t>3. Production-Grade Docker ETL Pipeline &amp; Dimensional Star-Schema Datamart</w:t>
+        <w:t>3. Pipeline ETL Conteneurisé &amp; Modélisation Datamart en Étoile (SunSéjour)</w:t>
       </w:r>
     </w:p>
     <w:p>
       <w:r>
         <w:rPr>
           <w:i/>
-          <w:sz w:val="19"/>
+          <w:sz w:val="20"/>
         </w:rPr>
-        <w:t>Academic Context : ENSIIE (2025-2026) | Degree : ENSIIE</w:t>
+        <w:t>Contexte : ENSIIE (2025-2026) | Rôle : Data Engineer Lead</w:t>
         <w:br/>
-        <w:t>Role : Data Engineer Lead</w:t>
-        <w:br/>
-        <w:t>Domain : Data Engineering &amp; Data Warehousing</w:t>
+        <w:t>Domaine : Data Engineering &amp; Data Warehousing</w:t>
         <w:br/>
         <w:t>Technologies : Python, Docker, Docker Compose, Pandas, Star Schema, Data Validation, Logging, Automated Export</w:t>
       </w:r>
@@ -1219,7 +1459,7 @@
         <w:pStyle w:val="Heading2"/>
       </w:pPr>
       <w:r>
-        <w:t>French Executive Summary (Synthèse) :</w:t>
+        <w:t>Synthèse Exécutive :</w:t>
       </w:r>
     </w:p>
     <w:p>
@@ -1232,20 +1472,23 @@
         <w:pStyle w:val="Heading2"/>
       </w:pPr>
       <w:r>
-        <w:t>English Project Overview :</w:t>
+        <w:t>Réalisations Clés &amp; Résultats (Format STAR) :</w:t>
       </w:r>
     </w:p>
     <w:p>
+      <w:pPr>
+        <w:pStyle w:val="ListBullet"/>
+      </w:pPr>
       <w:r>
-        <w:t>Engineered a containerized Docker ETL pipeline managing automated ingestion, strict validation, and star-schema dimensional modeling for tourism operations.</w:t>
+        <w:t>Création d'un pipeline complet (Extract, Transform, Load) traitant des fichiers transactionnels hétérogènes (.xls, .xlsx).</w:t>
       </w:r>
     </w:p>
     <w:p>
       <w:pPr>
-        <w:pStyle w:val="Heading2"/>
+        <w:pStyle w:val="ListBullet"/>
       </w:pPr>
       <w:r>
-        <w:t>Key Technical Results (STAR Format) :</w:t>
+        <w:t>Mise en place d'une modélisation dimensionnelle en étoile (tables de faits et dimensions) pour le calcul automatisé du CA et des marges.</w:t>
       </w:r>
     </w:p>
     <w:p>
@@ -1253,15 +1496,15 @@
         <w:pStyle w:val="ListBullet"/>
       </w:pPr>
       <w:r>
-        <w:t>Engineered an end-to-end ETL pipeline processing heterogeneous transactional records with automated quality checks.</w:t>
+        <w:t>Conteneurisation complète sous Docker avec suite de validation de qualité et traçabilité des anomalies.</w:t>
       </w:r>
     </w:p>
     <w:p>
       <w:pPr>
-        <w:pStyle w:val="ListBullet"/>
+        <w:pStyle w:val="Heading2"/>
       </w:pPr>
       <w:r>
-        <w:t>Designed a dimensional star schema (facts &amp; dimensions) automating revenue, margin, and operational metrics calculation.</w:t>
+        <w:t>Livrables &amp; Justificatifs Associés :</w:t>
       </w:r>
     </w:p>
     <w:p>
@@ -1269,31 +1512,15 @@
         <w:pStyle w:val="ListBullet"/>
       </w:pPr>
       <w:r>
-        <w:t>Containerized deployment using Docker &amp; Docker Compose with full anomaly logging and validation suite.</w:t>
+        <w:t>Rapport technique disponible : reports/Rapport_Datamart_SunSejour.pdf</w:t>
       </w:r>
     </w:p>
     <w:p>
       <w:pPr>
-        <w:pStyle w:val="Heading2"/>
+        <w:pStyle w:val="ListBullet"/>
       </w:pPr>
       <w:r>
-        <w:t>Verified Deliverables &amp; Evidence :</w:t>
-      </w:r>
-    </w:p>
-    <w:p>
-      <w:pPr>
-        <w:pStyle w:val="ListBullet"/>
-      </w:pPr>
-      <w:r>
-        <w:t>Technical Paper / Thesis : reports/Rapport_Datamart_SunSejour.pdf</w:t>
-      </w:r>
-    </w:p>
-    <w:p>
-      <w:pPr>
-        <w:pStyle w:val="ListBullet"/>
-      </w:pPr>
-      <w:r>
-        <w:t>Technical Paper / Thesis : reports/Guide_Utilisation_ETL_SunSejour.pdf</w:t>
+        <w:t>Rapport technique disponible : reports/Guide_Utilisation_ETL_SunSejour.pdf</w:t>
       </w:r>
     </w:p>
     <w:p/>
@@ -1302,20 +1529,18 @@
         <w:pStyle w:val="Heading1"/>
       </w:pPr>
       <w:r>
-        <w:t>4. Financial Time Series Forecasting &amp; Calibrated Credit Scoring ML</w:t>
+        <w:t>4. Séries Temporelles Financières &amp; Scoring de Crédit Calibré (Gainde 2000)</w:t>
       </w:r>
     </w:p>
     <w:p>
       <w:r>
         <w:rPr>
           <w:i/>
-          <w:sz w:val="19"/>
+          <w:sz w:val="20"/>
         </w:rPr>
-        <w:t>Academic Context : Gainde 2000 / Bangath Systems (2024-2025) | Degree : ENSIIE</w:t>
+        <w:t>Contexte : Gainde 2000 / Bangath Systems (2024-2025) | Rôle : Data Scientist / Machine Learning Engineer Intern</w:t>
         <w:br/>
-        <w:t>Role : Data Scientist / Machine Learning Engineer Intern</w:t>
-        <w:br/>
-        <w:t>Domain : Applied Machine Learning &amp; Time Series</w:t>
+        <w:t>Domaine : Applied Machine Learning &amp; Time Series</w:t>
         <w:br/>
         <w:t>Technologies : Python, Pandas, Scikit-Learn, Statsmodels, SARIMAX, VAR, DLTS, Credit Scoring, Model Calibration</w:t>
       </w:r>
@@ -1325,7 +1550,7 @@
         <w:pStyle w:val="Heading2"/>
       </w:pPr>
       <w:r>
-        <w:t>French Executive Summary (Synthèse) :</w:t>
+        <w:t>Synthèse Exécutive :</w:t>
       </w:r>
     </w:p>
     <w:p>
@@ -1338,20 +1563,23 @@
         <w:pStyle w:val="Heading2"/>
       </w:pPr>
       <w:r>
-        <w:t>English Project Overview :</w:t>
+        <w:t>Réalisations Clés &amp; Résultats (Format STAR) :</w:t>
       </w:r>
     </w:p>
     <w:p>
+      <w:pPr>
+        <w:pStyle w:val="ListBullet"/>
+      </w:pPr>
       <w:r>
-        <w:t>Predictive modeling of financial time series (SARIMAX, VAR, Deep Learning) and development of calibrated credit default risk scoring algorithms.</w:t>
+        <w:t>Modélisation multivariée de flux financiers via SARIMA, SARIMAX et VAR (Vector Auto-Regression).</w:t>
       </w:r>
     </w:p>
     <w:p>
       <w:pPr>
-        <w:pStyle w:val="Heading2"/>
+        <w:pStyle w:val="ListBullet"/>
       </w:pPr>
       <w:r>
-        <w:t>Key Technical Results (STAR Format) :</w:t>
+        <w:t>Développement et calibration d'un modèle de scoring d'octroi de crédit (Use Case 7) optimisant les seuils de décision.</w:t>
       </w:r>
     </w:p>
     <w:p>
@@ -1359,15 +1587,15 @@
         <w:pStyle w:val="ListBullet"/>
       </w:pPr>
       <w:r>
-        <w:t>Formulated multivariate econometric forecasting pipelines leveraging SARIMA, SARIMAX, and VAR models.</w:t>
+        <w:t>Rédaction d'un rapport de stage complet et soutenance devant jury avec support de présentation de 23 slides.</w:t>
       </w:r>
     </w:p>
     <w:p>
       <w:pPr>
-        <w:pStyle w:val="ListBullet"/>
+        <w:pStyle w:val="Heading2"/>
       </w:pPr>
       <w:r>
-        <w:t>Built and calibrated a credit default scoring model (Use Case 7) optimizing probability calibration curves and decision thresholds.</w:t>
+        <w:t>Livrables &amp; Justificatifs Associés :</w:t>
       </w:r>
     </w:p>
     <w:p>
@@ -1375,15 +1603,15 @@
         <w:pStyle w:val="ListBullet"/>
       </w:pPr>
       <w:r>
-        <w:t>Authored full technical internship report and delivered a 23-slide defense presentation.</w:t>
+        <w:t>Rapport technique disponible : reports/Rapport_de_Stage.pdf</w:t>
       </w:r>
     </w:p>
     <w:p>
       <w:pPr>
-        <w:pStyle w:val="Heading2"/>
+        <w:pStyle w:val="ListBullet"/>
       </w:pPr>
       <w:r>
-        <w:t>Verified Deliverables &amp; Evidence :</w:t>
+        <w:t>Rapport technique disponible : reports/Rapport_Use_Case_7_Scoring.pdf</w:t>
       </w:r>
     </w:p>
     <w:p>
@@ -1391,23 +1619,7 @@
         <w:pStyle w:val="ListBullet"/>
       </w:pPr>
       <w:r>
-        <w:t>Technical Paper / Thesis : reports/Rapport_de_Stage.pdf</w:t>
-      </w:r>
-    </w:p>
-    <w:p>
-      <w:pPr>
-        <w:pStyle w:val="ListBullet"/>
-      </w:pPr>
-      <w:r>
-        <w:t>Technical Paper / Thesis : reports/Rapport_Use_Case_7_Scoring.pdf</w:t>
-      </w:r>
-    </w:p>
-    <w:p>
-      <w:pPr>
-        <w:pStyle w:val="ListBullet"/>
-      </w:pPr>
-      <w:r>
-        <w:t>Presentation Deck : presentations/Presentation_de_Stage.pdf</w:t>
+        <w:t>Présentation / Soutenance : presentations/Presentation_de_Stage.pdf</w:t>
       </w:r>
     </w:p>
     <w:p/>
@@ -1416,20 +1628,18 @@
         <w:pStyle w:val="Heading1"/>
       </w:pPr>
       <w:r>
-        <w:t>5. Semantic Representations, Text Classification &amp; Hybrid BiLSTM-CNN NER</w:t>
+        <w:t>5. Représentations Sémantiques, Classification CNN/Transformers &amp; NER Hybride</w:t>
       </w:r>
     </w:p>
     <w:p>
       <w:r>
         <w:rPr>
           <w:i/>
-          <w:sz w:val="19"/>
+          <w:sz w:val="20"/>
         </w:rPr>
-        <w:t>Academic Context : Université Paris-Saclay &amp; ENSIIE (Master 2 IA) (2025-2026) | Degree : Master 2 Intelligence Artificielle (Université Paris-Saclay)</w:t>
+        <w:t>Contexte : Université Paris-Saclay &amp; ENSIIE (Master 2 IA) (2025-2026) | Rôle : NLP &amp; Deep Learning Researcher</w:t>
         <w:br/>
-        <w:t>Role : NLP &amp; Deep Learning Researcher</w:t>
-        <w:br/>
-        <w:t>Domain : Deep Learning &amp; NLP</w:t>
+        <w:t>Domaine : Deep Learning &amp; NLP</w:t>
         <w:br/>
         <w:t>Technologies : PyTorch, Transformers, Word2Vec, FastText, BiLSTM-CNN, NER, NLP, Python, Bash</w:t>
       </w:r>
@@ -1439,7 +1649,7 @@
         <w:pStyle w:val="Heading2"/>
       </w:pPr>
       <w:r>
-        <w:t>French Executive Summary (Synthèse) :</w:t>
+        <w:t>Synthèse Exécutive :</w:t>
       </w:r>
     </w:p>
     <w:p>
@@ -1452,20 +1662,23 @@
         <w:pStyle w:val="Heading2"/>
       </w:pPr>
       <w:r>
-        <w:t>English Project Overview :</w:t>
+        <w:t>Réalisations Clés &amp; Résultats (Format STAR) :</w:t>
       </w:r>
     </w:p>
     <w:p>
+      <w:pPr>
+        <w:pStyle w:val="ListBullet"/>
+      </w:pPr>
       <w:r>
-        <w:t>Trained and benchmarked dense semantic embeddings (Word2Vec, FastText), text classifiers (1D CNN vs Transformers), and hybrid BiLSTM-CNN for Named Entity Recognition on French news corpora.</w:t>
+        <w:t>Entraînement de plongements lexicaux (Word2Vec Skip-gram/CBOW, FastText) sur le corpus journalistique français QUAERO.</w:t>
       </w:r>
     </w:p>
     <w:p>
       <w:pPr>
-        <w:pStyle w:val="Heading2"/>
+        <w:pStyle w:val="ListBullet"/>
       </w:pPr>
       <w:r>
-        <w:t>Key Technical Results (STAR Format) :</w:t>
+        <w:t>Implémentation et comparaison d'architectures de classification : Convolutions 1D (CNN) vs modèles Transformers.</w:t>
       </w:r>
     </w:p>
     <w:p>
@@ -1473,15 +1686,15 @@
         <w:pStyle w:val="ListBullet"/>
       </w:pPr>
       <w:r>
-        <w:t>Trained dense word representation models (Word2Vec Skip-Gram/CBOW, FastText) on the QUAERO French news corpus.</w:t>
+        <w:t>Conception d'une architecture neuronale hybride BiLSTM-CNN pour la reconnaissance d'entités nommées (NER) avec rapport de recherche.</w:t>
       </w:r>
     </w:p>
     <w:p>
       <w:pPr>
-        <w:pStyle w:val="ListBullet"/>
+        <w:pStyle w:val="Heading2"/>
       </w:pPr>
       <w:r>
-        <w:t>Implemented and benchmarked deep text classification pipelines comparing 1D CNNs against Transformer architectures.</w:t>
+        <w:t>Livrables &amp; Justificatifs Associés :</w:t>
       </w:r>
     </w:p>
     <w:p>
@@ -1489,31 +1702,15 @@
         <w:pStyle w:val="ListBullet"/>
       </w:pPr>
       <w:r>
-        <w:t>Engineered a hybrid BiLSTM-CNN neural architecture for Named Entity Recognition (NER) and authored an extensive research paper.</w:t>
+        <w:t>Rapport technique disponible : reports/Report_CISSE_DIOP.pdf</w:t>
       </w:r>
     </w:p>
     <w:p>
       <w:pPr>
-        <w:pStyle w:val="Heading2"/>
+        <w:pStyle w:val="ListBullet"/>
       </w:pPr>
       <w:r>
-        <w:t>Verified Deliverables &amp; Evidence :</w:t>
-      </w:r>
-    </w:p>
-    <w:p>
-      <w:pPr>
-        <w:pStyle w:val="ListBullet"/>
-      </w:pPr>
-      <w:r>
-        <w:t>Technical Paper / Thesis : reports/Report_CISSE_DIOP.pdf</w:t>
-      </w:r>
-    </w:p>
-    <w:p>
-      <w:pPr>
-        <w:pStyle w:val="ListBullet"/>
-      </w:pPr>
-      <w:r>
-        <w:t>Technical Paper / Thesis : reports/Rapport_TP_Embeddings.pdf</w:t>
+        <w:t>Rapport technique disponible : reports/Rapport_TP_Embeddings.pdf</w:t>
       </w:r>
     </w:p>
     <w:p/>
@@ -1522,20 +1719,18 @@
         <w:pStyle w:val="Heading1"/>
       </w:pPr>
       <w:r>
-        <w:t>6. Modern C++17 Black-Scholes PDE Numerical Solver &amp; Real-Time SDL2 Visualization</w:t>
+        <w:t>6. Solveur EDP Black-Scholes en C++17 &amp; Rendu Graphique Temps Réel SDL2</w:t>
       </w:r>
     </w:p>
     <w:p>
       <w:r>
         <w:rPr>
           <w:i/>
-          <w:sz w:val="19"/>
+          <w:sz w:val="20"/>
         </w:rPr>
-        <w:t>Academic Context : ENSIIE (2A PRAV) (2024-2025) | Degree : ENSIIE</w:t>
+        <w:t>Contexte : ENSIIE (2A PRAV) (2024-2025) | Rôle : Quantitative Developer</w:t>
         <w:br/>
-        <w:t>Role : Quantitative Developer</w:t>
-        <w:br/>
-        <w:t>Domain : Quantitative Finance &amp; Scientific Computing</w:t>
+        <w:t>Domaine : Quantitative Finance &amp; Scientific Computing</w:t>
         <w:br/>
         <w:t>Technologies : C++17, STL, Finite Differences, PDE, Black-Scholes, SDL2, OOP, Numerical Analysis</w:t>
       </w:r>
@@ -1545,7 +1740,7 @@
         <w:pStyle w:val="Heading2"/>
       </w:pPr>
       <w:r>
-        <w:t>French Executive Summary (Synthèse) :</w:t>
+        <w:t>Synthèse Exécutive :</w:t>
       </w:r>
     </w:p>
     <w:p>
@@ -1558,20 +1753,23 @@
         <w:pStyle w:val="Heading2"/>
       </w:pPr>
       <w:r>
-        <w:t>English Project Overview :</w:t>
+        <w:t>Réalisations Clés &amp; Résultats (Format STAR) :</w:t>
       </w:r>
     </w:p>
     <w:p>
+      <w:pPr>
+        <w:pStyle w:val="ListBullet"/>
+      </w:pPr>
       <w:r>
-        <w:t>Engineered an object-oriented C++17 numerical solver for European option pricing solving the Black-Scholes PDE via finite difference schemes with Greeks sensitivity calculations and real-time SDL2 graphics.</w:t>
+        <w:t>Implémentation orientée objet en C++17 d'un solveur numérique pour l'EDP de Black-Scholes par différences finies (schémas implicite et explicite).</w:t>
       </w:r>
     </w:p>
     <w:p>
       <w:pPr>
-        <w:pStyle w:val="Heading2"/>
+        <w:pStyle w:val="ListBullet"/>
       </w:pPr>
       <w:r>
-        <w:t>Key Technical Results (STAR Format) :</w:t>
+        <w:t>Calcul dynamique des prix Call/Put et des sensibilités financières (Grecs), avec convergence et analyse des erreurs résiduelles.</w:t>
       </w:r>
     </w:p>
     <w:p>
@@ -1579,15 +1777,15 @@
         <w:pStyle w:val="ListBullet"/>
       </w:pPr>
       <w:r>
-        <w:t>Engineered an object-oriented C++17 numerical solver for the Black-Scholes PDE using explicit and implicit finite-difference schemes.</w:t>
+        <w:t>Intégration d'une interface graphique interactive temps réel avec la bibliothèque SDL2 pour tracer l'évolution temporelle des payoffs.</w:t>
       </w:r>
     </w:p>
     <w:p>
       <w:pPr>
-        <w:pStyle w:val="ListBullet"/>
+        <w:pStyle w:val="Heading2"/>
       </w:pPr>
       <w:r>
-        <w:t>Computed Call/Put pricing matrices and Greeks sensitivities with rigorous stability and residual error convergence analysis.</w:t>
+        <w:t>Livrables &amp; Justificatifs Associés :</w:t>
       </w:r>
     </w:p>
     <w:p>
@@ -1595,55 +1793,7 @@
         <w:pStyle w:val="ListBullet"/>
       </w:pPr>
       <w:r>
-        <w:t>Integrated real-time interactive graphic rendering of option payoff curves using the SDL2 library.</w:t>
-      </w:r>
-    </w:p>
-    <w:p>
-      <w:pPr>
-        <w:pStyle w:val="Heading2"/>
-      </w:pPr>
-      <w:r>
-        <w:t>Verified Deliverables &amp; Evidence :</w:t>
-      </w:r>
-    </w:p>
-    <w:p>
-      <w:pPr>
-        <w:pStyle w:val="ListBullet"/>
-      </w:pPr>
-      <w:r>
-        <w:t>Technical Paper / Thesis : reports/Rapport_Black_Scholes.pdf</w:t>
-      </w:r>
-    </w:p>
-    <w:p>
-      <w:pPr>
-        <w:pStyle w:val="ListBullet"/>
-      </w:pPr>
-      <w:r>
-        <w:t>System Architecture Diagram : visuals/call.png</w:t>
-      </w:r>
-    </w:p>
-    <w:p>
-      <w:pPr>
-        <w:pStyle w:val="ListBullet"/>
-      </w:pPr>
-      <w:r>
-        <w:t>System Architecture Diagram : visuals/Put.png</w:t>
-      </w:r>
-    </w:p>
-    <w:p>
-      <w:pPr>
-        <w:pStyle w:val="ListBullet"/>
-      </w:pPr>
-      <w:r>
-        <w:t>System Architecture Diagram : visuals/erreur call.png</w:t>
-      </w:r>
-    </w:p>
-    <w:p>
-      <w:pPr>
-        <w:pStyle w:val="ListBullet"/>
-      </w:pPr>
-      <w:r>
-        <w:t>System Architecture Diagram : visuals/UML.png</w:t>
+        <w:t>Rapport technique disponible : reports/Rapport_Black_Scholes.pdf</w:t>
       </w:r>
     </w:p>
     <w:p/>
@@ -1652,20 +1802,18 @@
         <w:pStyle w:val="Heading1"/>
       </w:pPr>
       <w:r>
-        <w:t>7. Biostatistical Survival &amp; Recurrence Modeling on METABRIC Cohort Data</w:t>
+        <w:t>7. Modélisation Statistique &amp; Prédiction de Survie du Cancer du Sein (METABRIC)</w:t>
       </w:r>
     </w:p>
     <w:p>
       <w:r>
         <w:rPr>
           <w:i/>
-          <w:sz w:val="19"/>
+          <w:sz w:val="20"/>
         </w:rPr>
-        <w:t>Academic Context : ENSIIE (2A MERR) (2024-2025) | Degree : ENSIIE</w:t>
+        <w:t>Contexte : ENSIIE (2A MERR) (2024-2025) | Rôle : Biostatistician &amp; Data Scientist</w:t>
         <w:br/>
-        <w:t>Role : Biostatistician &amp; Data Scientist</w:t>
-        <w:br/>
-        <w:t>Domain : Biostatistics &amp; Machine Learning</w:t>
+        <w:t>Domaine : Biostatistics &amp; Machine Learning</w:t>
         <w:br/>
         <w:t>Technologies : R, RMarkdown, GLM, Logistic Regression, Lasso, Ridge, Elastic Net, Variable Selection, ROC-AUC</w:t>
       </w:r>
@@ -1675,7 +1823,7 @@
         <w:pStyle w:val="Heading2"/>
       </w:pPr>
       <w:r>
-        <w:t>French Executive Summary (Synthèse) :</w:t>
+        <w:t>Synthèse Exécutive :</w:t>
       </w:r>
     </w:p>
     <w:p>
@@ -1688,20 +1836,23 @@
         <w:pStyle w:val="Heading2"/>
       </w:pPr>
       <w:r>
-        <w:t>English Project Overview :</w:t>
+        <w:t>Réalisations Clés &amp; Résultats (Format STAR) :</w:t>
       </w:r>
     </w:p>
     <w:p>
+      <w:pPr>
+        <w:pStyle w:val="ListBullet"/>
+      </w:pPr>
       <w:r>
-        <w:t>Biostatistical classification of 5-year patient survival utilizing high-dimensional clinical and genomic expression profiles from the 2,000+ patient METABRIC cohort.</w:t>
+        <w:t>Exploration et prétraitement de données génomiques et cliniques haute dimension (cohorte METABRIC).</w:t>
       </w:r>
     </w:p>
     <w:p>
       <w:pPr>
-        <w:pStyle w:val="Heading2"/>
+        <w:pStyle w:val="ListBullet"/>
       </w:pPr>
       <w:r>
-        <w:t>Key Technical Results (STAR Format) :</w:t>
+        <w:t>Ajustement de modèles linéaires généralisés (GLM binomial) et sélection parcimonieuse de covariables (AIC/BIC, régularisation Lasso/Elastic Net).</w:t>
       </w:r>
     </w:p>
     <w:p>
@@ -1709,15 +1860,15 @@
         <w:pStyle w:val="ListBullet"/>
       </w:pPr>
       <w:r>
-        <w:t>Curated and preprocessed high-dimensional clinical and gene expression features from the 2,000+ patient METABRIC cohort.</w:t>
+        <w:t>Évaluation rigoureuse des performances prédictives via courbes ROC-AUC, matrice de confusion et validation croisée.</w:t>
       </w:r>
     </w:p>
     <w:p>
       <w:pPr>
-        <w:pStyle w:val="ListBullet"/>
+        <w:pStyle w:val="Heading2"/>
       </w:pPr>
       <w:r>
-        <w:t>Fitted binomial Generalized Linear Models (GLM) with penalized variable selection (Lasso, Elastic Net, Stepwise AIC/BIC).</w:t>
+        <w:t>Livrables &amp; Justificatifs Associés :</w:t>
       </w:r>
     </w:p>
     <w:p>
@@ -1725,23 +1876,7 @@
         <w:pStyle w:val="ListBullet"/>
       </w:pPr>
       <w:r>
-        <w:t>Evaluated classification performance through cross-validated ROC-AUC analysis, sensitivity/specificity tradeoffs, and calibration.</w:t>
-      </w:r>
-    </w:p>
-    <w:p>
-      <w:pPr>
-        <w:pStyle w:val="Heading2"/>
-      </w:pPr>
-      <w:r>
-        <w:t>Verified Deliverables &amp; Evidence :</w:t>
-      </w:r>
-    </w:p>
-    <w:p>
-      <w:pPr>
-        <w:pStyle w:val="ListBullet"/>
-      </w:pPr>
-      <w:r>
-        <w:t>Technical Paper / Thesis : reports/Rapport_Cancer_Survie_MERR.pdf</w:t>
+        <w:t>Rapport technique disponible : reports/Rapport_Cancer_Survie_MERR.pdf</w:t>
       </w:r>
     </w:p>
     <w:p/>
@@ -1750,20 +1885,18 @@
         <w:pStyle w:val="Heading1"/>
       </w:pPr>
       <w:r>
-        <w:t>8. Multivariate Analysis &amp; Unsupervised Clustering of Airbnb NYC Listings</w:t>
+        <w:t>8. Analyse Factorielle &amp; Clustering sur le Marché Airbnb New York City</w:t>
       </w:r>
     </w:p>
     <w:p>
       <w:r>
         <w:rPr>
           <w:i/>
-          <w:sz w:val="19"/>
+          <w:sz w:val="20"/>
         </w:rPr>
-        <w:t>Academic Context : ENSIIE (2A ANDO) (2024-2025) | Degree : ENSIIE</w:t>
+        <w:t>Contexte : ENSIIE (2A ANDO) (2024-2025) | Rôle : Data Analyst / ML</w:t>
         <w:br/>
-        <w:t>Role : Data Analyst / ML</w:t>
-        <w:br/>
-        <w:t>Domain : Unsupervised Learning &amp; Data Analysis</w:t>
+        <w:t>Domaine : Unsupervised Learning &amp; Data Analysis</w:t>
         <w:br/>
         <w:t>Technologies : Python, Scikit-Learn, Pandas, Matplotlib, Seaborn, ACP (PCA), ACC (CCA), K-Means, Clustering Hiérarchique</w:t>
       </w:r>
@@ -1773,7 +1906,7 @@
         <w:pStyle w:val="Heading2"/>
       </w:pPr>
       <w:r>
-        <w:t>French Executive Summary (Synthèse) :</w:t>
+        <w:t>Synthèse Exécutive :</w:t>
       </w:r>
     </w:p>
     <w:p>
@@ -1786,20 +1919,23 @@
         <w:pStyle w:val="Heading2"/>
       </w:pPr>
       <w:r>
-        <w:t>English Project Overview :</w:t>
+        <w:t>Réalisations Clés &amp; Résultats (Format STAR) :</w:t>
       </w:r>
     </w:p>
     <w:p>
+      <w:pPr>
+        <w:pStyle w:val="ListBullet"/>
+      </w:pPr>
       <w:r>
-        <w:t>Multivariate exploratory analysis and market segmentation of 48,000+ NYC Airbnb listings using PCA, Canonical Correlation Analysis, and K-Means clustering.</w:t>
+        <w:t>Traitement et analyse exploratoire de 48 000+ observations du marché Airbnb New York.</w:t>
       </w:r>
     </w:p>
     <w:p>
       <w:pPr>
-        <w:pStyle w:val="Heading2"/>
+        <w:pStyle w:val="ListBullet"/>
       </w:pPr>
       <w:r>
-        <w:t>Key Technical Results (STAR Format) :</w:t>
+        <w:t>Réduction de dimensionnalité via Analyse en Composantes Principales (ACP) et analyse des relations multidimensionnelles par ACC.</w:t>
       </w:r>
     </w:p>
     <w:p>
@@ -1807,15 +1943,15 @@
         <w:pStyle w:val="ListBullet"/>
       </w:pPr>
       <w:r>
-        <w:t>Processed and cleaned 48,000+ rental listings from the New York City Airbnb open dataset.</w:t>
+        <w:t>Segmentation des logements et des quartiers par K-Means et Classification Ascendante Hiérarchique (CAH) avec soutenance et rapport.</w:t>
       </w:r>
     </w:p>
     <w:p>
       <w:pPr>
-        <w:pStyle w:val="ListBullet"/>
+        <w:pStyle w:val="Heading2"/>
       </w:pPr>
       <w:r>
-        <w:t>Conducted dimensionality reduction with Principal Component Analysis (PCA) and multivariate correlation mapping with CCA.</w:t>
+        <w:t>Livrables &amp; Justificatifs Associés :</w:t>
       </w:r>
     </w:p>
     <w:p>
@@ -1823,15 +1959,15 @@
         <w:pStyle w:val="ListBullet"/>
       </w:pPr>
       <w:r>
-        <w:t>Segmented listings and neighborhood pricing profiles via K-Means and Hierarchical Clustering, presenting insights with 2 slide decks.</w:t>
+        <w:t>Rapport technique disponible : reports/Rapport_Analyse_Donnees_ANDO.pdf</w:t>
       </w:r>
     </w:p>
     <w:p>
       <w:pPr>
-        <w:pStyle w:val="Heading2"/>
+        <w:pStyle w:val="ListBullet"/>
       </w:pPr>
       <w:r>
-        <w:t>Verified Deliverables &amp; Evidence :</w:t>
+        <w:t>Présentation / Soutenance : presentations/Presentation_Partie_1.pdf</w:t>
       </w:r>
     </w:p>
     <w:p>
@@ -1839,23 +1975,7 @@
         <w:pStyle w:val="ListBullet"/>
       </w:pPr>
       <w:r>
-        <w:t>Technical Paper / Thesis : reports/Rapport_Analyse_Donnees_ANDO.pdf</w:t>
-      </w:r>
-    </w:p>
-    <w:p>
-      <w:pPr>
-        <w:pStyle w:val="ListBullet"/>
-      </w:pPr>
-      <w:r>
-        <w:t>Presentation Deck : presentations/Presentation_Partie_1.pdf</w:t>
-      </w:r>
-    </w:p>
-    <w:p>
-      <w:pPr>
-        <w:pStyle w:val="ListBullet"/>
-      </w:pPr>
-      <w:r>
-        <w:t>Presentation Deck : presentations/Presentation_Partie_2.pdf</w:t>
+        <w:t>Présentation / Soutenance : presentations/Presentation_Partie_2.pdf</w:t>
       </w:r>
     </w:p>
     <w:p/>
@@ -1864,20 +1984,18 @@
         <w:pStyle w:val="Heading1"/>
       </w:pPr>
       <w:r>
-        <w:t>9. Nash-DQN: Deep Q-Learning for Nash Equilibria in Multi-Agent Optimal Execution</w:t>
+        <w:t>9. Nash-DQN : Deep Q-Learning pour Équilibres de Nash en Trading Multi-Agents</w:t>
       </w:r>
     </w:p>
     <w:p>
       <w:r>
         <w:rPr>
           <w:i/>
-          <w:sz w:val="19"/>
+          <w:sz w:val="20"/>
         </w:rPr>
-        <w:t>Academic Context : McMaster University (MATH 4FM3) (2026) | Degree : McMaster University Exchange</w:t>
+        <w:t>Contexte : McMaster University (MATH 4FM3) (2026) | Rôle : Quantitative Researcher / RL Engineer</w:t>
         <w:br/>
-        <w:t>Role : Quantitative Researcher / RL Engineer</w:t>
-        <w:br/>
-        <w:t>Domain : Quantitative Finance &amp; Reinforcement Learning</w:t>
+        <w:t>Domaine : Quantitative Finance &amp; Reinforcement Learning</w:t>
         <w:br/>
         <w:t>Technologies : Python, PyTorch, Deep Q-Learning (DQN), Multi-Agent RL, Stochastic Games, Optimal Execution, Mouvement Brownien</w:t>
       </w:r>
@@ -1887,7 +2005,7 @@
         <w:pStyle w:val="Heading2"/>
       </w:pPr>
       <w:r>
-        <w:t>French Executive Summary (Synthèse) :</w:t>
+        <w:t>Synthèse Exécutive :</w:t>
       </w:r>
     </w:p>
     <w:p>
@@ -1900,20 +2018,23 @@
         <w:pStyle w:val="Heading2"/>
       </w:pPr>
       <w:r>
-        <w:t>English Project Overview :</w:t>
+        <w:t>Réalisations Clés &amp; Résultats (Format STAR) :</w:t>
       </w:r>
     </w:p>
     <w:p>
+      <w:pPr>
+        <w:pStyle w:val="ListBullet"/>
+      </w:pPr>
       <w:r>
-        <w:t>Engineered an N-agent stochastic market simulator and trained Deep Q-Networks (Nash-DQN) converging to Nash equilibrium for multi-agent optimal liquidation (Casgrain, Ning &amp; Jaimungal, 2022).</w:t>
+        <w:t>Conception d'un simulateur de marché stochastique sous forme de jeu différentiel à N agents avec impact de marché temporaire et permanent.</w:t>
       </w:r>
     </w:p>
     <w:p>
       <w:pPr>
-        <w:pStyle w:val="Heading2"/>
+        <w:pStyle w:val="ListBullet"/>
       </w:pPr>
       <w:r>
-        <w:t>Key Technical Results (STAR Format) :</w:t>
+        <w:t>Développement d'un algorithme Nash-DQN avec replay buffer priorisé et réseaux cible pour l'apprentissage de politiques de trading compétitives.</w:t>
       </w:r>
     </w:p>
     <w:p>
@@ -1921,15 +2042,15 @@
         <w:pStyle w:val="ListBullet"/>
       </w:pPr>
       <w:r>
-        <w:t>Architected an N-agent stochastic differential game environment modeling temporary and permanent market price impact.</w:t>
+        <w:t>Rédaction d'une thèse de recherche mathématique de 34 pages accompagnée de visualisations des trajectoires browniennes et récompenses cumulées.</w:t>
       </w:r>
     </w:p>
     <w:p>
       <w:pPr>
-        <w:pStyle w:val="ListBullet"/>
+        <w:pStyle w:val="Heading2"/>
       </w:pPr>
       <w:r>
-        <w:t>Trained a Nash-DQN multi-agent reinforcement learning policy with experience replay to discover competitive Nash equilibrium strategies.</w:t>
+        <w:t>Livrables &amp; Justificatifs Associés :</w:t>
       </w:r>
     </w:p>
     <w:p>
@@ -1937,47 +2058,15 @@
         <w:pStyle w:val="ListBullet"/>
       </w:pPr>
       <w:r>
-        <w:t>Authored a comprehensive 34-page quantitative research paper with extensive trajectory and convergence reward diagnostics.</w:t>
+        <w:t>Rapport technique disponible : reports/Rapport_Nash_DQN_Optimal_Trading.pdf</w:t>
       </w:r>
     </w:p>
     <w:p>
       <w:pPr>
-        <w:pStyle w:val="Heading2"/>
+        <w:pStyle w:val="ListBullet"/>
       </w:pPr>
       <w:r>
-        <w:t>Verified Deliverables &amp; Evidence :</w:t>
-      </w:r>
-    </w:p>
-    <w:p>
-      <w:pPr>
-        <w:pStyle w:val="ListBullet"/>
-      </w:pPr>
-      <w:r>
-        <w:t>Technical Paper / Thesis : reports/Rapport_Nash_DQN_Optimal_Trading.pdf</w:t>
-      </w:r>
-    </w:p>
-    <w:p>
-      <w:pPr>
-        <w:pStyle w:val="ListBullet"/>
-      </w:pPr>
-      <w:r>
-        <w:t>Technical Paper / Thesis : reports/Project_Roadmap.pdf</w:t>
-      </w:r>
-    </w:p>
-    <w:p>
-      <w:pPr>
-        <w:pStyle w:val="ListBullet"/>
-      </w:pPr>
-      <w:r>
-        <w:t>System Architecture Diagram : visuals/brownian_paths.png</w:t>
-      </w:r>
-    </w:p>
-    <w:p>
-      <w:pPr>
-        <w:pStyle w:val="ListBullet"/>
-      </w:pPr>
-      <w:r>
-        <w:t>System Architecture Diagram : visuals/all_agents_rewards.png</w:t>
+        <w:t>Rapport technique disponible : reports/Project_Roadmap.pdf</w:t>
       </w:r>
     </w:p>
     <w:p/>
@@ -1986,20 +2075,18 @@
         <w:pStyle w:val="Heading1"/>
       </w:pPr>
       <w:r>
-        <w:t>10. Financial News Sentiment Classification: Classical ML vs Bidirectional LSTM</w:t>
+        <w:t>10. Analyse de Sentiment de Titres Financiers : ML Classique vs BiLSTM</w:t>
       </w:r>
     </w:p>
     <w:p>
       <w:r>
         <w:rPr>
           <w:i/>
-          <w:sz w:val="19"/>
+          <w:sz w:val="20"/>
         </w:rPr>
-        <w:t>Academic Context : McMaster University (DATASCI 3ML3) (2026) | Degree : McMaster University Exchange</w:t>
+        <w:t>Contexte : McMaster University (DATASCI 3ML3) (2026) | Rôle : NLP &amp; Machine Learning Engineer</w:t>
         <w:br/>
-        <w:t>Role : NLP &amp; Machine Learning Engineer</w:t>
-        <w:br/>
-        <w:t>Domain : NLP &amp; Financial Deep Learning</w:t>
+        <w:t>Domaine : NLP &amp; Financial Deep Learning</w:t>
         <w:br/>
         <w:t>Technologies : Python, PyTorch, BiLSTM, TF-IDF, Scikit-Learn, NLP, Financial Sentiment, Cross-Validation</w:t>
       </w:r>
@@ -2009,7 +2096,7 @@
         <w:pStyle w:val="Heading2"/>
       </w:pPr>
       <w:r>
-        <w:t>French Executive Summary (Synthèse) :</w:t>
+        <w:t>Synthèse Exécutive :</w:t>
       </w:r>
     </w:p>
     <w:p>
@@ -2022,20 +2109,23 @@
         <w:pStyle w:val="Heading2"/>
       </w:pPr>
       <w:r>
-        <w:t>English Project Overview :</w:t>
+        <w:t>Réalisations Clés &amp; Résultats (Format STAR) :</w:t>
       </w:r>
     </w:p>
     <w:p>
+      <w:pPr>
+        <w:pStyle w:val="ListBullet"/>
+      </w:pPr>
       <w:r>
-        <w:t>Comparative benchmark for 3-class sentiment classification across 9,549 financial headlines comparing classical machine learning with Bidirectional LSTMs in PyTorch.</w:t>
+        <w:t>Traitement et vectorisation d'un corpus de 9 549 titres financiers avec analyse lexicale et gestion du déséquilibre de classes.</w:t>
       </w:r>
     </w:p>
     <w:p>
       <w:pPr>
-        <w:pStyle w:val="Heading2"/>
+        <w:pStyle w:val="ListBullet"/>
       </w:pPr>
       <w:r>
-        <w:t>Key Technical Results (STAR Format) :</w:t>
+        <w:t>Implémentation et optimisation d'une architecture neuronale Bidirectional LSTM sous PyTorch surpassant les baselines classiques.</w:t>
       </w:r>
     </w:p>
     <w:p>
@@ -2043,15 +2133,15 @@
         <w:pStyle w:val="ListBullet"/>
       </w:pPr>
       <w:r>
-        <w:t>Curated and preprocessed 9,549 financial news headlines addressing class imbalance and specialized financial vocabularies.</w:t>
+        <w:t>Rédaction d'un rapport de recherche académique de 11 pages détaillant les courbes d'apprentissage, F1-scores et analyses d'erreurs.</w:t>
       </w:r>
     </w:p>
     <w:p>
       <w:pPr>
-        <w:pStyle w:val="ListBullet"/>
+        <w:pStyle w:val="Heading2"/>
       </w:pPr>
       <w:r>
-        <w:t>Implemented and trained a Bidirectional LSTM neural network in PyTorch achieving superior accuracy and macro F1 over classical baselines.</w:t>
+        <w:t>Livrables &amp; Justificatifs Associés :</w:t>
       </w:r>
     </w:p>
     <w:p>
@@ -2059,31 +2149,15 @@
         <w:pStyle w:val="ListBullet"/>
       </w:pPr>
       <w:r>
-        <w:t>Authored an 11-page comparative research paper detailing convergence dynamics, confusion matrices, and ablation findings.</w:t>
+        <w:t>Rapport technique disponible : reports/Financial_News_Sentiment_Report.pdf</w:t>
       </w:r>
     </w:p>
     <w:p>
       <w:pPr>
-        <w:pStyle w:val="Heading2"/>
+        <w:pStyle w:val="ListBullet"/>
       </w:pPr>
       <w:r>
-        <w:t>Verified Deliverables &amp; Evidence :</w:t>
-      </w:r>
-    </w:p>
-    <w:p>
-      <w:pPr>
-        <w:pStyle w:val="ListBullet"/>
-      </w:pPr>
-      <w:r>
-        <w:t>Technical Paper / Thesis : reports/Financial_News_Sentiment_Report.pdf</w:t>
-      </w:r>
-    </w:p>
-    <w:p>
-      <w:pPr>
-        <w:pStyle w:val="ListBullet"/>
-      </w:pPr>
-      <w:r>
-        <w:t>Technical Paper / Thesis : reports/Sujet_Projet.pdf</w:t>
+        <w:t>Rapport technique disponible : reports/Sujet_Projet.pdf</w:t>
       </w:r>
     </w:p>
     <w:p/>
@@ -2092,20 +2166,18 @@
         <w:pStyle w:val="Heading1"/>
       </w:pPr>
       <w:r>
-        <w:t>11. Seasonal Demand Forecasting in Canadian Retail Trade (1992–2019)</w:t>
+        <w:t>11. Prévision de la Demande Saisonnière dans le Commerce Canadien (27 Ans)</w:t>
       </w:r>
     </w:p>
     <w:p>
       <w:r>
         <w:rPr>
           <w:i/>
-          <w:sz w:val="19"/>
+          <w:sz w:val="20"/>
         </w:rPr>
-        <w:t>Academic Context : McMaster University (STATS 4A03) (2026) | Degree : McMaster University Exchange</w:t>
+        <w:t>Contexte : McMaster University (STATS 4A03) (2026) | Rôle : Time Series Analyst</w:t>
         <w:br/>
-        <w:t>Role : Time Series Analyst</w:t>
-        <w:br/>
-        <w:t>Domain : Time Series &amp; Applied Econometrics</w:t>
+        <w:t>Domaine : Time Series &amp; Applied Econometrics</w:t>
         <w:br/>
         <w:t>Technologies : R, RMarkdown, SARIMA, Holt-Winters, Décomposition STL, Tests de Stationnarité (ADF/KPSS), Validation Croisée</w:t>
       </w:r>
@@ -2115,7 +2187,7 @@
         <w:pStyle w:val="Heading2"/>
       </w:pPr>
       <w:r>
-        <w:t>French Executive Summary (Synthèse) :</w:t>
+        <w:t>Synthèse Exécutive :</w:t>
       </w:r>
     </w:p>
     <w:p>
@@ -2128,20 +2200,23 @@
         <w:pStyle w:val="Heading2"/>
       </w:pPr>
       <w:r>
-        <w:t>English Project Overview :</w:t>
+        <w:t>Réalisations Clés &amp; Résultats (Format STAR) :</w:t>
       </w:r>
     </w:p>
     <w:p>
+      <w:pPr>
+        <w:pStyle w:val="ListBullet"/>
+      </w:pPr>
       <w:r>
-        <w:t>Econometric modeling and 27-year time series forecasting of monthly Canadian retail sales data using STL decomposition, Holt-Winters exponential smoothing, and SARIMA models.</w:t>
+        <w:t>Analyse exploratoire et tests statistiques de stationnarité (ADF, KPSS) sur 27 années de séries mensuelles de consommation.</w:t>
       </w:r>
     </w:p>
     <w:p>
       <w:pPr>
-        <w:pStyle w:val="Heading2"/>
+        <w:pStyle w:val="ListBullet"/>
       </w:pPr>
       <w:r>
-        <w:t>Key Technical Results (STAR Format) :</w:t>
+        <w:t>Identification et estimation de modèles SARIMA multiplicatifs avec validation rigoureuse des résidus (Ljung-Box, normalité).</w:t>
       </w:r>
     </w:p>
     <w:p>
@@ -2149,15 +2224,15 @@
         <w:pStyle w:val="ListBullet"/>
       </w:pPr>
       <w:r>
-        <w:t>Conducted stationarity diagnostics (ADF, KPSS tests) and seasonal decomposition on a 27-year macroeconomic time series.</w:t>
+        <w:t>Production d'un rapport de prévision de 12 pages compilé sous RMarkdown avec intervalles de confiance prospectifs.</w:t>
       </w:r>
     </w:p>
     <w:p>
       <w:pPr>
-        <w:pStyle w:val="ListBullet"/>
+        <w:pStyle w:val="Heading2"/>
       </w:pPr>
       <w:r>
-        <w:t>Identified and tuned multiplicative SARIMA models validating residual white noise assumptions via Ljung-Box tests.</w:t>
+        <w:t>Livrables &amp; Justificatifs Associés :</w:t>
       </w:r>
     </w:p>
     <w:p>
@@ -2165,23 +2240,7 @@
         <w:pStyle w:val="ListBullet"/>
       </w:pPr>
       <w:r>
-        <w:t>Delivered a reproducible 12-page RMarkdown technical forecasting paper providing multi-step forward horizon projections.</w:t>
-      </w:r>
-    </w:p>
-    <w:p>
-      <w:pPr>
-        <w:pStyle w:val="Heading2"/>
-      </w:pPr>
-      <w:r>
-        <w:t>Verified Deliverables &amp; Evidence :</w:t>
-      </w:r>
-    </w:p>
-    <w:p>
-      <w:pPr>
-        <w:pStyle w:val="ListBullet"/>
-      </w:pPr>
-      <w:r>
-        <w:t>Technical Paper / Thesis : reports/Canadian_Retail_Time_Series_Report.pdf</w:t>
+        <w:t>Rapport technique disponible : reports/Canadian_Retail_Time_Series_Report.pdf</w:t>
       </w:r>
     </w:p>
     <w:p/>
@@ -2190,20 +2249,18 @@
         <w:pStyle w:val="Heading1"/>
       </w:pPr>
       <w:r>
-        <w:t>12. Visual Question Answering (VQA): Multimodal Vision-Language Deep Learning</w:t>
+        <w:t>12. Visual Question Answering (VQA) : Fusion Multimodale Vision &amp; Langage</w:t>
       </w:r>
     </w:p>
     <w:p>
       <w:r>
         <w:rPr>
           <w:i/>
-          <w:sz w:val="19"/>
+          <w:sz w:val="20"/>
         </w:rPr>
-        <w:t>Academic Context : McMaster University (MECHENG 4AI3) (2026) | Degree : McMaster University Exchange</w:t>
+        <w:t>Contexte : McMaster University (MECHENG 4AI3) (2026) | Rôle : Multimodal Deep Learning Engineer</w:t>
         <w:br/>
-        <w:t>Role : Multimodal Deep Learning Engineer</w:t>
-        <w:br/>
-        <w:t>Domain : Multimodal Deep Learning &amp; Computer Vision</w:t>
+        <w:t>Domaine : Multimodal Deep Learning &amp; Computer Vision</w:t>
         <w:br/>
         <w:t>Technologies : Python, PyTorch, Torchvision, CNN (ResNet), LSTM, Multimodal Fusion, VQA v2.0 Dataset, Streamlit</w:t>
       </w:r>
@@ -2213,7 +2270,7 @@
         <w:pStyle w:val="Heading2"/>
       </w:pPr>
       <w:r>
-        <w:t>French Executive Summary (Synthèse) :</w:t>
+        <w:t>Synthèse Exécutive :</w:t>
       </w:r>
     </w:p>
     <w:p>
@@ -2226,20 +2283,23 @@
         <w:pStyle w:val="Heading2"/>
       </w:pPr>
       <w:r>
-        <w:t>English Project Overview :</w:t>
+        <w:t>Réalisations Clés &amp; Résultats (Format STAR) :</w:t>
       </w:r>
     </w:p>
     <w:p>
+      <w:pPr>
+        <w:pStyle w:val="ListBullet"/>
+      </w:pPr>
       <w:r>
-        <w:t>Multimodal Visual Question Answering architecture on VQA v2.0 dataset fusing deep convolutional image features (ResNet) with LSTM question embeddings.</w:t>
+        <w:t>Pipeline d'ingestion et d'alignement multimodal image-texte sur le benchmark VQA v2.0.</w:t>
       </w:r>
     </w:p>
     <w:p>
       <w:pPr>
-        <w:pStyle w:val="Heading2"/>
+        <w:pStyle w:val="ListBullet"/>
       </w:pPr>
       <w:r>
-        <w:t>Key Technical Results (STAR Format) :</w:t>
+        <w:t>Conception d'une architecture de fusion multimodale pour la prédiction de réponses visuelles.</w:t>
       </w:r>
     </w:p>
     <w:p>
@@ -2247,15 +2307,15 @@
         <w:pStyle w:val="ListBullet"/>
       </w:pPr>
       <w:r>
-        <w:t>Engineered multimodal data preprocessing and spatial visual alignment pipeline on the standard VQA v2.0 dataset.</w:t>
+        <w:t>Déploiement d'une application de démonstration interactive avec roadmap de développement produit.</w:t>
       </w:r>
     </w:p>
     <w:p>
       <w:pPr>
-        <w:pStyle w:val="ListBullet"/>
+        <w:pStyle w:val="Heading2"/>
       </w:pPr>
       <w:r>
-        <w:t>Implemented multimodal fusion architectures combining deep visual representations with recurrent sentence encodings.</w:t>
+        <w:t>Livrables &amp; Justificatifs Associés :</w:t>
       </w:r>
     </w:p>
     <w:p>
@@ -2263,23 +2323,7 @@
         <w:pStyle w:val="ListBullet"/>
       </w:pPr>
       <w:r>
-        <w:t>Developed an interactive web application demo and structured sprint engineering roadmap.</w:t>
-      </w:r>
-    </w:p>
-    <w:p>
-      <w:pPr>
-        <w:pStyle w:val="Heading2"/>
-      </w:pPr>
-      <w:r>
-        <w:t>Verified Deliverables &amp; Evidence :</w:t>
-      </w:r>
-    </w:p>
-    <w:p>
-      <w:pPr>
-        <w:pStyle w:val="ListBullet"/>
-      </w:pPr>
-      <w:r>
-        <w:t>Technical Paper / Thesis : reports/VQA_Project_Roadmap.pdf</w:t>
+        <w:t>Rapport technique disponible : reports/VQA_Project_Roadmap.pdf</w:t>
       </w:r>
     </w:p>
     <w:p/>
@@ -2288,20 +2332,18 @@
         <w:pStyle w:val="Heading1"/>
       </w:pPr>
       <w:r>
-        <w:t>13. Applied Generalized Linear Models: Poisson, Gamma, and Logistic Regressions</w:t>
+        <w:t>13. Modèles Linéaires Généralisés : Régressions Poisson, Gamma &amp; Binomiales</w:t>
       </w:r>
     </w:p>
     <w:p>
       <w:r>
         <w:rPr>
           <w:i/>
-          <w:sz w:val="19"/>
+          <w:sz w:val="20"/>
         </w:rPr>
-        <w:t>Academic Context : McMaster University (STATS 4GLM) (2026) | Degree : McMaster University Exchange</w:t>
+        <w:t>Contexte : McMaster University (STATS 4GLM) (2026) | Rôle : Applied Statistician</w:t>
         <w:br/>
-        <w:t>Role : Applied Statistician</w:t>
-        <w:br/>
-        <w:t>Domain : Applied Statistics &amp; GLM</w:t>
+        <w:t>Domaine : Applied Statistics &amp; GLM</w:t>
         <w:br/>
         <w:t>Technologies : R, RMarkdown, GLM, Poisson Regression, Gamma Regression, Logistic Regression, Deviance Analysis, Overdispersion</w:t>
       </w:r>
@@ -2311,7 +2353,7 @@
         <w:pStyle w:val="Heading2"/>
       </w:pPr>
       <w:r>
-        <w:t>French Executive Summary (Synthèse) :</w:t>
+        <w:t>Synthèse Exécutive :</w:t>
       </w:r>
     </w:p>
     <w:p>
@@ -2324,20 +2366,23 @@
         <w:pStyle w:val="Heading2"/>
       </w:pPr>
       <w:r>
-        <w:t>English Project Overview :</w:t>
+        <w:t>Réalisations Clés &amp; Résultats (Format STAR) :</w:t>
       </w:r>
     </w:p>
     <w:p>
+      <w:pPr>
+        <w:pStyle w:val="ListBullet"/>
+      </w:pPr>
       <w:r>
-        <w:t>Comprehensive statistical modeling assignments applying Generalized Linear Model theory (exponential dispersion family, link functions, quasi-likelihood) to actuarial and empirical datasets.</w:t>
+        <w:t>Ajustement de modèles GLM Poisson et quasi-Poisson pour données de comptage avec diagnostic de surdispersion.</w:t>
       </w:r>
     </w:p>
     <w:p>
       <w:pPr>
-        <w:pStyle w:val="Heading2"/>
+        <w:pStyle w:val="ListBullet"/>
       </w:pPr>
       <w:r>
-        <w:t>Key Technical Results (STAR Format) :</w:t>
+        <w:t>Modélisation de données continues positives asymétriques via GLM Gamma et sélection de variables par analyse de déviance.</w:t>
       </w:r>
     </w:p>
     <w:p>
@@ -2345,15 +2390,15 @@
         <w:pStyle w:val="ListBullet"/>
       </w:pPr>
       <w:r>
-        <w:t>Fitted Poisson and Quasi-Poisson GLMs for count data with diagnostics for overdispersion and zero inflation.</w:t>
+        <w:t>Production de 5 rapports d'analyse sous RMarkdown démontrant une maîtrise rigoureuse de l'inférence statistique.</w:t>
       </w:r>
     </w:p>
     <w:p>
       <w:pPr>
-        <w:pStyle w:val="ListBullet"/>
+        <w:pStyle w:val="Heading2"/>
       </w:pPr>
       <w:r>
-        <w:t>Modeled right-skewed continuous responses using Gamma GLMs with deviance goodness-of-fit hypothesis testing.</w:t>
+        <w:t>Livrables &amp; Justificatifs Associés :</w:t>
       </w:r>
     </w:p>
     <w:p>
@@ -2361,15 +2406,7 @@
         <w:pStyle w:val="ListBullet"/>
       </w:pPr>
       <w:r>
-        <w:t>Authored 5 comprehensive reproducible RMarkdown statistical reports demonstrating deep mastery of statistical inference.</w:t>
-      </w:r>
-    </w:p>
-    <w:p>
-      <w:pPr>
-        <w:pStyle w:val="Heading2"/>
-      </w:pPr>
-      <w:r>
-        <w:t>Verified Deliverables &amp; Evidence :</w:t>
+        <w:t>Code source et documentation intégrés dans le dossier projet.</w:t>
       </w:r>
     </w:p>
     <w:p/>
@@ -2378,20 +2415,18 @@
         <w:pStyle w:val="Heading1"/>
       </w:pPr>
       <w:r>
-        <w:t>14. Machine Learning &amp; AI Practical Workshops (Kryptosphere AI)</w:t>
+        <w:t>14. Formations &amp; Ateliers Pratiques en Machine Learning (Kryptosphere IA)</w:t>
       </w:r>
     </w:p>
     <w:p>
       <w:r>
         <w:rPr>
           <w:i/>
-          <w:sz w:val="19"/>
+          <w:sz w:val="20"/>
         </w:rPr>
-        <w:t>Academic Context : Association Kryptosphere IA ENSIIE (2024-2025) | Degree : ENSIIE</w:t>
+        <w:t>Contexte : Association Kryptosphere IA ENSIIE (2024-2025) | Rôle : Lead Technical AI Instructor</w:t>
         <w:br/>
-        <w:t>Role : Lead Technical AI Instructor</w:t>
-        <w:br/>
-        <w:t>Domain : AI Education &amp; Technical Leadership</w:t>
+        <w:t>Domaine : AI Education &amp; Technical Leadership</w:t>
         <w:br/>
         <w:t>Technologies : Python, Jupyter, Scikit-Learn, Pandas, Matplotlib, Seaborn, Clustering, Time Series</w:t>
       </w:r>
@@ -2401,7 +2436,7 @@
         <w:pStyle w:val="Heading2"/>
       </w:pPr>
       <w:r>
-        <w:t>French Executive Summary (Synthèse) :</w:t>
+        <w:t>Synthèse Exécutive :</w:t>
       </w:r>
     </w:p>
     <w:p>
@@ -2414,20 +2449,23 @@
         <w:pStyle w:val="Heading2"/>
       </w:pPr>
       <w:r>
-        <w:t>English Project Overview :</w:t>
+        <w:t>Réalisations Clés &amp; Résultats (Format STAR) :</w:t>
       </w:r>
     </w:p>
     <w:p>
+      <w:pPr>
+        <w:pStyle w:val="ListBullet"/>
+      </w:pPr>
       <w:r>
-        <w:t>Authored and delivered comprehensive hands-on Machine Learning workshops for student engineers: data preprocessing, model evaluation metrics, clustering, and time series.</w:t>
+        <w:t>Conception de 4 supports de formation complets (slides PPTX/PDF et notebooks interactifs guidés).</w:t>
       </w:r>
     </w:p>
     <w:p>
       <w:pPr>
-        <w:pStyle w:val="Heading2"/>
+        <w:pStyle w:val="ListBullet"/>
       </w:pPr>
       <w:r>
-        <w:t>Key Technical Results (STAR Format) :</w:t>
+        <w:t>Animation d'ateliers techniques interactifs pour les étudiants de l'ENSIIE sur l'évaluation de modèles prédictifs et les algorithmes de clustering.</w:t>
       </w:r>
     </w:p>
     <w:p>
@@ -2435,15 +2473,15 @@
         <w:pStyle w:val="ListBullet"/>
       </w:pPr>
       <w:r>
-        <w:t>Authored 4 educational workshops consisting of presentation slide decks and interactive guided Jupyter notebooks.</w:t>
+        <w:t>Vulgarisation de concepts mathématiques avancés (matrices de confusion, inertie intra-classe, stationnarité).</w:t>
       </w:r>
     </w:p>
     <w:p>
       <w:pPr>
-        <w:pStyle w:val="ListBullet"/>
+        <w:pStyle w:val="Heading2"/>
       </w:pPr>
       <w:r>
-        <w:t>Led hands-on training sessions for engineering students on predictive model validation and unsupervised clustering.</w:t>
+        <w:t>Livrables &amp; Justificatifs Associés :</w:t>
       </w:r>
     </w:p>
     <w:p>
@@ -2451,31 +2489,15 @@
         <w:pStyle w:val="ListBullet"/>
       </w:pPr>
       <w:r>
-        <w:t>Distilled advanced statistical concepts (confusion matrices, ROC curves, intra-cluster inertia, stationarity).</w:t>
+        <w:t>Présentation / Soutenance : presentations/Formation_Evaluation_Modeles_ML.pdf</w:t>
       </w:r>
     </w:p>
     <w:p>
       <w:pPr>
-        <w:pStyle w:val="Heading2"/>
+        <w:pStyle w:val="ListBullet"/>
       </w:pPr>
       <w:r>
-        <w:t>Verified Deliverables &amp; Evidence :</w:t>
-      </w:r>
-    </w:p>
-    <w:p>
-      <w:pPr>
-        <w:pStyle w:val="ListBullet"/>
-      </w:pPr>
-      <w:r>
-        <w:t>Presentation Deck : presentations/Formation_Evaluation_Modeles_ML.pdf</w:t>
-      </w:r>
-    </w:p>
-    <w:p>
-      <w:pPr>
-        <w:pStyle w:val="ListBullet"/>
-      </w:pPr>
-      <w:r>
-        <w:t>Presentation Deck : presentations/Formation_Clustering.pdf</w:t>
+        <w:t>Présentation / Soutenance : presentations/Formation_Clustering.pdf</w:t>
       </w:r>
     </w:p>
     <w:p/>
@@ -2484,20 +2506,18 @@
         <w:pStyle w:val="Heading1"/>
       </w:pPr>
       <w:r>
-        <w:t>15. Sorbonne 2025 Data Challenge: Malware Detection &amp; Multi-Label Classification via Control Flow Graphs (CFG) &amp; GNN</w:t>
+        <w:t>15. Data Challenge Sorbonne 2025 : Détection et Classification Multi-Label de Malwares par CFG &amp; GNN</w:t>
       </w:r>
     </w:p>
     <w:p>
       <w:r>
         <w:rPr>
           <w:i/>
-          <w:sz w:val="19"/>
+          <w:sz w:val="20"/>
         </w:rPr>
-        <w:t>Academic Context : Université Paris 1 Panthéon-Sorbonne x ComCyber (Ministère de l'Intérieur) x Gendarmerie Nationale (CNENUM) (2025) | Degree : ENSIIE &amp; Université Paris-Saclay (Master 2 IA)</w:t>
+        <w:t>Contexte : Université Paris 1 Panthéon-Sorbonne x ComCyber (Ministère de l'Intérieur) x Gendarmerie Nationale (CNENUM) (2025) | Rôle : Lead Data Scientist &amp; AI Security Researcher</w:t>
         <w:br/>
-        <w:t>Role : Lead Data Scientist &amp; AI Security Researcher</w:t>
-        <w:br/>
-        <w:t>Domain : Cybersecurity AI, Graph Neural Networks &amp; Reverse Engineering</w:t>
+        <w:t>Domaine : Cybersecurity AI, Graph Neural Networks &amp; Reverse Engineering</w:t>
         <w:br/>
         <w:t>Technologies : Python, NetworkX, Graph Neural Networks (GNN), Asm2Vec, Scikit-Learn, MultiOutputClassifier, Random Forest, Multiprocessing, Control Flow Graphs, x86/x64 Assembly, Pandas, Macro F1</w:t>
       </w:r>
@@ -2507,7 +2527,7 @@
         <w:pStyle w:val="Heading2"/>
       </w:pPr>
       <w:r>
-        <w:t>French Executive Summary (Synthèse) :</w:t>
+        <w:t>Synthèse Exécutive :</w:t>
       </w:r>
     </w:p>
     <w:p>
@@ -2520,12 +2540,69 @@
         <w:pStyle w:val="Heading2"/>
       </w:pPr>
       <w:r>
-        <w:t>English Project Overview :</w:t>
+        <w:t>Réalisations Clés &amp; Résultats (Format STAR) :</w:t>
+      </w:r>
+    </w:p>
+    <w:p>
+      <w:pPr>
+        <w:pStyle w:val="ListBullet"/>
+      </w:pPr>
+      <w:r>
+        <w:t>Développement d'un moteur de parsing multi-processus analysant les fichiers digraph de CFG et extrayant les propriétés topologiques (degrés, densité, composantes fortement connexes, clustering) et fréquentielles d'opcodes assembleur x86.</w:t>
+      </w:r>
+    </w:p>
+    <w:p>
+      <w:pPr>
+        <w:pStyle w:val="ListBullet"/>
+      </w:pPr>
+      <w:r>
+        <w:t>Conception et optimisation de modèles multi-sorties (MultiOutputClassifier, Random Forest, XGBoost, GNN) prédisant 459 labels comportementaux issus de sandboxes dynamiques.</w:t>
+      </w:r>
+    </w:p>
+    <w:p>
+      <w:pPr>
+        <w:pStyle w:val="ListBullet"/>
+      </w:pPr>
+      <w:r>
+        <w:t>Exploitation des états de l'art en GNN et plongements d'instructions (Asm2Vec, Stanford GNN) avec maximisation du Macro F1 sur l'ensemble de test officiel.</w:t>
+      </w:r>
+    </w:p>
+    <w:p>
+      <w:pPr>
+        <w:pStyle w:val="Heading2"/>
+      </w:pPr>
+      <w:r>
+        <w:t>Livrables &amp; Justificatifs Associés :</w:t>
+      </w:r>
+    </w:p>
+    <w:p>
+      <w:pPr>
+        <w:pStyle w:val="ListBullet"/>
+      </w:pPr>
+      <w:r>
+        <w:t>Rapport technique disponible : reports/Briefing_Data_Challenge_Sorbonne.pdf</w:t>
+      </w:r>
+    </w:p>
+    <w:p/>
+    <w:p>
+      <w:pPr>
+        <w:pStyle w:val="Heading1"/>
+      </w:pPr>
+      <w:r>
+        <w:t>16. Transformer Décodeur from Scratch : Modèle de Langage Autorégressif (RoPE, SwiGLU, KV Cache)</w:t>
       </w:r>
     </w:p>
     <w:p>
       <w:r>
-        <w:t>Competed in the national AI Data Challenge co-organized by Paris 1 Panthéon-Sorbonne, ComCyber (French Ministry of Interior), and the National Gendarmerie (CNENUM) to classify behavioral threats across 20,000 Windows PE/DLL binaries. Engineered a multi-core parallel extraction pipeline parsing Control Flow Graphs (CFG via NetworkX) and x86 assembly opcodes, followed by multi-label classification optimized for Macro F1-score.</w:t>
+        <w:rPr>
+          <w:i/>
+          <w:sz w:val="20"/>
+        </w:rPr>
+        <w:t>Contexte : ENSIIE &amp; Université Paris-Saclay (Master 2 IA) (2026) | Rôle : Deep Learning / NLP Engineer</w:t>
+        <w:br/>
+        <w:t>Domaine : Deep Learning &amp; Natural Language Processing</w:t>
+        <w:br/>
+        <w:t>Technologies : Python, PyTorch, Hugging Face Transformers, Hugging Face Datasets, RoPE (Rotary Position Embeddings), SwiGLU, RMSNorm, KV Caching</w:t>
       </w:r>
     </w:p>
     <w:p>
@@ -2533,23 +2610,20 @@
         <w:pStyle w:val="Heading2"/>
       </w:pPr>
       <w:r>
-        <w:t>Key Technical Results (STAR Format) :</w:t>
+        <w:t>Synthèse Exécutive :</w:t>
       </w:r>
     </w:p>
     <w:p>
-      <w:pPr>
-        <w:pStyle w:val="ListBullet"/>
-      </w:pPr>
       <w:r>
-        <w:t>Engineered a high-performance multi-process pipeline extracting topological metrics (degrees, density, SCC, clustering) from Control Flow Graphs and x86 opcode distributions.</w:t>
+        <w:t>Implémentation complète from scratch sous PyTorch d'une architecture Transformer de type Décodeur seul (inspirée de LLaMA 2 et Mistral). Intègre le masquage causal strict, les encodages positionnels rotatifs (RoPE), la normalisation RMSNorm, un bloc SwiGLU, un mécanisme de KV-Caching pour l'inférence autorégressive et une évaluation de perplexité sur TinyStories.</w:t>
       </w:r>
     </w:p>
     <w:p>
       <w:pPr>
-        <w:pStyle w:val="ListBullet"/>
+        <w:pStyle w:val="Heading2"/>
       </w:pPr>
       <w:r>
-        <w:t>Trained and tuned multi-label architectures (MultiOutputClassifier, Random Forest, XGBoost, GNNs) predicting 459 dynamic sandbox behavioral tags.</w:t>
+        <w:t>Réalisations Clés &amp; Résultats (Format STAR) :</w:t>
       </w:r>
     </w:p>
     <w:p>
@@ -2557,15 +2631,15 @@
         <w:pStyle w:val="ListBullet"/>
       </w:pPr>
       <w:r>
-        <w:t>Benchmarked against state-of-the-art structural embedding techniques (Asm2Vec, GNNs) achieving strong generalization measured by Macro F1-score on held-out test data.</w:t>
+        <w:t>Implémentation from scratch des modules fondamentaux de LLM : Multi-Head Causal Self-Attention, RoPE, RMSNorm et SwiGLU sans recourir aux modules de haut niveau de PyTorch.</w:t>
       </w:r>
     </w:p>
     <w:p>
       <w:pPr>
-        <w:pStyle w:val="Heading2"/>
+        <w:pStyle w:val="ListBullet"/>
       </w:pPr>
       <w:r>
-        <w:t>Verified Deliverables &amp; Evidence :</w:t>
+        <w:t>Conception d'un gestionnaire de cache Clé-Valeur (KV-Cache) réduisant la complexité de génération par token de O(N^2) à O(N).</w:t>
       </w:r>
     </w:p>
     <w:p>
@@ -2573,15 +2647,363 @@
         <w:pStyle w:val="ListBullet"/>
       </w:pPr>
       <w:r>
-        <w:t>Technical Paper / Thesis : reports/Briefing_Data_Challenge_Sorbonne.pdf</w:t>
+        <w:t>Mise en œuvre des stratégies de décodage glouton et d'échantillonnage par température avec calcul de la perte et de la perplexité sur le dataset TinyStories.</w:t>
       </w:r>
     </w:p>
     <w:p>
       <w:pPr>
+        <w:pStyle w:val="Heading2"/>
+      </w:pPr>
+      <w:r>
+        <w:t>Livrables &amp; Justificatifs Associés :</w:t>
+      </w:r>
+    </w:p>
+    <w:p>
+      <w:pPr>
         <w:pStyle w:val="ListBullet"/>
       </w:pPr>
       <w:r>
-        <w:t>System Architecture Diagram : image/output.svg</w:t>
+        <w:t>Code source et documentation intégrés dans le dossier projet.</w:t>
+      </w:r>
+    </w:p>
+    <w:p/>
+    <w:p>
+      <w:pPr>
+        <w:pStyle w:val="Heading1"/>
+      </w:pPr>
+      <w:r>
+        <w:t>17. Effet des accessoires faciaux sur l’évaluation des modèles vision-langage</w:t>
+      </w:r>
+    </w:p>
+    <w:p>
+      <w:r>
+        <w:rPr>
+          <w:i/>
+          <w:sz w:val="20"/>
+        </w:rPr>
+        <w:t>Contexte : Université Paris-Saclay &amp; CEA-List (2026) | Rôle : Co-Author &amp; ML Researcher</w:t>
+        <w:br/>
+        <w:t>Domaine : AI Evaluation &amp; Fairness</w:t>
+        <w:br/>
+        <w:t>Technologies : Vision-Language Models, MiniCPM-V 4.6, SigLIP 2, Counterfactual Evaluation, Fairness, Synthetic Data</w:t>
+      </w:r>
+    </w:p>
+    <w:p>
+      <w:pPr>
+        <w:pStyle w:val="Heading2"/>
+      </w:pPr>
+      <w:r>
+        <w:t>Synthèse Exécutive :</w:t>
+      </w:r>
+    </w:p>
+    <w:p>
+      <w:r>
+        <w:t>Recherche empirique menée à l’Université Paris-Saclay évaluant l’effet des accessoires faciaux (lunettes, casquettes, masques) sur les modèles vision-langage à travers un benchmark contrefactuel de 720 identités synthétiques et 2 880 images.</w:t>
+      </w:r>
+    </w:p>
+    <w:p>
+      <w:pPr>
+        <w:pStyle w:val="Heading2"/>
+      </w:pPr>
+      <w:r>
+        <w:t>Réalisations Clés &amp; Résultats (Format STAR) :</w:t>
+      </w:r>
+    </w:p>
+    <w:p>
+      <w:pPr>
+        <w:pStyle w:val="ListBullet"/>
+      </w:pPr>
+      <w:r>
+        <w:t>Conception d’un protocole contrefactuel rigoureux sur 2 880 images évaluant MiniCPM-V 4.6 et SigLIP 2.</w:t>
+      </w:r>
+    </w:p>
+    <w:p>
+      <w:pPr>
+        <w:pStyle w:val="ListBullet"/>
+      </w:pPr>
+      <w:r>
+        <w:t>Mesure quantitative des dérives de classification d’attributs et des biais sociologiques induits par les accessoires.</w:t>
+      </w:r>
+    </w:p>
+    <w:p>
+      <w:pPr>
+        <w:pStyle w:val="ListBullet"/>
+      </w:pPr>
+      <w:r>
+        <w:t>Rédaction d’un article de recherche et présentation des perspectives d’évaluation de robustesse des VLMs.</w:t>
+      </w:r>
+    </w:p>
+    <w:p>
+      <w:pPr>
+        <w:pStyle w:val="Heading2"/>
+      </w:pPr>
+      <w:r>
+        <w:t>Livrables &amp; Justificatifs Associés :</w:t>
+      </w:r>
+    </w:p>
+    <w:p>
+      <w:pPr>
+        <w:pStyle w:val="ListBullet"/>
+      </w:pPr>
+      <w:r>
+        <w:t>Rapport technique disponible : https://raw.githubusercontent.com/SalmaAlkhalily/examining-the-effect-of-face-accessories-on-vlm-evaluation/main/paper/Examining_the_effect_of_face_accessories_in_VLM_face_evaluation.pdf</w:t>
+      </w:r>
+    </w:p>
+    <w:p>
+      <w:pPr>
+        <w:pStyle w:val="ListBullet"/>
+      </w:pPr>
+      <w:r>
+        <w:t>Présentation / Soutenance : https://raw.githubusercontent.com/SalmaAlkhalily/examining-the-effect-of-face-accessories-on-vlm-evaluation/main/presentation/Face_accessories_VLM_final_presentation.pptx</w:t>
+      </w:r>
+    </w:p>
+    <w:p/>
+    <w:p>
+      <w:pPr>
+        <w:pStyle w:val="Heading1"/>
+      </w:pPr>
+      <w:r>
+        <w:t>18. LoRA : Low-Rank Adaptation et PEFT de zéro sous PyTorch</w:t>
+      </w:r>
+    </w:p>
+    <w:p>
+      <w:r>
+        <w:rPr>
+          <w:i/>
+          <w:sz w:val="20"/>
+        </w:rPr>
+        <w:t>Contexte : Université Paris-Saclay &amp; ENSIIE (2026) | Rôle : Lead Researcher &amp; Engineer</w:t>
+        <w:br/>
+        <w:t>Domaine : Deep Learning &amp; NLP</w:t>
+        <w:br/>
+        <w:t>Technologies : PyTorch, LoRA, PEFT, Transformers, BERT, Hugging Face, Model Efficiency</w:t>
+      </w:r>
+    </w:p>
+    <w:p>
+      <w:pPr>
+        <w:pStyle w:val="Heading2"/>
+      </w:pPr>
+      <w:r>
+        <w:t>Synthèse Exécutive :</w:t>
+      </w:r>
+    </w:p>
+    <w:p>
+      <w:r>
+        <w:t>Implémentation complète from scratch sous PyTorch de Low-Rank Adaptation (LoRA, Hu et al. 2021) pour l'ajustement fin économe en paramètres (PEFT) de modèles Transformer. Décomposition matricielle W0 + (alpha/r)*BA sur les projections d'attention (Q, K, V), gelant 99,6 % des poids du modèle de base tout en conservant 97 % des performances du fine-tuning complet sur BERT.</w:t>
+      </w:r>
+    </w:p>
+    <w:p>
+      <w:pPr>
+        <w:pStyle w:val="Heading2"/>
+      </w:pPr>
+      <w:r>
+        <w:t>Réalisations Clés &amp; Résultats (Format STAR) :</w:t>
+      </w:r>
+    </w:p>
+    <w:p>
+      <w:pPr>
+        <w:pStyle w:val="ListBullet"/>
+      </w:pPr>
+      <w:r>
+        <w:t>Implémentation from scratch du module LoRALinear en PyTorch avec décomposition de bas rang BA, mise à l'échelle alpha/r et fusion matricielle à l'inférence pour une surcharge de latence nulle.</w:t>
+      </w:r>
+    </w:p>
+    <w:p>
+      <w:pPr>
+        <w:pStyle w:val="ListBullet"/>
+      </w:pPr>
+      <w:r>
+        <w:t>Adaptation ciblée des projections de requête, clé et valeur sur les 12 couches de BERT, réduisant les paramètres entraînables à 443 906 (0,41 % du modèle).</w:t>
+      </w:r>
+    </w:p>
+    <w:p>
+      <w:pPr>
+        <w:pStyle w:val="ListBullet"/>
+      </w:pPr>
+      <w:r>
+        <w:t>Évaluation empirique comparative sur IMDB : 87,9 % de précision (proche des 90,9 % du fine-tuning complet à 108M paramètres) avec une réduction de plus de 99,5 % des paramètres entraînables.</w:t>
+      </w:r>
+    </w:p>
+    <w:p>
+      <w:pPr>
+        <w:pStyle w:val="Heading2"/>
+      </w:pPr>
+      <w:r>
+        <w:t>Livrables &amp; Justificatifs Associés :</w:t>
+      </w:r>
+    </w:p>
+    <w:p>
+      <w:pPr>
+        <w:pStyle w:val="ListBullet"/>
+      </w:pPr>
+      <w:r>
+        <w:t>Code source et documentation intégrés dans le dossier projet.</w:t>
+      </w:r>
+    </w:p>
+    <w:p/>
+    <w:p>
+      <w:pPr>
+        <w:pStyle w:val="Heading1"/>
+      </w:pPr>
+      <w:r>
+        <w:t>19. Vision par ordinateur &amp; architectures CNN (McMaster University)</w:t>
+      </w:r>
+    </w:p>
+    <w:p>
+      <w:r>
+        <w:rPr>
+          <w:i/>
+          <w:sz w:val="20"/>
+        </w:rPr>
+        <w:t>Contexte : McMaster University (Canada) (2026) | Rôle : Lead Deep Learning Engineer</w:t>
+        <w:br/>
+        <w:t>Domaine : Deep Learning &amp; NLP</w:t>
+        <w:br/>
+        <w:t>Technologies : TensorFlow, Keras, OpenCV, CNN, AlexNet, GTSRB, Computer Vision</w:t>
+      </w:r>
+    </w:p>
+    <w:p>
+      <w:pPr>
+        <w:pStyle w:val="Heading2"/>
+      </w:pPr>
+      <w:r>
+        <w:t>Synthèse Exécutive :</w:t>
+      </w:r>
+    </w:p>
+    <w:p>
+      <w:r>
+        <w:t>Suite de projets de vision par ordinateur à McMaster University : classification de 43 panneaux routiers (GTSRB) pour véhicules autonomes, étude de l'architecture AlexNet et reconnaissance faciale du sourire par réseaux convolutifs profonds.</w:t>
+      </w:r>
+    </w:p>
+    <w:p>
+      <w:pPr>
+        <w:pStyle w:val="Heading2"/>
+      </w:pPr>
+      <w:r>
+        <w:t>Réalisations Clés &amp; Résultats (Format STAR) :</w:t>
+      </w:r>
+    </w:p>
+    <w:p>
+      <w:pPr>
+        <w:pStyle w:val="ListBullet"/>
+      </w:pPr>
+      <w:r>
+        <w:t>Conception d'un pipeline de vision complet : égalisation d'histogramme adaptative, data augmentation et régularisation par dropout.</w:t>
+      </w:r>
+    </w:p>
+    <w:p>
+      <w:pPr>
+        <w:pStyle w:val="ListBullet"/>
+      </w:pPr>
+      <w:r>
+        <w:t>Entraînement d'un CNN profond sur 43 classes de signalisation routière GTSRB et analyse des cartes d'activation convolutives.</w:t>
+      </w:r>
+    </w:p>
+    <w:p>
+      <w:pPr>
+        <w:pStyle w:val="ListBullet"/>
+      </w:pPr>
+      <w:r>
+        <w:t>Classification binaire d'expressions faciales (smile vs no-smile) sur tenseurs RGB 64x64 avec Batch Normalization.</w:t>
+      </w:r>
+    </w:p>
+    <w:p>
+      <w:pPr>
+        <w:pStyle w:val="Heading2"/>
+      </w:pPr>
+      <w:r>
+        <w:t>Livrables &amp; Justificatifs Associés :</w:t>
+      </w:r>
+    </w:p>
+    <w:p>
+      <w:pPr>
+        <w:pStyle w:val="ListBullet"/>
+      </w:pPr>
+      <w:r>
+        <w:t>Rapport technique disponible : https://raw.githubusercontent.com/nourou-dine-cisse/McMaster-Computer-Vision-CNN-Suite/main/02_AlexNet_Architecture_Study/probleme_1.pdf</w:t>
+      </w:r>
+    </w:p>
+    <w:p/>
+    <w:p>
+      <w:pPr>
+        <w:pStyle w:val="Heading1"/>
+      </w:pPr>
+      <w:r>
+        <w:t>20. Fondements du machine learning &amp; rétropropagation from scratch (McMaster University)</w:t>
+      </w:r>
+    </w:p>
+    <w:p>
+      <w:r>
+        <w:rPr>
+          <w:i/>
+          <w:sz w:val="20"/>
+        </w:rPr>
+        <w:t>Contexte : McMaster University (Canada) (2026) | Rôle : Lead ML Researcher</w:t>
+        <w:br/>
+        <w:t>Domaine : Deep Learning &amp; NLP</w:t>
+        <w:br/>
+        <w:t>Technologies : NumPy, Autograd, Optimization, Backpropagation, Decision Trees, MNIST, TensorFlow</w:t>
+      </w:r>
+    </w:p>
+    <w:p>
+      <w:pPr>
+        <w:pStyle w:val="Heading2"/>
+      </w:pPr>
+      <w:r>
+        <w:t>Synthèse Exécutive :</w:t>
+      </w:r>
+    </w:p>
+    <w:p>
+      <w:r>
+        <w:t>Exploration mathématique et algorithmique des fondements du machine learning à McMaster : rétropropagation vectorisée analytique en pur NumPy, algorithmes d'optimisation non-convexe, arbre de décision récursif développé de zéro et réseaux de neurones profonds sur MNIST.</w:t>
+      </w:r>
+    </w:p>
+    <w:p>
+      <w:pPr>
+        <w:pStyle w:val="Heading2"/>
+      </w:pPr>
+      <w:r>
+        <w:t>Réalisations Clés &amp; Résultats (Format STAR) :</w:t>
+      </w:r>
+    </w:p>
+    <w:p>
+      <w:pPr>
+        <w:pStyle w:val="ListBullet"/>
+      </w:pPr>
+      <w:r>
+        <w:t>Dérivation analytique et implémentation vectorisée en pur NumPy de la rétropropagation par descente de gradient par lots sans boucle itérative.</w:t>
+      </w:r>
+    </w:p>
+    <w:p>
+      <w:pPr>
+        <w:pStyle w:val="ListBullet"/>
+      </w:pPr>
+      <w:r>
+        <w:t>Implémentation d'algorithmes d'optimisation d'ordre zéro (coordinate search) et de descente de gradient accélérée avec momentum.</w:t>
+      </w:r>
+    </w:p>
+    <w:p>
+      <w:pPr>
+        <w:pStyle w:val="ListBullet"/>
+      </w:pPr>
+      <w:r>
+        <w:t>Développement de zéro de My_TreeRegressor (partitionnement binaire récursif par réduction d'impureté MSE) et benchmark face à Scikit-learn.</w:t>
+      </w:r>
+    </w:p>
+    <w:p>
+      <w:pPr>
+        <w:pStyle w:val="Heading2"/>
+      </w:pPr>
+      <w:r>
+        <w:t>Livrables &amp; Justificatifs Associés :</w:t>
+      </w:r>
+    </w:p>
+    <w:p>
+      <w:pPr>
+        <w:pStyle w:val="ListBullet"/>
+      </w:pPr>
+      <w:r>
+        <w:t>Code source et documentation intégrés dans le dossier projet.</w:t>
       </w:r>
     </w:p>
     <w:p/>

</xml_diff>

<commit_message>
feat(catalog): harmonize category to Computer Vision for vision projects
</commit_message>
<xml_diff>
--- a/All_Projects.docx
+++ b/All_Projects.docx
@@ -764,7 +764,7 @@
               <w:rPr>
                 <w:sz w:val="18"/>
               </w:rPr>
-              <w:t>Multimodal Deep Learning &amp; Computer Vision</w:t>
+              <w:t>Computer Vision</w:t>
               <w:br/>
               <w:t>(McMaster University (MECHENG 4AI3))</w:t>
             </w:r>
@@ -1044,7 +1044,7 @@
               <w:rPr>
                 <w:sz w:val="18"/>
               </w:rPr>
-              <w:t>AI Evaluation &amp; Fairness</w:t>
+              <w:t>Computer Vision</w:t>
               <w:br/>
               <w:t>(Université Paris-Saclay &amp; CEA-List)</w:t>
             </w:r>
@@ -1156,7 +1156,7 @@
               <w:rPr>
                 <w:sz w:val="18"/>
               </w:rPr>
-              <w:t>Deep Learning &amp; NLP</w:t>
+              <w:t>Computer Vision</w:t>
               <w:br/>
               <w:t>(McMaster University (Canada))</w:t>
             </w:r>
@@ -2260,7 +2260,7 @@
         </w:rPr>
         <w:t>Contexte : McMaster University (MECHENG 4AI3) (2026) | Rôle : Multimodal Deep Learning Engineer</w:t>
         <w:br/>
-        <w:t>Domaine : Multimodal Deep Learning &amp; Computer Vision</w:t>
+        <w:t>Domaine : Computer Vision</w:t>
         <w:br/>
         <w:t>Technologies : Python, PyTorch, Torchvision, CNN (ResNet), LSTM, Multimodal Fusion, VQA v2.0 Dataset, Streamlit</w:t>
       </w:r>
@@ -2683,7 +2683,7 @@
         </w:rPr>
         <w:t>Contexte : Université Paris-Saclay &amp; CEA-List (2026) | Rôle : Co-Author &amp; ML Researcher</w:t>
         <w:br/>
-        <w:t>Domaine : AI Evaluation &amp; Fairness</w:t>
+        <w:t>Domaine : Computer Vision</w:t>
         <w:br/>
         <w:t>Technologies : Vision-Language Models, MiniCPM-V 4.6, SigLIP 2, Counterfactual Evaluation, Fairness, Synthetic Data</w:t>
       </w:r>
@@ -2857,7 +2857,7 @@
         </w:rPr>
         <w:t>Contexte : McMaster University (Canada) (2026) | Rôle : Lead Deep Learning Engineer</w:t>
         <w:br/>
-        <w:t>Domaine : Deep Learning &amp; NLP</w:t>
+        <w:t>Domaine : Computer Vision</w:t>
         <w:br/>
         <w:t>Technologies : TensorFlow, Keras, OpenCV, CNN, AlexNet, GTSRB, Computer Vision</w:t>
       </w:r>

</xml_diff>